<commit_message>
documents: regenerate from their builders
The two baseline Solution Designs, the LMS Replacement Business Case exemplar
and the Business Case template, rebuilt after the generator changes. The
template now carries Appendix 2 with the nine KE questions students are marked
on and had never been shown.

Co-Authored-By: Claude Opus 5 (1M context) <noreply@anthropic.com>
</commit_message>
<xml_diff>
--- a/public/documents/YAT-LMS-Baseline-Solution-Design.docx
+++ b/public/documents/YAT-LMS-Baseline-Solution-Design.docx
@@ -1,6 +1,6 @@
 
 <file path=word/document.xml><?xml version="1.0" encoding="utf-8"?>
-<w:document xmlns:wpc="http://schemas.microsoft.com/office/word/2010/wordprocessingCanvas" xmlns:cx="http://schemas.microsoft.com/office/drawing/2014/chartex" xmlns:cx1="http://schemas.microsoft.com/office/drawing/2015/9/8/chartex" xmlns:cx2="http://schemas.microsoft.com/office/drawing/2015/10/21/chartex" xmlns:cx3="http://schemas.microsoft.com/office/drawing/2016/5/9/chartex" xmlns:cx4="http://schemas.microsoft.com/office/drawing/2016/5/10/chartex" xmlns:cx5="http://schemas.microsoft.com/office/drawing/2016/5/11/chartex" xmlns:cx6="http://schemas.microsoft.com/office/drawing/2016/5/12/chartex" xmlns:cx7="http://schemas.microsoft.com/office/drawing/2016/5/13/chartex" xmlns:cx8="http://schemas.microsoft.com/office/drawing/2016/5/14/chartex" xmlns:mc="http://schemas.openxmlformats.org/markup-compatibility/2006" xmlns:m="http://schemas.openxmlformats.org/officeDocument/2006/math" xmlns:aink="http://schemas.microsoft.com/office/drawing/2016/ink" xmlns:am3d="http://schemas.microsoft.com/office/drawing/2017/model3d" xmlns:oel="http://schemas.microsoft.com/office/2019/extlst" xmlns:r="http://schemas.openxmlformats.org/officeDocument/2006/relationships" xmlns:wp14="http://schemas.microsoft.com/office/word/2010/wordprocessingDrawing" xmlns:wp="http://schemas.openxmlformats.org/drawingml/2006/wordprocessingDrawing" xmlns:wpg="http://schemas.microsoft.com/office/word/2010/wordprocessingGroup" xmlns:wpi="http://schemas.microsoft.com/office/word/2010/wordprocessingInk" xmlns:wps="http://schemas.microsoft.com/office/word/2010/wordprocessingShape" xmlns:o="urn:schemas-microsoft-com:office:office" xmlns:v="urn:schemas-microsoft-com:vml" xmlns:w10="urn:schemas-microsoft-com:office:word" xmlns:w="http://schemas.openxmlformats.org/wordprocessingml/2006/main" xmlns:w14="http://schemas.microsoft.com/office/word/2010/wordml" xmlns:w15="http://schemas.microsoft.com/office/word/2012/wordml" xmlns:w16cei="http://schemas.microsoft.com/office/word/2026/wordml/cei" xmlns:w16cex="http://schemas.microsoft.com/office/word/2018/wordml/cex" xmlns:w16cid="http://schemas.microsoft.com/office/word/2016/wordml/cid" xmlns:w16="http://schemas.microsoft.com/office/word/2018/wordml" xmlns:w16sdtdh="http://schemas.microsoft.com/office/word/2020/wordml/sdtdatahash" xmlns:w16sdtfl="http://schemas.microsoft.com/office/word/2024/wordml/sdtformatlock" xmlns:w16se="http://schemas.microsoft.com/office/word/2015/wordml/symex" xmlns:w16du="http://schemas.microsoft.com/office/word/2023/wordml/word16du" xmlns:wne="http://schemas.microsoft.com/office/word/2006/wordml" mc:Ignorable="w14 w15 w16se w16cid w16 w16cex w16sdtdh w16sdtfl w16du wp14">
+<w:document xmlns:wpc="http://schemas.microsoft.com/office/word/2010/wordprocessingCanvas" xmlns:cx="http://schemas.microsoft.com/office/drawing/2014/chartex" xmlns:cx1="http://schemas.microsoft.com/office/drawing/2015/9/8/chartex" xmlns:cx2="http://schemas.microsoft.com/office/drawing/2015/10/21/chartex" xmlns:cx3="http://schemas.microsoft.com/office/drawing/2016/5/9/chartex" xmlns:cx4="http://schemas.microsoft.com/office/drawing/2016/5/10/chartex" xmlns:cx5="http://schemas.microsoft.com/office/drawing/2016/5/11/chartex" xmlns:cx6="http://schemas.microsoft.com/office/drawing/2016/5/12/chartex" xmlns:cx7="http://schemas.microsoft.com/office/drawing/2016/5/13/chartex" xmlns:cx8="http://schemas.microsoft.com/office/drawing/2016/5/14/chartex" xmlns:mc="http://schemas.openxmlformats.org/markup-compatibility/2006" xmlns:m="http://schemas.openxmlformats.org/officeDocument/2006/math" xmlns:aink="http://schemas.microsoft.com/office/drawing/2016/ink" xmlns:am3d="http://schemas.microsoft.com/office/drawing/2017/model3d" xmlns:oel="http://schemas.microsoft.com/office/2019/extlst" xmlns:r="http://schemas.openxmlformats.org/officeDocument/2006/relationships" xmlns:wp14="http://schemas.microsoft.com/office/word/2010/wordprocessingDrawing" xmlns:wp="http://schemas.openxmlformats.org/drawingml/2006/wordprocessingDrawing" xmlns:wpg="http://schemas.microsoft.com/office/word/2010/wordprocessingGroup" xmlns:wpi="http://schemas.microsoft.com/office/word/2010/wordprocessingInk" xmlns:wps="http://schemas.microsoft.com/office/word/2010/wordprocessingShape" xmlns:o="urn:schemas-microsoft-com:office:office" xmlns:v="urn:schemas-microsoft-com:vml" xmlns:w10="urn:schemas-microsoft-com:office:word" xmlns:w="http://schemas.openxmlformats.org/wordprocessingml/2006/main" xmlns:w14="http://schemas.microsoft.com/office/word/2010/wordml" xmlns:w15="http://schemas.microsoft.com/office/word/2012/wordml" xmlns:w16cex="http://schemas.microsoft.com/office/word/2018/wordml/cex" xmlns:w16cid="http://schemas.microsoft.com/office/word/2016/wordml/cid" xmlns:w16="http://schemas.microsoft.com/office/word/2018/wordml" xmlns:w16sdtdh="http://schemas.microsoft.com/office/word/2020/wordml/sdtdatahash" xmlns:w16sdtfl="http://schemas.microsoft.com/office/word/2024/wordml/sdtformatlock" xmlns:w16se="http://schemas.microsoft.com/office/word/2015/wordml/symex" xmlns:w16du="http://schemas.microsoft.com/office/word/2023/wordml/word16du" xmlns:wne="http://schemas.microsoft.com/office/word/2006/wordml" mc:Ignorable="w14 w15 w16se w16cid w16 w16cex w16sdtdh w16sdtfl w16du wp14">
   <w:body>
     <w:p>
       <w:r>
@@ -314,7 +314,7 @@
               <w:rPr>
                 <w:sz w:val="20"/>
               </w:rPr>
-              <w:t>the AT2 Deployment Report (foundation build)</w:t>
+              <w:t>the AT2 build run sheet (foundation build)</w:t>
             </w:r>
           </w:p>
         </w:tc>
@@ -378,7 +378,7 @@
       <w:pPr>
         <w:pStyle w:val="Heading1"/>
       </w:pPr>
-      <w:bookmarkStart w:id="0" w:name="_Toc235021331"/>
+      <w:bookmarkStart w:id="0" w:name="_Toc238815526"/>
       <w:r>
         <w:lastRenderedPageBreak/>
         <w:t>Contents</w:t>
@@ -404,7 +404,7 @@
       <w:r>
         <w:fldChar w:fldCharType="separate"/>
       </w:r>
-      <w:hyperlink w:anchor="_Toc235021331" w:history="1">
+      <w:hyperlink w:anchor="_Toc238815526" w:history="1">
         <w:r>
           <w:rPr>
             <w:rStyle w:val="Hyperlink"/>
@@ -431,7 +431,7 @@
             <w:noProof/>
             <w:webHidden/>
           </w:rPr>
-          <w:instrText xml:space="preserve"> PAGEREF _Toc235021331 \h </w:instrText>
+          <w:instrText xml:space="preserve"> PAGEREF _Toc238815526 \h </w:instrText>
         </w:r>
         <w:r>
           <w:rPr>
@@ -472,7 +472,7 @@
           <w:noProof/>
         </w:rPr>
       </w:pPr>
-      <w:hyperlink w:anchor="_Toc235021332" w:history="1">
+      <w:hyperlink w:anchor="_Toc238815527" w:history="1">
         <w:r>
           <w:rPr>
             <w:rStyle w:val="Hyperlink"/>
@@ -499,7 +499,7 @@
             <w:noProof/>
             <w:webHidden/>
           </w:rPr>
-          <w:instrText xml:space="preserve"> PAGEREF _Toc235021332 \h </w:instrText>
+          <w:instrText xml:space="preserve"> PAGEREF _Toc238815527 \h </w:instrText>
         </w:r>
         <w:r>
           <w:rPr>
@@ -540,7 +540,7 @@
           <w:noProof/>
         </w:rPr>
       </w:pPr>
-      <w:hyperlink w:anchor="_Toc235021333" w:history="1">
+      <w:hyperlink w:anchor="_Toc238815528" w:history="1">
         <w:r>
           <w:rPr>
             <w:rStyle w:val="Hyperlink"/>
@@ -567,7 +567,7 @@
             <w:noProof/>
             <w:webHidden/>
           </w:rPr>
-          <w:instrText xml:space="preserve"> PAGEREF _Toc235021333 \h </w:instrText>
+          <w:instrText xml:space="preserve"> PAGEREF _Toc238815528 \h </w:instrText>
         </w:r>
         <w:r>
           <w:rPr>
@@ -608,7 +608,7 @@
           <w:noProof/>
         </w:rPr>
       </w:pPr>
-      <w:hyperlink w:anchor="_Toc235021334" w:history="1">
+      <w:hyperlink w:anchor="_Toc238815529" w:history="1">
         <w:r>
           <w:rPr>
             <w:rStyle w:val="Hyperlink"/>
@@ -635,7 +635,7 @@
             <w:noProof/>
             <w:webHidden/>
           </w:rPr>
-          <w:instrText xml:space="preserve"> PAGEREF _Toc235021334 \h </w:instrText>
+          <w:instrText xml:space="preserve"> PAGEREF _Toc238815529 \h </w:instrText>
         </w:r>
         <w:r>
           <w:rPr>
@@ -676,7 +676,7 @@
           <w:noProof/>
         </w:rPr>
       </w:pPr>
-      <w:hyperlink w:anchor="_Toc235021335" w:history="1">
+      <w:hyperlink w:anchor="_Toc238815530" w:history="1">
         <w:r>
           <w:rPr>
             <w:rStyle w:val="Hyperlink"/>
@@ -703,7 +703,7 @@
             <w:noProof/>
             <w:webHidden/>
           </w:rPr>
-          <w:instrText xml:space="preserve"> PAGEREF _Toc235021335 \h </w:instrText>
+          <w:instrText xml:space="preserve"> PAGEREF _Toc238815530 \h </w:instrText>
         </w:r>
         <w:r>
           <w:rPr>
@@ -744,7 +744,7 @@
           <w:noProof/>
         </w:rPr>
       </w:pPr>
-      <w:hyperlink w:anchor="_Toc235021336" w:history="1">
+      <w:hyperlink w:anchor="_Toc238815531" w:history="1">
         <w:r>
           <w:rPr>
             <w:rStyle w:val="Hyperlink"/>
@@ -771,7 +771,7 @@
             <w:noProof/>
             <w:webHidden/>
           </w:rPr>
-          <w:instrText xml:space="preserve"> PAGEREF _Toc235021336 \h </w:instrText>
+          <w:instrText xml:space="preserve"> PAGEREF _Toc238815531 \h </w:instrText>
         </w:r>
         <w:r>
           <w:rPr>
@@ -812,7 +812,7 @@
           <w:noProof/>
         </w:rPr>
       </w:pPr>
-      <w:hyperlink w:anchor="_Toc235021337" w:history="1">
+      <w:hyperlink w:anchor="_Toc238815532" w:history="1">
         <w:r>
           <w:rPr>
             <w:rStyle w:val="Hyperlink"/>
@@ -839,7 +839,7 @@
             <w:noProof/>
             <w:webHidden/>
           </w:rPr>
-          <w:instrText xml:space="preserve"> PAGEREF _Toc235021337 \h </w:instrText>
+          <w:instrText xml:space="preserve"> PAGEREF _Toc238815532 \h </w:instrText>
         </w:r>
         <w:r>
           <w:rPr>
@@ -880,7 +880,7 @@
           <w:noProof/>
         </w:rPr>
       </w:pPr>
-      <w:hyperlink w:anchor="_Toc235021338" w:history="1">
+      <w:hyperlink w:anchor="_Toc238815533" w:history="1">
         <w:r>
           <w:rPr>
             <w:rStyle w:val="Hyperlink"/>
@@ -907,7 +907,7 @@
             <w:noProof/>
             <w:webHidden/>
           </w:rPr>
-          <w:instrText xml:space="preserve"> PAGEREF _Toc235021338 \h </w:instrText>
+          <w:instrText xml:space="preserve"> PAGEREF _Toc238815533 \h </w:instrText>
         </w:r>
         <w:r>
           <w:rPr>
@@ -948,7 +948,7 @@
           <w:noProof/>
         </w:rPr>
       </w:pPr>
-      <w:hyperlink w:anchor="_Toc235021339" w:history="1">
+      <w:hyperlink w:anchor="_Toc238815534" w:history="1">
         <w:r>
           <w:rPr>
             <w:rStyle w:val="Hyperlink"/>
@@ -975,7 +975,7 @@
             <w:noProof/>
             <w:webHidden/>
           </w:rPr>
-          <w:instrText xml:space="preserve"> PAGEREF _Toc235021339 \h </w:instrText>
+          <w:instrText xml:space="preserve"> PAGEREF _Toc238815534 \h </w:instrText>
         </w:r>
         <w:r>
           <w:rPr>
@@ -1016,7 +1016,7 @@
           <w:noProof/>
         </w:rPr>
       </w:pPr>
-      <w:hyperlink w:anchor="_Toc235021340" w:history="1">
+      <w:hyperlink w:anchor="_Toc238815535" w:history="1">
         <w:r>
           <w:rPr>
             <w:rStyle w:val="Hyperlink"/>
@@ -1043,7 +1043,7 @@
             <w:noProof/>
             <w:webHidden/>
           </w:rPr>
-          <w:instrText xml:space="preserve"> PAGEREF _Toc235021340 \h </w:instrText>
+          <w:instrText xml:space="preserve"> PAGEREF _Toc238815535 \h </w:instrText>
         </w:r>
         <w:r>
           <w:rPr>
@@ -1084,7 +1084,7 @@
           <w:noProof/>
         </w:rPr>
       </w:pPr>
-      <w:hyperlink w:anchor="_Toc235021341" w:history="1">
+      <w:hyperlink w:anchor="_Toc238815536" w:history="1">
         <w:r>
           <w:rPr>
             <w:rStyle w:val="Hyperlink"/>
@@ -1111,7 +1111,7 @@
             <w:noProof/>
             <w:webHidden/>
           </w:rPr>
-          <w:instrText xml:space="preserve"> PAGEREF _Toc235021341 \h </w:instrText>
+          <w:instrText xml:space="preserve"> PAGEREF _Toc238815536 \h </w:instrText>
         </w:r>
         <w:r>
           <w:rPr>
@@ -1152,7 +1152,7 @@
           <w:noProof/>
         </w:rPr>
       </w:pPr>
-      <w:hyperlink w:anchor="_Toc235021342" w:history="1">
+      <w:hyperlink w:anchor="_Toc238815537" w:history="1">
         <w:r>
           <w:rPr>
             <w:rStyle w:val="Hyperlink"/>
@@ -1179,7 +1179,7 @@
             <w:noProof/>
             <w:webHidden/>
           </w:rPr>
-          <w:instrText xml:space="preserve"> PAGEREF _Toc235021342 \h </w:instrText>
+          <w:instrText xml:space="preserve"> PAGEREF _Toc238815537 \h </w:instrText>
         </w:r>
         <w:r>
           <w:rPr>
@@ -1220,7 +1220,7 @@
           <w:noProof/>
         </w:rPr>
       </w:pPr>
-      <w:hyperlink w:anchor="_Toc235021343" w:history="1">
+      <w:hyperlink w:anchor="_Toc238815538" w:history="1">
         <w:r>
           <w:rPr>
             <w:rStyle w:val="Hyperlink"/>
@@ -1247,7 +1247,7 @@
             <w:noProof/>
             <w:webHidden/>
           </w:rPr>
-          <w:instrText xml:space="preserve"> PAGEREF _Toc235021343 \h </w:instrText>
+          <w:instrText xml:space="preserve"> PAGEREF _Toc238815538 \h </w:instrText>
         </w:r>
         <w:r>
           <w:rPr>
@@ -1288,7 +1288,7 @@
           <w:noProof/>
         </w:rPr>
       </w:pPr>
-      <w:hyperlink w:anchor="_Toc235021344" w:history="1">
+      <w:hyperlink w:anchor="_Toc238815539" w:history="1">
         <w:r>
           <w:rPr>
             <w:rStyle w:val="Hyperlink"/>
@@ -1315,7 +1315,7 @@
             <w:noProof/>
             <w:webHidden/>
           </w:rPr>
-          <w:instrText xml:space="preserve"> PAGEREF _Toc235021344 \h </w:instrText>
+          <w:instrText xml:space="preserve"> PAGEREF _Toc238815539 \h </w:instrText>
         </w:r>
         <w:r>
           <w:rPr>
@@ -1356,7 +1356,7 @@
           <w:noProof/>
         </w:rPr>
       </w:pPr>
-      <w:hyperlink w:anchor="_Toc235021345" w:history="1">
+      <w:hyperlink w:anchor="_Toc238815540" w:history="1">
         <w:r>
           <w:rPr>
             <w:rStyle w:val="Hyperlink"/>
@@ -1383,7 +1383,7 @@
             <w:noProof/>
             <w:webHidden/>
           </w:rPr>
-          <w:instrText xml:space="preserve"> PAGEREF _Toc235021345 \h </w:instrText>
+          <w:instrText xml:space="preserve"> PAGEREF _Toc238815540 \h </w:instrText>
         </w:r>
         <w:r>
           <w:rPr>
@@ -1403,7 +1403,7 @@
             <w:noProof/>
             <w:webHidden/>
           </w:rPr>
-          <w:t>5</w:t>
+          <w:t>6</w:t>
         </w:r>
         <w:r>
           <w:rPr>
@@ -1424,7 +1424,7 @@
           <w:noProof/>
         </w:rPr>
       </w:pPr>
-      <w:hyperlink w:anchor="_Toc235021346" w:history="1">
+      <w:hyperlink w:anchor="_Toc238815541" w:history="1">
         <w:r>
           <w:rPr>
             <w:rStyle w:val="Hyperlink"/>
@@ -1451,7 +1451,7 @@
             <w:noProof/>
             <w:webHidden/>
           </w:rPr>
-          <w:instrText xml:space="preserve"> PAGEREF _Toc235021346 \h </w:instrText>
+          <w:instrText xml:space="preserve"> PAGEREF _Toc238815541 \h </w:instrText>
         </w:r>
         <w:r>
           <w:rPr>
@@ -1471,7 +1471,7 @@
             <w:noProof/>
             <w:webHidden/>
           </w:rPr>
-          <w:t>6</w:t>
+          <w:t>7</w:t>
         </w:r>
         <w:r>
           <w:rPr>
@@ -1492,7 +1492,7 @@
           <w:noProof/>
         </w:rPr>
       </w:pPr>
-      <w:hyperlink w:anchor="_Toc235021347" w:history="1">
+      <w:hyperlink w:anchor="_Toc238815542" w:history="1">
         <w:r>
           <w:rPr>
             <w:rStyle w:val="Hyperlink"/>
@@ -1519,7 +1519,7 @@
             <w:noProof/>
             <w:webHidden/>
           </w:rPr>
-          <w:instrText xml:space="preserve"> PAGEREF _Toc235021347 \h </w:instrText>
+          <w:instrText xml:space="preserve"> PAGEREF _Toc238815542 \h </w:instrText>
         </w:r>
         <w:r>
           <w:rPr>
@@ -1539,7 +1539,7 @@
             <w:noProof/>
             <w:webHidden/>
           </w:rPr>
-          <w:t>6</w:t>
+          <w:t>7</w:t>
         </w:r>
         <w:r>
           <w:rPr>
@@ -1560,7 +1560,7 @@
           <w:noProof/>
         </w:rPr>
       </w:pPr>
-      <w:hyperlink w:anchor="_Toc235021348" w:history="1">
+      <w:hyperlink w:anchor="_Toc238815543" w:history="1">
         <w:r>
           <w:rPr>
             <w:rStyle w:val="Hyperlink"/>
@@ -1587,7 +1587,7 @@
             <w:noProof/>
             <w:webHidden/>
           </w:rPr>
-          <w:instrText xml:space="preserve"> PAGEREF _Toc235021348 \h </w:instrText>
+          <w:instrText xml:space="preserve"> PAGEREF _Toc238815543 \h </w:instrText>
         </w:r>
         <w:r>
           <w:rPr>
@@ -1607,7 +1607,7 @@
             <w:noProof/>
             <w:webHidden/>
           </w:rPr>
-          <w:t>6</w:t>
+          <w:t>7</w:t>
         </w:r>
         <w:r>
           <w:rPr>
@@ -1628,7 +1628,7 @@
           <w:noProof/>
         </w:rPr>
       </w:pPr>
-      <w:hyperlink w:anchor="_Toc235021349" w:history="1">
+      <w:hyperlink w:anchor="_Toc238815544" w:history="1">
         <w:r>
           <w:rPr>
             <w:rStyle w:val="Hyperlink"/>
@@ -1655,7 +1655,7 @@
             <w:noProof/>
             <w:webHidden/>
           </w:rPr>
-          <w:instrText xml:space="preserve"> PAGEREF _Toc235021349 \h </w:instrText>
+          <w:instrText xml:space="preserve"> PAGEREF _Toc238815544 \h </w:instrText>
         </w:r>
         <w:r>
           <w:rPr>
@@ -1675,7 +1675,7 @@
             <w:noProof/>
             <w:webHidden/>
           </w:rPr>
-          <w:t>6</w:t>
+          <w:t>7</w:t>
         </w:r>
         <w:r>
           <w:rPr>
@@ -1696,7 +1696,7 @@
           <w:noProof/>
         </w:rPr>
       </w:pPr>
-      <w:hyperlink w:anchor="_Toc235021350" w:history="1">
+      <w:hyperlink w:anchor="_Toc238815545" w:history="1">
         <w:r>
           <w:rPr>
             <w:rStyle w:val="Hyperlink"/>
@@ -1723,7 +1723,7 @@
             <w:noProof/>
             <w:webHidden/>
           </w:rPr>
-          <w:instrText xml:space="preserve"> PAGEREF _Toc235021350 \h </w:instrText>
+          <w:instrText xml:space="preserve"> PAGEREF _Toc238815545 \h </w:instrText>
         </w:r>
         <w:r>
           <w:rPr>
@@ -1743,7 +1743,7 @@
             <w:noProof/>
             <w:webHidden/>
           </w:rPr>
-          <w:t>6</w:t>
+          <w:t>8</w:t>
         </w:r>
         <w:r>
           <w:rPr>
@@ -1764,7 +1764,7 @@
           <w:noProof/>
         </w:rPr>
       </w:pPr>
-      <w:hyperlink w:anchor="_Toc235021351" w:history="1">
+      <w:hyperlink w:anchor="_Toc238815546" w:history="1">
         <w:r>
           <w:rPr>
             <w:rStyle w:val="Hyperlink"/>
@@ -1791,7 +1791,7 @@
             <w:noProof/>
             <w:webHidden/>
           </w:rPr>
-          <w:instrText xml:space="preserve"> PAGEREF _Toc235021351 \h </w:instrText>
+          <w:instrText xml:space="preserve"> PAGEREF _Toc238815546 \h </w:instrText>
         </w:r>
         <w:r>
           <w:rPr>
@@ -1811,7 +1811,7 @@
             <w:noProof/>
             <w:webHidden/>
           </w:rPr>
-          <w:t>7</w:t>
+          <w:t>8</w:t>
         </w:r>
         <w:r>
           <w:rPr>
@@ -1832,7 +1832,7 @@
           <w:noProof/>
         </w:rPr>
       </w:pPr>
-      <w:hyperlink w:anchor="_Toc235021352" w:history="1">
+      <w:hyperlink w:anchor="_Toc238815547" w:history="1">
         <w:r>
           <w:rPr>
             <w:rStyle w:val="Hyperlink"/>
@@ -1859,7 +1859,7 @@
             <w:noProof/>
             <w:webHidden/>
           </w:rPr>
-          <w:instrText xml:space="preserve"> PAGEREF _Toc235021352 \h </w:instrText>
+          <w:instrText xml:space="preserve"> PAGEREF _Toc238815547 \h </w:instrText>
         </w:r>
         <w:r>
           <w:rPr>
@@ -1879,7 +1879,7 @@
             <w:noProof/>
             <w:webHidden/>
           </w:rPr>
-          <w:t>7</w:t>
+          <w:t>8</w:t>
         </w:r>
         <w:r>
           <w:rPr>
@@ -1900,7 +1900,7 @@
           <w:noProof/>
         </w:rPr>
       </w:pPr>
-      <w:hyperlink w:anchor="_Toc235021353" w:history="1">
+      <w:hyperlink w:anchor="_Toc238815548" w:history="1">
         <w:r>
           <w:rPr>
             <w:rStyle w:val="Hyperlink"/>
@@ -1927,7 +1927,7 @@
             <w:noProof/>
             <w:webHidden/>
           </w:rPr>
-          <w:instrText xml:space="preserve"> PAGEREF _Toc235021353 \h </w:instrText>
+          <w:instrText xml:space="preserve"> PAGEREF _Toc238815548 \h </w:instrText>
         </w:r>
         <w:r>
           <w:rPr>
@@ -1947,7 +1947,7 @@
             <w:noProof/>
             <w:webHidden/>
           </w:rPr>
-          <w:t>7</w:t>
+          <w:t>9</w:t>
         </w:r>
         <w:r>
           <w:rPr>
@@ -1968,7 +1968,7 @@
           <w:noProof/>
         </w:rPr>
       </w:pPr>
-      <w:hyperlink w:anchor="_Toc235021354" w:history="1">
+      <w:hyperlink w:anchor="_Toc238815549" w:history="1">
         <w:r>
           <w:rPr>
             <w:rStyle w:val="Hyperlink"/>
@@ -1995,7 +1995,7 @@
             <w:noProof/>
             <w:webHidden/>
           </w:rPr>
-          <w:instrText xml:space="preserve"> PAGEREF _Toc235021354 \h </w:instrText>
+          <w:instrText xml:space="preserve"> PAGEREF _Toc238815549 \h </w:instrText>
         </w:r>
         <w:r>
           <w:rPr>
@@ -2015,7 +2015,7 @@
             <w:noProof/>
             <w:webHidden/>
           </w:rPr>
-          <w:t>7</w:t>
+          <w:t>9</w:t>
         </w:r>
         <w:r>
           <w:rPr>
@@ -2036,7 +2036,7 @@
           <w:noProof/>
         </w:rPr>
       </w:pPr>
-      <w:hyperlink w:anchor="_Toc235021355" w:history="1">
+      <w:hyperlink w:anchor="_Toc238815550" w:history="1">
         <w:r>
           <w:rPr>
             <w:rStyle w:val="Hyperlink"/>
@@ -2063,7 +2063,7 @@
             <w:noProof/>
             <w:webHidden/>
           </w:rPr>
-          <w:instrText xml:space="preserve"> PAGEREF _Toc235021355 \h </w:instrText>
+          <w:instrText xml:space="preserve"> PAGEREF _Toc238815550 \h </w:instrText>
         </w:r>
         <w:r>
           <w:rPr>
@@ -2083,7 +2083,7 @@
             <w:noProof/>
             <w:webHidden/>
           </w:rPr>
-          <w:t>7</w:t>
+          <w:t>9</w:t>
         </w:r>
         <w:r>
           <w:rPr>
@@ -2104,7 +2104,7 @@
           <w:noProof/>
         </w:rPr>
       </w:pPr>
-      <w:hyperlink w:anchor="_Toc235021356" w:history="1">
+      <w:hyperlink w:anchor="_Toc238815551" w:history="1">
         <w:r>
           <w:rPr>
             <w:rStyle w:val="Hyperlink"/>
@@ -2131,7 +2131,7 @@
             <w:noProof/>
             <w:webHidden/>
           </w:rPr>
-          <w:instrText xml:space="preserve"> PAGEREF _Toc235021356 \h </w:instrText>
+          <w:instrText xml:space="preserve"> PAGEREF _Toc238815551 \h </w:instrText>
         </w:r>
         <w:r>
           <w:rPr>
@@ -2151,7 +2151,7 @@
             <w:noProof/>
             <w:webHidden/>
           </w:rPr>
-          <w:t>8</w:t>
+          <w:t>9</w:t>
         </w:r>
         <w:r>
           <w:rPr>
@@ -2172,7 +2172,7 @@
           <w:noProof/>
         </w:rPr>
       </w:pPr>
-      <w:hyperlink w:anchor="_Toc235021357" w:history="1">
+      <w:hyperlink w:anchor="_Toc238815552" w:history="1">
         <w:r>
           <w:rPr>
             <w:rStyle w:val="Hyperlink"/>
@@ -2199,7 +2199,7 @@
             <w:noProof/>
             <w:webHidden/>
           </w:rPr>
-          <w:instrText xml:space="preserve"> PAGEREF _Toc235021357 \h </w:instrText>
+          <w:instrText xml:space="preserve"> PAGEREF _Toc238815552 \h </w:instrText>
         </w:r>
         <w:r>
           <w:rPr>
@@ -2219,7 +2219,7 @@
             <w:noProof/>
             <w:webHidden/>
           </w:rPr>
-          <w:t>8</w:t>
+          <w:t>9</w:t>
         </w:r>
         <w:r>
           <w:rPr>
@@ -2240,7 +2240,7 @@
           <w:noProof/>
         </w:rPr>
       </w:pPr>
-      <w:hyperlink w:anchor="_Toc235021358" w:history="1">
+      <w:hyperlink w:anchor="_Toc238815553" w:history="1">
         <w:r>
           <w:rPr>
             <w:rStyle w:val="Hyperlink"/>
@@ -2267,7 +2267,7 @@
             <w:noProof/>
             <w:webHidden/>
           </w:rPr>
-          <w:instrText xml:space="preserve"> PAGEREF _Toc235021358 \h </w:instrText>
+          <w:instrText xml:space="preserve"> PAGEREF _Toc238815553 \h </w:instrText>
         </w:r>
         <w:r>
           <w:rPr>
@@ -2287,7 +2287,7 @@
             <w:noProof/>
             <w:webHidden/>
           </w:rPr>
-          <w:t>8</w:t>
+          <w:t>9</w:t>
         </w:r>
         <w:r>
           <w:rPr>
@@ -2308,7 +2308,7 @@
           <w:noProof/>
         </w:rPr>
       </w:pPr>
-      <w:hyperlink w:anchor="_Toc235021359" w:history="1">
+      <w:hyperlink w:anchor="_Toc238815554" w:history="1">
         <w:r>
           <w:rPr>
             <w:rStyle w:val="Hyperlink"/>
@@ -2335,7 +2335,7 @@
             <w:noProof/>
             <w:webHidden/>
           </w:rPr>
-          <w:instrText xml:space="preserve"> PAGEREF _Toc235021359 \h </w:instrText>
+          <w:instrText xml:space="preserve"> PAGEREF _Toc238815554 \h </w:instrText>
         </w:r>
         <w:r>
           <w:rPr>
@@ -2355,7 +2355,7 @@
             <w:noProof/>
             <w:webHidden/>
           </w:rPr>
-          <w:t>8</w:t>
+          <w:t>10</w:t>
         </w:r>
         <w:r>
           <w:rPr>
@@ -2376,7 +2376,7 @@
           <w:noProof/>
         </w:rPr>
       </w:pPr>
-      <w:hyperlink w:anchor="_Toc235021360" w:history="1">
+      <w:hyperlink w:anchor="_Toc238815555" w:history="1">
         <w:r>
           <w:rPr>
             <w:rStyle w:val="Hyperlink"/>
@@ -2403,7 +2403,7 @@
             <w:noProof/>
             <w:webHidden/>
           </w:rPr>
-          <w:instrText xml:space="preserve"> PAGEREF _Toc235021360 \h </w:instrText>
+          <w:instrText xml:space="preserve"> PAGEREF _Toc238815555 \h </w:instrText>
         </w:r>
         <w:r>
           <w:rPr>
@@ -2423,7 +2423,7 @@
             <w:noProof/>
             <w:webHidden/>
           </w:rPr>
-          <w:t>8</w:t>
+          <w:t>10</w:t>
         </w:r>
         <w:r>
           <w:rPr>
@@ -2444,7 +2444,7 @@
           <w:noProof/>
         </w:rPr>
       </w:pPr>
-      <w:hyperlink w:anchor="_Toc235021361" w:history="1">
+      <w:hyperlink w:anchor="_Toc238815556" w:history="1">
         <w:r>
           <w:rPr>
             <w:rStyle w:val="Hyperlink"/>
@@ -2471,7 +2471,7 @@
             <w:noProof/>
             <w:webHidden/>
           </w:rPr>
-          <w:instrText xml:space="preserve"> PAGEREF _Toc235021361 \h </w:instrText>
+          <w:instrText xml:space="preserve"> PAGEREF _Toc238815556 \h </w:instrText>
         </w:r>
         <w:r>
           <w:rPr>
@@ -2491,7 +2491,7 @@
             <w:noProof/>
             <w:webHidden/>
           </w:rPr>
-          <w:t>9</w:t>
+          <w:t>10</w:t>
         </w:r>
         <w:r>
           <w:rPr>
@@ -2523,7 +2523,7 @@
       <w:pPr>
         <w:pStyle w:val="Heading1"/>
       </w:pPr>
-      <w:bookmarkStart w:id="1" w:name="_Toc235021332"/>
+      <w:bookmarkStart w:id="1" w:name="_Toc238815527"/>
       <w:r>
         <w:lastRenderedPageBreak/>
         <w:t>1. Purpose and Scope</w:t>
@@ -2539,7 +2539,7 @@
       <w:pPr>
         <w:pStyle w:val="Heading3"/>
       </w:pPr>
-      <w:bookmarkStart w:id="2" w:name="_Toc235021333"/>
+      <w:bookmarkStart w:id="2" w:name="_Toc238815528"/>
       <w:r>
         <w:t>In scope of this design</w:t>
       </w:r>
@@ -2566,14 +2566,36 @@
         <w:pStyle w:val="ListBullet"/>
       </w:pPr>
       <w:r>
-        <w:t>Single-region, single-Availability-Zone deployment in ap-southeast-2 (Sydney).</w:t>
+        <w:t>Single-region deployment in ap-southeast-2 (Sydney), with the workload in a single Availability Zone.</w:t>
       </w:r>
     </w:p>
     <w:p>
       <w:pPr>
+        <w:spacing w:before="40" w:after="160"/>
+        <w:ind w:left="227"/>
+      </w:pPr>
+      <w:r>
+        <w:rPr>
+          <w:b/>
+          <w:color w:val="C5613B"/>
+          <w:sz w:val="19"/>
+        </w:rPr>
+        <w:t>Building this in a lab </w:t>
+      </w:r>
+      <w:r>
+        <w:rPr>
+          <w:i/>
+          <w:color w:val="C5613B"/>
+          <w:sz w:val="19"/>
+        </w:rPr>
+        <w:t>the design calls for ap-southeast-2 (Sydney). If you are building this in an AWS Academy Learner Lab, deploy to whichever region that environment gives you — us-east-1 — and treat it as standing in for Sydney throughout. That is acceptable.</w:t>
+      </w:r>
+    </w:p>
+    <w:p>
+      <w:pPr>
         <w:pStyle w:val="Heading3"/>
       </w:pPr>
-      <w:bookmarkStart w:id="3" w:name="_Toc235021334"/>
+      <w:bookmarkStart w:id="3" w:name="_Toc238815529"/>
       <w:r>
         <w:t>Out of scope — deferred to the follow-on HA design phase</w:t>
       </w:r>
@@ -2607,7 +2629,7 @@
       <w:pPr>
         <w:pStyle w:val="Heading3"/>
       </w:pPr>
-      <w:bookmarkStart w:id="4" w:name="_Toc235021335"/>
+      <w:bookmarkStart w:id="4" w:name="_Toc238815530"/>
       <w:r>
         <w:t>Out of MTS scope entirely — YAT ICT responsibility</w:t>
       </w:r>
@@ -2649,7 +2671,7 @@
       <w:pPr>
         <w:pStyle w:val="Heading1"/>
       </w:pPr>
-      <w:bookmarkStart w:id="5" w:name="_Toc235021336"/>
+      <w:bookmarkStart w:id="5" w:name="_Toc238815531"/>
       <w:r>
         <w:t>2. Design Inputs and Requirements</w:t>
       </w:r>
@@ -2659,7 +2681,7 @@
       <w:pPr>
         <w:pStyle w:val="Heading3"/>
       </w:pPr>
-      <w:bookmarkStart w:id="6" w:name="_Toc235021337"/>
+      <w:bookmarkStart w:id="6" w:name="_Toc238815532"/>
       <w:r>
         <w:t>2.1 Inputs</w:t>
       </w:r>
@@ -2701,7 +2723,7 @@
       <w:pPr>
         <w:pStyle w:val="Heading3"/>
       </w:pPr>
-      <w:bookmarkStart w:id="7" w:name="_Toc235021338"/>
+      <w:bookmarkStart w:id="7" w:name="_Toc238815533"/>
       <w:r>
         <w:t>2.2 Requirements the design must meet</w:t>
       </w:r>
@@ -2849,7 +2871,7 @@
               <w:rPr>
                 <w:sz w:val="18"/>
               </w:rPr>
-              <w:t>Preserved — Windows Server 2016 · MySQL · DOODLE</w:t>
+              <w:t>Preserved — Windows Server · MySQL · DOODLE</w:t>
             </w:r>
           </w:p>
         </w:tc>
@@ -2918,6 +2940,7 @@
                 <w:b/>
                 <w:sz w:val="18"/>
               </w:rPr>
+              <w:lastRenderedPageBreak/>
               <w:t>Data footprint</w:t>
             </w:r>
           </w:p>
@@ -3025,14 +3048,7 @@
               <w:rPr>
                 <w:sz w:val="18"/>
               </w:rPr>
-              <w:t xml:space="preserve">Out of baseline scope — the 99.9% target is deferred to the follow-on HA </w:t>
-            </w:r>
-            <w:r>
-              <w:rPr>
-                <w:sz w:val="18"/>
-              </w:rPr>
-              <w:lastRenderedPageBreak/>
-              <w:t>design</w:t>
+              <w:t>Out of baseline scope — the 99.9% target is deferred to the follow-on HA design</w:t>
             </w:r>
           </w:p>
         </w:tc>
@@ -3043,7 +3059,7 @@
       <w:pPr>
         <w:pStyle w:val="Heading1"/>
       </w:pPr>
-      <w:bookmarkStart w:id="8" w:name="_Toc235021339"/>
+      <w:bookmarkStart w:id="8" w:name="_Toc238815534"/>
       <w:r>
         <w:t>3. Review of Existing Architecture</w:t>
       </w:r>
@@ -3062,7 +3078,7 @@
       <w:pPr>
         <w:pStyle w:val="Heading1"/>
       </w:pPr>
-      <w:bookmarkStart w:id="9" w:name="_Toc235021340"/>
+      <w:bookmarkStart w:id="9" w:name="_Toc238815535"/>
       <w:r>
         <w:t>4. Architecture Design</w:t>
       </w:r>
@@ -3072,7 +3088,7 @@
       <w:pPr>
         <w:pStyle w:val="Heading3"/>
       </w:pPr>
-      <w:bookmarkStart w:id="10" w:name="_Toc235021341"/>
+      <w:bookmarkStart w:id="10" w:name="_Toc238815536"/>
       <w:r>
         <w:t>4.1 Assumptions and constraints</w:t>
       </w:r>
@@ -3262,7 +3278,7 @@
               <w:rPr>
                 <w:sz w:val="18"/>
               </w:rPr>
-              <w:t>Application stack preserved: Windows Server 2016, MySQL, DOODLE</w:t>
+              <w:t>Application stack preserved: Windows Server, MySQL, DOODLE</w:t>
             </w:r>
           </w:p>
         </w:tc>
@@ -3607,7 +3623,7 @@
       <w:pPr>
         <w:pStyle w:val="Heading3"/>
       </w:pPr>
-      <w:bookmarkStart w:id="11" w:name="_Toc235021342"/>
+      <w:bookmarkStart w:id="11" w:name="_Toc238815537"/>
       <w:r>
         <w:t>4.2 AWS account and region</w:t>
       </w:r>
@@ -3615,14 +3631,14 @@
     </w:p>
     <w:p>
       <w:r>
-        <w:t>An AWS account scoped to the migration engagement, provisioned by YAT and shared with MTS for the build. Region ap-southeast-2 (Sydney); no deployment outside Australian regions. Availability Zone ap-southeast-2a for the baseline; the follow-on HA design introduces a second AZ.</w:t>
+        <w:t>An AWS account scoped to the migration engagement, provisioned by YAT and shared with MTS for the build. Region ap-southeast-2 (Sydney); no deployment outside Australian regions. The workload sits in ap-southeast-2a; the follow-on HA design puts application capacity into the second AZ.</w:t>
       </w:r>
     </w:p>
     <w:p>
       <w:pPr>
         <w:pStyle w:val="Heading3"/>
       </w:pPr>
-      <w:bookmarkStart w:id="12" w:name="_Toc235021343"/>
+      <w:bookmarkStart w:id="12" w:name="_Toc238815538"/>
       <w:r>
         <w:t>4.3 Identity and Access Management (IAM)</w:t>
       </w:r>
@@ -3768,7 +3784,7 @@
               <w:rPr>
                 <w:sz w:val="18"/>
               </w:rPr>
-              <w:t>Read-only on infra; full CloudWatch/RDS/EC2 console; no IAM changes</w:t>
+              <w:t>Read-only across the account; no IAM changes</w:t>
             </w:r>
           </w:p>
         </w:tc>
@@ -3856,69 +3872,6 @@
                 <w:b/>
                 <w:sz w:val="18"/>
               </w:rPr>
-              <w:t>Application-Service</w:t>
-            </w:r>
-          </w:p>
-        </w:tc>
-        <w:tc>
-          <w:tcPr>
-            <w:tcW w:w="2835" w:type="dxa"/>
-            <w:tcBorders>
-              <w:top w:val="single" w:sz="4" w:space="0" w:color="E4DED3"/>
-              <w:left w:val="single" w:sz="4" w:space="0" w:color="E4DED3"/>
-              <w:bottom w:val="single" w:sz="4" w:space="0" w:color="E4DED3"/>
-              <w:right w:val="single" w:sz="4" w:space="0" w:color="E4DED3"/>
-            </w:tcBorders>
-          </w:tcPr>
-          <w:p>
-            <w:r>
-              <w:rPr>
-                <w:sz w:val="18"/>
-              </w:rPr>
-              <w:t>EC2 instance role for the LMS</w:t>
-            </w:r>
-          </w:p>
-        </w:tc>
-        <w:tc>
-          <w:tcPr>
-            <w:tcW w:w="4252" w:type="dxa"/>
-            <w:tcBorders>
-              <w:top w:val="single" w:sz="4" w:space="0" w:color="E4DED3"/>
-              <w:left w:val="single" w:sz="4" w:space="0" w:color="E4DED3"/>
-              <w:bottom w:val="single" w:sz="4" w:space="0" w:color="E4DED3"/>
-              <w:right w:val="single" w:sz="4" w:space="0" w:color="E4DED3"/>
-            </w:tcBorders>
-          </w:tcPr>
-          <w:p>
-            <w:r>
-              <w:rPr>
-                <w:sz w:val="18"/>
-              </w:rPr>
-              <w:t>RDS read/write; S3 read/write (attachments); CloudWatch logs</w:t>
-            </w:r>
-          </w:p>
-        </w:tc>
-      </w:tr>
-      <w:tr>
-        <w:trPr>
-          <w:jc w:val="center"/>
-        </w:trPr>
-        <w:tc>
-          <w:tcPr>
-            <w:tcW w:w="1984" w:type="dxa"/>
-            <w:tcBorders>
-              <w:top w:val="single" w:sz="4" w:space="0" w:color="E4DED3"/>
-              <w:left w:val="single" w:sz="4" w:space="0" w:color="E4DED3"/>
-              <w:bottom w:val="single" w:sz="4" w:space="0" w:color="E4DED3"/>
-              <w:right w:val="single" w:sz="4" w:space="0" w:color="E4DED3"/>
-            </w:tcBorders>
-          </w:tcPr>
-          <w:p>
-            <w:r>
-              <w:rPr>
-                <w:b/>
-                <w:sz w:val="18"/>
-              </w:rPr>
               <w:t>Read-Only-Auditors</w:t>
             </w:r>
           </w:p>
@@ -3969,7 +3922,7 @@
         <w:pStyle w:val="ListBullet"/>
       </w:pPr>
       <w:r>
-        <w:t>MFA required for all YAT-ICT-Admins and MTS-Consultants users (Essential Eight; User Access Policy).</w:t>
+        <w:t>Individual users are placed in a group, and may also carry a policy of their own where their job needs something the group does not give everyone — Sam Walker (YAT ICT Manager) sits in YAT-ICT-Admins and carries CloudWatch access directly.</w:t>
       </w:r>
     </w:p>
     <w:p>
@@ -3977,7 +3930,7 @@
         <w:pStyle w:val="ListBullet"/>
       </w:pPr>
       <w:r>
-        <w:t>No long-lived access keys for humans; programmatic access via IAM roles only; EC2 access via instance profile.</w:t>
+        <w:t>No long-lived access keys for humans; programmatic access via IAM roles only.</w:t>
       </w:r>
     </w:p>
     <w:p>
@@ -3986,14 +3939,44 @@
       </w:pPr>
       <w:r>
         <w:lastRenderedPageBreak/>
-        <w:t>Configuration decision left to the implementer: the MTS-Consultants permission boundary during build vs after handover.</w:t>
+        <w:t>The application servers reach the database and the logging service through an EC2 instance role, so no credentials are stored on a server.</w:t>
       </w:r>
     </w:p>
     <w:p>
       <w:pPr>
+        <w:pStyle w:val="ListBullet"/>
+      </w:pPr>
+      <w:r>
+        <w:t>Identity administration stays with whoever governs the account: the group that operates the platform can see everything and change nothing about who has access.</w:t>
+      </w:r>
+    </w:p>
+    <w:p>
+      <w:pPr>
+        <w:spacing w:before="40" w:after="160"/>
+        <w:ind w:left="227"/>
+      </w:pPr>
+      <w:r>
+        <w:rPr>
+          <w:b/>
+          <w:color w:val="C5613B"/>
+          <w:sz w:val="19"/>
+        </w:rPr>
+        <w:t>Building this in a lab </w:t>
+      </w:r>
+      <w:r>
+        <w:rPr>
+          <w:i/>
+          <w:color w:val="C5613B"/>
+          <w:sz w:val="19"/>
+        </w:rPr>
+        <w:t>an AWS Academy Learner Lab does not permit groups, users or roles to be created, and supplies a ready-made role and instance profile instead. Build this section as far as the environment allows, capture the refusal, and use the supplied role where this design calls for the application's own.</w:t>
+      </w:r>
+    </w:p>
+    <w:p>
+      <w:pPr>
         <w:pStyle w:val="Heading3"/>
       </w:pPr>
-      <w:bookmarkStart w:id="13" w:name="_Toc235021344"/>
+      <w:bookmarkStart w:id="13" w:name="_Toc238815539"/>
       <w:r>
         <w:t>4.4 Network topology</w:t>
       </w:r>
@@ -4001,7 +3984,7 @@
     </w:p>
     <w:p>
       <w:r>
-        <w:t>VPC 10.0.0.0/16 (room to expand), with DNS hostnames/resolution and VPC flow logs enabled. Single-AZ subnets in ap-southeast-2a:</w:t>
+        <w:t>VPC 10.0.0.0/16 (room to expand), with DNS hostnames and DNS resolution enabled. The workload runs in ap-southeast-2a. Two further subnets exist in ap-southeast-2b carrying nothing: the load balancer and the database subnet group each refuse to be created unless they are given subnets in two Availability Zones.</w:t>
       </w:r>
     </w:p>
     <w:tbl>
@@ -4011,10 +3994,11 @@
         <w:tblLook w:val="04A0" w:firstRow="1" w:lastRow="0" w:firstColumn="1" w:lastColumn="0" w:noHBand="0" w:noVBand="1"/>
       </w:tblPr>
       <w:tblGrid>
-        <w:gridCol w:w="2268"/>
-        <w:gridCol w:w="1984"/>
-        <w:gridCol w:w="3118"/>
-        <w:gridCol w:w="1701"/>
+        <w:gridCol w:w="1814"/>
+        <w:gridCol w:w="1474"/>
+        <w:gridCol w:w="1814"/>
+        <w:gridCol w:w="2608"/>
+        <w:gridCol w:w="1361"/>
       </w:tblGrid>
       <w:tr>
         <w:trPr>
@@ -4022,7 +4006,7 @@
         </w:trPr>
         <w:tc>
           <w:tcPr>
-            <w:tcW w:w="2268" w:type="dxa"/>
+            <w:tcW w:w="1814" w:type="dxa"/>
             <w:tcBorders>
               <w:top w:val="single" w:sz="4" w:space="0" w:color="E4DED3"/>
               <w:left w:val="single" w:sz="4" w:space="0" w:color="E4DED3"/>
@@ -4044,7 +4028,7 @@
         </w:tc>
         <w:tc>
           <w:tcPr>
-            <w:tcW w:w="1984" w:type="dxa"/>
+            <w:tcW w:w="1474" w:type="dxa"/>
             <w:tcBorders>
               <w:top w:val="single" w:sz="4" w:space="0" w:color="E4DED3"/>
               <w:left w:val="single" w:sz="4" w:space="0" w:color="E4DED3"/>
@@ -4066,7 +4050,29 @@
         </w:tc>
         <w:tc>
           <w:tcPr>
-            <w:tcW w:w="3118" w:type="dxa"/>
+            <w:tcW w:w="1814" w:type="dxa"/>
+            <w:tcBorders>
+              <w:top w:val="single" w:sz="4" w:space="0" w:color="E4DED3"/>
+              <w:left w:val="single" w:sz="4" w:space="0" w:color="E4DED3"/>
+              <w:bottom w:val="single" w:sz="4" w:space="0" w:color="E4DED3"/>
+              <w:right w:val="single" w:sz="4" w:space="0" w:color="E4DED3"/>
+            </w:tcBorders>
+            <w:shd w:val="clear" w:color="auto" w:fill="1F5A5C"/>
+          </w:tcPr>
+          <w:p>
+            <w:r>
+              <w:rPr>
+                <w:b/>
+                <w:color w:val="FFFFFF"/>
+                <w:sz w:val="18"/>
+              </w:rPr>
+              <w:t>Zone</w:t>
+            </w:r>
+          </w:p>
+        </w:tc>
+        <w:tc>
+          <w:tcPr>
+            <w:tcW w:w="2608" w:type="dxa"/>
             <w:tcBorders>
               <w:top w:val="single" w:sz="4" w:space="0" w:color="E4DED3"/>
               <w:left w:val="single" w:sz="4" w:space="0" w:color="E4DED3"/>
@@ -4088,7 +4094,7 @@
         </w:tc>
         <w:tc>
           <w:tcPr>
-            <w:tcW w:w="1701" w:type="dxa"/>
+            <w:tcW w:w="1361" w:type="dxa"/>
             <w:tcBorders>
               <w:top w:val="single" w:sz="4" w:space="0" w:color="E4DED3"/>
               <w:left w:val="single" w:sz="4" w:space="0" w:color="E4DED3"/>
@@ -4115,7 +4121,7 @@
         </w:trPr>
         <w:tc>
           <w:tcPr>
-            <w:tcW w:w="2268" w:type="dxa"/>
+            <w:tcW w:w="1814" w:type="dxa"/>
             <w:tcBorders>
               <w:top w:val="single" w:sz="4" w:space="0" w:color="E4DED3"/>
               <w:left w:val="single" w:sz="4" w:space="0" w:color="E4DED3"/>
@@ -4135,7 +4141,7 @@
         </w:tc>
         <w:tc>
           <w:tcPr>
-            <w:tcW w:w="1984" w:type="dxa"/>
+            <w:tcW w:w="1474" w:type="dxa"/>
             <w:tcBorders>
               <w:top w:val="single" w:sz="4" w:space="0" w:color="E4DED3"/>
               <w:left w:val="single" w:sz="4" w:space="0" w:color="E4DED3"/>
@@ -4154,7 +4160,26 @@
         </w:tc>
         <w:tc>
           <w:tcPr>
-            <w:tcW w:w="3118" w:type="dxa"/>
+            <w:tcW w:w="1814" w:type="dxa"/>
+            <w:tcBorders>
+              <w:top w:val="single" w:sz="4" w:space="0" w:color="E4DED3"/>
+              <w:left w:val="single" w:sz="4" w:space="0" w:color="E4DED3"/>
+              <w:bottom w:val="single" w:sz="4" w:space="0" w:color="E4DED3"/>
+              <w:right w:val="single" w:sz="4" w:space="0" w:color="E4DED3"/>
+            </w:tcBorders>
+          </w:tcPr>
+          <w:p>
+            <w:r>
+              <w:rPr>
+                <w:sz w:val="18"/>
+              </w:rPr>
+              <w:t>ap-southeast-2a</w:t>
+            </w:r>
+          </w:p>
+        </w:tc>
+        <w:tc>
+          <w:tcPr>
+            <w:tcW w:w="2608" w:type="dxa"/>
             <w:tcBorders>
               <w:top w:val="single" w:sz="4" w:space="0" w:color="E4DED3"/>
               <w:left w:val="single" w:sz="4" w:space="0" w:color="E4DED3"/>
@@ -4173,7 +4198,7 @@
         </w:tc>
         <w:tc>
           <w:tcPr>
-            <w:tcW w:w="1701" w:type="dxa"/>
+            <w:tcW w:w="1361" w:type="dxa"/>
             <w:tcBorders>
               <w:top w:val="single" w:sz="4" w:space="0" w:color="E4DED3"/>
               <w:left w:val="single" w:sz="4" w:space="0" w:color="E4DED3"/>
@@ -4197,7 +4222,108 @@
         </w:trPr>
         <w:tc>
           <w:tcPr>
-            <w:tcW w:w="2268" w:type="dxa"/>
+            <w:tcW w:w="1814" w:type="dxa"/>
+            <w:tcBorders>
+              <w:top w:val="single" w:sz="4" w:space="0" w:color="E4DED3"/>
+              <w:left w:val="single" w:sz="4" w:space="0" w:color="E4DED3"/>
+              <w:bottom w:val="single" w:sz="4" w:space="0" w:color="E4DED3"/>
+              <w:right w:val="single" w:sz="4" w:space="0" w:color="E4DED3"/>
+            </w:tcBorders>
+          </w:tcPr>
+          <w:p>
+            <w:r>
+              <w:rPr>
+                <w:b/>
+                <w:sz w:val="18"/>
+              </w:rPr>
+              <w:t>public-web-b</w:t>
+            </w:r>
+          </w:p>
+        </w:tc>
+        <w:tc>
+          <w:tcPr>
+            <w:tcW w:w="1474" w:type="dxa"/>
+            <w:tcBorders>
+              <w:top w:val="single" w:sz="4" w:space="0" w:color="E4DED3"/>
+              <w:left w:val="single" w:sz="4" w:space="0" w:color="E4DED3"/>
+              <w:bottom w:val="single" w:sz="4" w:space="0" w:color="E4DED3"/>
+              <w:right w:val="single" w:sz="4" w:space="0" w:color="E4DED3"/>
+            </w:tcBorders>
+          </w:tcPr>
+          <w:p>
+            <w:r>
+              <w:rPr>
+                <w:sz w:val="18"/>
+              </w:rPr>
+              <w:t>10.0.2.0/24</w:t>
+            </w:r>
+          </w:p>
+        </w:tc>
+        <w:tc>
+          <w:tcPr>
+            <w:tcW w:w="1814" w:type="dxa"/>
+            <w:tcBorders>
+              <w:top w:val="single" w:sz="4" w:space="0" w:color="E4DED3"/>
+              <w:left w:val="single" w:sz="4" w:space="0" w:color="E4DED3"/>
+              <w:bottom w:val="single" w:sz="4" w:space="0" w:color="E4DED3"/>
+              <w:right w:val="single" w:sz="4" w:space="0" w:color="E4DED3"/>
+            </w:tcBorders>
+          </w:tcPr>
+          <w:p>
+            <w:r>
+              <w:rPr>
+                <w:sz w:val="18"/>
+              </w:rPr>
+              <w:t>ap-southeast-2b</w:t>
+            </w:r>
+          </w:p>
+        </w:tc>
+        <w:tc>
+          <w:tcPr>
+            <w:tcW w:w="2608" w:type="dxa"/>
+            <w:tcBorders>
+              <w:top w:val="single" w:sz="4" w:space="0" w:color="E4DED3"/>
+              <w:left w:val="single" w:sz="4" w:space="0" w:color="E4DED3"/>
+              <w:bottom w:val="single" w:sz="4" w:space="0" w:color="E4DED3"/>
+              <w:right w:val="single" w:sz="4" w:space="0" w:color="E4DED3"/>
+            </w:tcBorders>
+          </w:tcPr>
+          <w:p>
+            <w:r>
+              <w:rPr>
+                <w:sz w:val="18"/>
+              </w:rPr>
+              <w:t>Load balancer second zone — empty</w:t>
+            </w:r>
+          </w:p>
+        </w:tc>
+        <w:tc>
+          <w:tcPr>
+            <w:tcW w:w="1361" w:type="dxa"/>
+            <w:tcBorders>
+              <w:top w:val="single" w:sz="4" w:space="0" w:color="E4DED3"/>
+              <w:left w:val="single" w:sz="4" w:space="0" w:color="E4DED3"/>
+              <w:bottom w:val="single" w:sz="4" w:space="0" w:color="E4DED3"/>
+              <w:right w:val="single" w:sz="4" w:space="0" w:color="E4DED3"/>
+            </w:tcBorders>
+          </w:tcPr>
+          <w:p>
+            <w:r>
+              <w:rPr>
+                <w:sz w:val="18"/>
+              </w:rPr>
+              <w:t>Yes</w:t>
+            </w:r>
+          </w:p>
+        </w:tc>
+      </w:tr>
+      <w:tr>
+        <w:trPr>
+          <w:jc w:val="center"/>
+        </w:trPr>
+        <w:tc>
+          <w:tcPr>
+            <w:tcW w:w="1814" w:type="dxa"/>
             <w:tcBorders>
               <w:top w:val="single" w:sz="4" w:space="0" w:color="E4DED3"/>
               <w:left w:val="single" w:sz="4" w:space="0" w:color="E4DED3"/>
@@ -4217,7 +4343,7 @@
         </w:tc>
         <w:tc>
           <w:tcPr>
-            <w:tcW w:w="1984" w:type="dxa"/>
+            <w:tcW w:w="1474" w:type="dxa"/>
             <w:tcBorders>
               <w:top w:val="single" w:sz="4" w:space="0" w:color="E4DED3"/>
               <w:left w:val="single" w:sz="4" w:space="0" w:color="E4DED3"/>
@@ -4236,7 +4362,26 @@
         </w:tc>
         <w:tc>
           <w:tcPr>
-            <w:tcW w:w="3118" w:type="dxa"/>
+            <w:tcW w:w="1814" w:type="dxa"/>
+            <w:tcBorders>
+              <w:top w:val="single" w:sz="4" w:space="0" w:color="E4DED3"/>
+              <w:left w:val="single" w:sz="4" w:space="0" w:color="E4DED3"/>
+              <w:bottom w:val="single" w:sz="4" w:space="0" w:color="E4DED3"/>
+              <w:right w:val="single" w:sz="4" w:space="0" w:color="E4DED3"/>
+            </w:tcBorders>
+          </w:tcPr>
+          <w:p>
+            <w:r>
+              <w:rPr>
+                <w:sz w:val="18"/>
+              </w:rPr>
+              <w:t>ap-southeast-2a</w:t>
+            </w:r>
+          </w:p>
+        </w:tc>
+        <w:tc>
+          <w:tcPr>
+            <w:tcW w:w="2608" w:type="dxa"/>
             <w:tcBorders>
               <w:top w:val="single" w:sz="4" w:space="0" w:color="E4DED3"/>
               <w:left w:val="single" w:sz="4" w:space="0" w:color="E4DED3"/>
@@ -4255,7 +4400,7 @@
         </w:tc>
         <w:tc>
           <w:tcPr>
-            <w:tcW w:w="1701" w:type="dxa"/>
+            <w:tcW w:w="1361" w:type="dxa"/>
             <w:tcBorders>
               <w:top w:val="single" w:sz="4" w:space="0" w:color="E4DED3"/>
               <w:left w:val="single" w:sz="4" w:space="0" w:color="E4DED3"/>
@@ -4279,7 +4424,7 @@
         </w:trPr>
         <w:tc>
           <w:tcPr>
-            <w:tcW w:w="2268" w:type="dxa"/>
+            <w:tcW w:w="1814" w:type="dxa"/>
             <w:tcBorders>
               <w:top w:val="single" w:sz="4" w:space="0" w:color="E4DED3"/>
               <w:left w:val="single" w:sz="4" w:space="0" w:color="E4DED3"/>
@@ -4299,7 +4444,7 @@
         </w:tc>
         <w:tc>
           <w:tcPr>
-            <w:tcW w:w="1984" w:type="dxa"/>
+            <w:tcW w:w="1474" w:type="dxa"/>
             <w:tcBorders>
               <w:top w:val="single" w:sz="4" w:space="0" w:color="E4DED3"/>
               <w:left w:val="single" w:sz="4" w:space="0" w:color="E4DED3"/>
@@ -4318,7 +4463,26 @@
         </w:tc>
         <w:tc>
           <w:tcPr>
-            <w:tcW w:w="3118" w:type="dxa"/>
+            <w:tcW w:w="1814" w:type="dxa"/>
+            <w:tcBorders>
+              <w:top w:val="single" w:sz="4" w:space="0" w:color="E4DED3"/>
+              <w:left w:val="single" w:sz="4" w:space="0" w:color="E4DED3"/>
+              <w:bottom w:val="single" w:sz="4" w:space="0" w:color="E4DED3"/>
+              <w:right w:val="single" w:sz="4" w:space="0" w:color="E4DED3"/>
+            </w:tcBorders>
+          </w:tcPr>
+          <w:p>
+            <w:r>
+              <w:rPr>
+                <w:sz w:val="18"/>
+              </w:rPr>
+              <w:t>ap-southeast-2a</w:t>
+            </w:r>
+          </w:p>
+        </w:tc>
+        <w:tc>
+          <w:tcPr>
+            <w:tcW w:w="2608" w:type="dxa"/>
             <w:tcBorders>
               <w:top w:val="single" w:sz="4" w:space="0" w:color="E4DED3"/>
               <w:left w:val="single" w:sz="4" w:space="0" w:color="E4DED3"/>
@@ -4337,7 +4501,108 @@
         </w:tc>
         <w:tc>
           <w:tcPr>
-            <w:tcW w:w="1701" w:type="dxa"/>
+            <w:tcW w:w="1361" w:type="dxa"/>
+            <w:tcBorders>
+              <w:top w:val="single" w:sz="4" w:space="0" w:color="E4DED3"/>
+              <w:left w:val="single" w:sz="4" w:space="0" w:color="E4DED3"/>
+              <w:bottom w:val="single" w:sz="4" w:space="0" w:color="E4DED3"/>
+              <w:right w:val="single" w:sz="4" w:space="0" w:color="E4DED3"/>
+            </w:tcBorders>
+          </w:tcPr>
+          <w:p>
+            <w:r>
+              <w:rPr>
+                <w:sz w:val="18"/>
+              </w:rPr>
+              <w:t>No</w:t>
+            </w:r>
+          </w:p>
+        </w:tc>
+      </w:tr>
+      <w:tr>
+        <w:trPr>
+          <w:jc w:val="center"/>
+        </w:trPr>
+        <w:tc>
+          <w:tcPr>
+            <w:tcW w:w="1814" w:type="dxa"/>
+            <w:tcBorders>
+              <w:top w:val="single" w:sz="4" w:space="0" w:color="E4DED3"/>
+              <w:left w:val="single" w:sz="4" w:space="0" w:color="E4DED3"/>
+              <w:bottom w:val="single" w:sz="4" w:space="0" w:color="E4DED3"/>
+              <w:right w:val="single" w:sz="4" w:space="0" w:color="E4DED3"/>
+            </w:tcBorders>
+          </w:tcPr>
+          <w:p>
+            <w:r>
+              <w:rPr>
+                <w:b/>
+                <w:sz w:val="18"/>
+              </w:rPr>
+              <w:t>private-data-b</w:t>
+            </w:r>
+          </w:p>
+        </w:tc>
+        <w:tc>
+          <w:tcPr>
+            <w:tcW w:w="1474" w:type="dxa"/>
+            <w:tcBorders>
+              <w:top w:val="single" w:sz="4" w:space="0" w:color="E4DED3"/>
+              <w:left w:val="single" w:sz="4" w:space="0" w:color="E4DED3"/>
+              <w:bottom w:val="single" w:sz="4" w:space="0" w:color="E4DED3"/>
+              <w:right w:val="single" w:sz="4" w:space="0" w:color="E4DED3"/>
+            </w:tcBorders>
+          </w:tcPr>
+          <w:p>
+            <w:r>
+              <w:rPr>
+                <w:sz w:val="18"/>
+              </w:rPr>
+              <w:t>10.0.22.0/24</w:t>
+            </w:r>
+          </w:p>
+        </w:tc>
+        <w:tc>
+          <w:tcPr>
+            <w:tcW w:w="1814" w:type="dxa"/>
+            <w:tcBorders>
+              <w:top w:val="single" w:sz="4" w:space="0" w:color="E4DED3"/>
+              <w:left w:val="single" w:sz="4" w:space="0" w:color="E4DED3"/>
+              <w:bottom w:val="single" w:sz="4" w:space="0" w:color="E4DED3"/>
+              <w:right w:val="single" w:sz="4" w:space="0" w:color="E4DED3"/>
+            </w:tcBorders>
+          </w:tcPr>
+          <w:p>
+            <w:r>
+              <w:rPr>
+                <w:sz w:val="18"/>
+              </w:rPr>
+              <w:t>ap-southeast-2b</w:t>
+            </w:r>
+          </w:p>
+        </w:tc>
+        <w:tc>
+          <w:tcPr>
+            <w:tcW w:w="2608" w:type="dxa"/>
+            <w:tcBorders>
+              <w:top w:val="single" w:sz="4" w:space="0" w:color="E4DED3"/>
+              <w:left w:val="single" w:sz="4" w:space="0" w:color="E4DED3"/>
+              <w:bottom w:val="single" w:sz="4" w:space="0" w:color="E4DED3"/>
+              <w:right w:val="single" w:sz="4" w:space="0" w:color="E4DED3"/>
+            </w:tcBorders>
+          </w:tcPr>
+          <w:p>
+            <w:r>
+              <w:rPr>
+                <w:sz w:val="18"/>
+              </w:rPr>
+              <w:t>Database subnet group second zone — empty</w:t>
+            </w:r>
+          </w:p>
+        </w:tc>
+        <w:tc>
+          <w:tcPr>
+            <w:tcW w:w="1361" w:type="dxa"/>
             <w:tcBorders>
               <w:top w:val="single" w:sz="4" w:space="0" w:color="E4DED3"/>
               <w:left w:val="single" w:sz="4" w:space="0" w:color="E4DED3"/>
@@ -4370,7 +4635,7 @@
         <w:pStyle w:val="ListBullet"/>
       </w:pPr>
       <w:r>
-        <w:t>Route tables: public → IGW; private-app → NAT; private-data → no internet route.</w:t>
+        <w:t>Route tables: public-rt carries both public subnets → IGW; private-app-rt carries private-app-a → NAT. The data subnets stay on the VPC's default route table, which has no internet route at all.</w:t>
       </w:r>
     </w:p>
     <w:p>
@@ -4386,90 +4651,55 @@
         <w:pStyle w:val="ListBullet"/>
       </w:pPr>
       <w:r>
-        <w:t>The follow-on HA design adds the corresponding -b subnets in ap-southeast-2b.</w:t>
+        <w:t>The follow-on HA design adds private-app-b, the one subnet the second zone is still missing.</w:t>
       </w:r>
     </w:p>
-    <w:tbl>
-      <w:tblPr>
-        <w:tblW w:w="0" w:type="auto"/>
-        <w:tblLook w:val="04A0" w:firstRow="1" w:lastRow="0" w:firstColumn="1" w:lastColumn="0" w:noHBand="0" w:noVBand="1"/>
-      </w:tblPr>
-      <w:tblGrid>
-        <w:gridCol w:w="9411"/>
-      </w:tblGrid>
-      <w:tr>
-        <w:trPr>
-          <w:trHeight w:hRule="exact" w:val="5386"/>
-        </w:trPr>
-        <w:tc>
-          <w:tcPr>
-            <w:tcW w:w="9411" w:type="dxa"/>
-            <w:tcBorders>
-              <w:top w:val="single" w:sz="4" w:space="0" w:color="E4DED3"/>
-              <w:left w:val="single" w:sz="4" w:space="0" w:color="E4DED3"/>
-              <w:bottom w:val="single" w:sz="4" w:space="0" w:color="E4DED3"/>
-              <w:right w:val="single" w:sz="4" w:space="0" w:color="E4DED3"/>
-            </w:tcBorders>
-            <w:shd w:val="clear" w:color="auto" w:fill="F8F4ED"/>
-            <w:vAlign w:val="center"/>
-          </w:tcPr>
-          <w:p>
-            <w:pPr>
-              <w:jc w:val="center"/>
-            </w:pPr>
-            <w:r>
-              <w:rPr>
-                <w:b/>
-                <w:noProof/>
-                <w:color w:val="C5613B"/>
-                <w:sz w:val="22"/>
-              </w:rPr>
-              <w:drawing>
-                <wp:inline distT="0" distB="0" distL="0" distR="0" wp14:anchorId="2F36DD5F" wp14:editId="3F69FA54">
-                  <wp:extent cx="5676181" cy="3397748"/>
-                  <wp:effectExtent l="0" t="0" r="1270" b="0"/>
-                  <wp:docPr id="1336559420" name="Graphic 1"/>
-                  <wp:cNvGraphicFramePr>
-                    <a:graphicFrameLocks xmlns:a="http://schemas.openxmlformats.org/drawingml/2006/main" noChangeAspect="1"/>
-                  </wp:cNvGraphicFramePr>
-                  <a:graphic xmlns:a="http://schemas.openxmlformats.org/drawingml/2006/main">
-                    <a:graphicData uri="http://schemas.openxmlformats.org/drawingml/2006/picture">
-                      <pic:pic xmlns:pic="http://schemas.openxmlformats.org/drawingml/2006/picture">
-                        <pic:nvPicPr>
-                          <pic:cNvPr id="1336559420" name=""/>
-                          <pic:cNvPicPr/>
-                        </pic:nvPicPr>
-                        <pic:blipFill>
-                          <a:blip r:embed="rId12">
-                            <a:extLst>
-                              <a:ext uri="{96DAC541-7B7A-43D3-8B79-37D633B846F1}">
-                                <asvg:svgBlip xmlns:asvg="http://schemas.microsoft.com/office/drawing/2016/SVG/main" r:embed="rId13"/>
-                              </a:ext>
-                            </a:extLst>
-                          </a:blip>
-                          <a:stretch>
-                            <a:fillRect/>
-                          </a:stretch>
-                        </pic:blipFill>
-                        <pic:spPr>
-                          <a:xfrm>
-                            <a:off x="0" y="0"/>
-                            <a:ext cx="5698395" cy="3411045"/>
-                          </a:xfrm>
-                          <a:prstGeom prst="rect">
-                            <a:avLst/>
-                          </a:prstGeom>
-                        </pic:spPr>
-                      </pic:pic>
-                    </a:graphicData>
-                  </a:graphic>
-                </wp:inline>
-              </w:drawing>
-            </w:r>
-          </w:p>
-        </w:tc>
-      </w:tr>
-    </w:tbl>
+    <w:p>
+      <w:pPr>
+        <w:jc w:val="center"/>
+      </w:pPr>
+      <w:r>
+        <w:rPr>
+          <w:noProof/>
+        </w:rPr>
+        <w:lastRenderedPageBreak/>
+        <w:drawing>
+          <wp:inline distT="0" distB="0" distL="0" distR="0" wp14:anchorId="7DD3DCF7" wp14:editId="43D0E9DD">
+            <wp:extent cx="5760000" cy="5925835"/>
+            <wp:effectExtent l="0" t="0" r="0" b="0"/>
+            <wp:docPr id="1" name="Picture 1"/>
+            <wp:cNvGraphicFramePr>
+              <a:graphicFrameLocks xmlns:a="http://schemas.openxmlformats.org/drawingml/2006/main" noChangeAspect="1"/>
+            </wp:cNvGraphicFramePr>
+            <a:graphic xmlns:a="http://schemas.openxmlformats.org/drawingml/2006/main">
+              <a:graphicData uri="http://schemas.openxmlformats.org/drawingml/2006/picture">
+                <pic:pic xmlns:pic="http://schemas.openxmlformats.org/drawingml/2006/picture">
+                  <pic:nvPicPr>
+                    <pic:cNvPr id="0" name="network-at3-start-non-hardened.drawio.png"/>
+                    <pic:cNvPicPr/>
+                  </pic:nvPicPr>
+                  <pic:blipFill>
+                    <a:blip r:embed="rId12"/>
+                    <a:stretch>
+                      <a:fillRect/>
+                    </a:stretch>
+                  </pic:blipFill>
+                  <pic:spPr>
+                    <a:xfrm>
+                      <a:off x="0" y="0"/>
+                      <a:ext cx="5760000" cy="5925835"/>
+                    </a:xfrm>
+                    <a:prstGeom prst="rect">
+                      <a:avLst/>
+                    </a:prstGeom>
+                  </pic:spPr>
+                </pic:pic>
+              </a:graphicData>
+            </a:graphic>
+          </wp:inline>
+        </w:drawing>
+      </w:r>
+    </w:p>
     <w:p>
       <w:pPr>
         <w:jc w:val="center"/>
@@ -4480,14 +4710,14 @@
           <w:color w:val="6B6660"/>
           <w:sz w:val="18"/>
         </w:rPr>
-        <w:t>Figure 4.4 — LMS baseline network topology (single-AZ).</w:t>
+        <w:t>Figure 4.4 — LMS baseline network topology. The workload runs in ap-southeast-2a; the two subnets in ap-southeast-2b carry nothing.</w:t>
       </w:r>
     </w:p>
     <w:p>
       <w:pPr>
         <w:pStyle w:val="Heading3"/>
       </w:pPr>
-      <w:bookmarkStart w:id="14" w:name="_Toc235021345"/>
+      <w:bookmarkStart w:id="14" w:name="_Toc238815540"/>
       <w:r>
         <w:t>4.5 Compute (EC2 + Auto Scaling)</w:t>
       </w:r>
@@ -4498,7 +4728,7 @@
         <w:pStyle w:val="ListBullet"/>
       </w:pPr>
       <w:r>
-        <w:t>EC2: general-purpose x86 (e.g. m6i.large — final type a C1 implementer decision); Windows Server 2016 AMI; placed in private-app-a (no public IP).</w:t>
+        <w:t>Every application server is built from a launch template, yat-lms-lt, so nothing is configured on a server by hand.</w:t>
       </w:r>
     </w:p>
     <w:p>
@@ -4506,7 +4736,7 @@
         <w:pStyle w:val="ListBullet"/>
       </w:pPr>
       <w:r>
-        <w:t>EBS: gp3 root 100 GB + a gp3 data volume sized by the implementer (footprint + 12-month growth + 50% headroom).</w:t>
+        <w:t>Instance type: general-purpose burstable — t3.micro or t3.small, a C1 implementer decision sized against the concurrent-user load.</w:t>
       </w:r>
     </w:p>
     <w:p>
@@ -4514,7 +4744,7 @@
         <w:pStyle w:val="ListBullet"/>
       </w:pPr>
       <w:r>
-        <w:t>Auto Scaling Group: min 1 / desired 1 / max 2 (baseline); target-tracking on CPU at 70%; ELB+EC2 health checks; 300 s cooldown.</w:t>
+        <w:t>Windows Server AMI; placed in private-app-a by the Auto Scaling group; no key pair and no public IP.</w:t>
       </w:r>
     </w:p>
     <w:p>
@@ -4522,16 +4752,84 @@
         <w:pStyle w:val="ListBullet"/>
       </w:pPr>
       <w:r>
-        <w:t>The follow-on HA design expands the ASG (min 2, multi-AZ) and tunes scaling for assessment-window peaks.</w:t>
+        <w:t>EBS: gp3 root 30 GB, plus a gp3 8 GB data volume at device name xvdb for application data.</w:t>
       </w:r>
     </w:p>
     <w:p>
       <w:pPr>
-        <w:pStyle w:val="Heading3"/>
-      </w:pPr>
-      <w:bookmarkStart w:id="15" w:name="_Toc235021346"/>
+        <w:pStyle w:val="ListBullet"/>
+      </w:pPr>
+      <w:r>
+        <w:t>The instance profile carries the EC2 instance role, which is how the servers reach the database and the logging service.</w:t>
+      </w:r>
+    </w:p>
+    <w:p>
+      <w:pPr>
+        <w:pStyle w:val="ListBullet"/>
+      </w:pPr>
+      <w:r>
+        <w:t>Auto Scaling Group: min 1 / desired 1 / max 2, in private-app-a only; target-tracking on CPU at 70%; Elastic Load Balancing health checks with a 300 s grace period; 60 s warm-up.</w:t>
+      </w:r>
+    </w:p>
+    <w:p>
+      <w:pPr>
+        <w:pStyle w:val="ListBullet"/>
+      </w:pPr>
       <w:r>
         <w:lastRenderedPageBreak/>
+        <w:t>The follow-on HA design expands the ASG (min 2, across both AZs) and tunes scaling for assessment-window peaks.</w:t>
+      </w:r>
+    </w:p>
+    <w:p>
+      <w:pPr>
+        <w:spacing w:before="40" w:after="160"/>
+        <w:ind w:left="227"/>
+      </w:pPr>
+      <w:r>
+        <w:rPr>
+          <w:b/>
+          <w:color w:val="C5613B"/>
+          <w:sz w:val="19"/>
+        </w:rPr>
+        <w:t>Building this in a lab </w:t>
+      </w:r>
+      <w:r>
+        <w:rPr>
+          <w:i/>
+          <w:color w:val="C5613B"/>
+          <w:sz w:val="19"/>
+        </w:rPr>
+        <w:t>the LMS workload described in §2.2 — 200–300 typical and 500–700 peak concurrent users — would in reality need an instance several sizes larger than either of these. An AWS Academy Learner Lab caps what will launch, so the two options above are ones that actually run there. Size between them on the same reasoning you would use at full scale; the reasoning is what matters here, not the number of vCPUs.</w:t>
+      </w:r>
+    </w:p>
+    <w:p>
+      <w:pPr>
+        <w:spacing w:before="40" w:after="160"/>
+        <w:ind w:left="227"/>
+      </w:pPr>
+      <w:r>
+        <w:rPr>
+          <w:b/>
+          <w:color w:val="C5613B"/>
+          <w:sz w:val="19"/>
+        </w:rPr>
+        <w:t>Building this in a lab </w:t>
+      </w:r>
+      <w:r>
+        <w:rPr>
+          <w:i/>
+          <w:color w:val="C5613B"/>
+          <w:sz w:val="19"/>
+        </w:rPr>
+        <w:t>the design calls for a Windows Server build preserving the existing DOODLE stack. Use whichever current Windows Server image your environment offers; the version is not what this build turns on.</w:t>
+      </w:r>
+    </w:p>
+    <w:p>
+      <w:pPr>
+        <w:pStyle w:val="Heading3"/>
+      </w:pPr>
+      <w:bookmarkStart w:id="15" w:name="_Toc238815541"/>
+      <w:r>
         <w:t>4.6 Load balancing (ALB)</w:t>
       </w:r>
       <w:bookmarkEnd w:id="15"/>
@@ -4541,7 +4839,7 @@
         <w:pStyle w:val="ListBullet"/>
       </w:pPr>
       <w:r>
-        <w:t>Internet-facing ALB in public-web-a; HTTPS:443 listener forwarding to the LMS target group.</w:t>
+        <w:t>Internet-facing ALB, yat-lms-alb, spanning public-web-a and public-web-b — it will not create with only one zone.</w:t>
       </w:r>
     </w:p>
     <w:p>
@@ -4549,7 +4847,7 @@
         <w:pStyle w:val="ListBullet"/>
       </w:pPr>
       <w:r>
-        <w:t>Target group = the ASG instances; HTTP health check on the LMS health endpoint (30 s; 2 unhealthy → out of service).</w:t>
+        <w:t>Listener: HTTP on port 80, forwarding to the LMS target group.</w:t>
       </w:r>
     </w:p>
     <w:p>
@@ -4557,14 +4855,44 @@
         <w:pStyle w:val="ListBullet"/>
       </w:pPr>
       <w:r>
-        <w:t>TLS via an ACM-issued certificate for the LMS DNS name (DNS strategy a C8 implementer decision).</w:t>
+        <w:t>Target group yat-lms-tg = the ASG instances, HTTP on port 80; health check HTTP on / (30 s interval; 2 unhealthy → out of service).</w:t>
       </w:r>
     </w:p>
     <w:p>
       <w:pPr>
+        <w:pStyle w:val="ListBullet"/>
+      </w:pPr>
+      <w:r>
+        <w:t>The LMS hostname and its TLS certificate are issued by YAT ICT and are put in front of this load balancer at cutover, which is outside MTS scope.</w:t>
+      </w:r>
+    </w:p>
+    <w:p>
+      <w:pPr>
+        <w:spacing w:before="40" w:after="160"/>
+        <w:ind w:left="227"/>
+      </w:pPr>
+      <w:r>
+        <w:rPr>
+          <w:b/>
+          <w:color w:val="C5613B"/>
+          <w:sz w:val="19"/>
+        </w:rPr>
+        <w:t>Building this in a lab </w:t>
+      </w:r>
+      <w:r>
+        <w:rPr>
+          <w:i/>
+          <w:color w:val="C5613B"/>
+          <w:sz w:val="19"/>
+        </w:rPr>
+        <w:t>the listener is deliberately plain HTTP on port 80 rather than HTTPS. That is a simplification, and a real production front door would terminate TLS here. It is done this way so that you can paste the load balancer's address into a browser and see the platform you built actually serving a page — which is worth more, while you are learning, than a certificate you cannot issue in a lab.</w:t>
+      </w:r>
+    </w:p>
+    <w:p>
+      <w:pPr>
         <w:pStyle w:val="Heading3"/>
       </w:pPr>
-      <w:bookmarkStart w:id="16" w:name="_Toc235021347"/>
+      <w:bookmarkStart w:id="16" w:name="_Toc238815542"/>
       <w:r>
         <w:t>4.7 Database (RDS)</w:t>
       </w:r>
@@ -4583,7 +4911,7 @@
         <w:pStyle w:val="ListBullet"/>
       </w:pPr>
       <w:r>
-        <w:t>General-purpose instance class (e.g. db.m6i.large — a C2 implementer decision); gp3 storage sized to footprint + growth.</w:t>
+        <w:t>General-purpose burstable instance class — db.t3.micro or db.t3.small, a C2 implementer decision.</w:t>
       </w:r>
     </w:p>
     <w:p>
@@ -4591,7 +4919,7 @@
         <w:pStyle w:val="ListBullet"/>
       </w:pPr>
       <w:r>
-        <w:t>Multi-AZ DISABLED for the baseline (enabled in the HA design); storage encryption enabled (KMS).</w:t>
+        <w:t>Storage: gp3, 20 GB; storage encryption enabled.</w:t>
       </w:r>
     </w:p>
     <w:p>
@@ -4599,7 +4927,15 @@
         <w:pStyle w:val="ListBullet"/>
       </w:pPr>
       <w:r>
-        <w:t>Placed in private-data-a; not publicly accessible; 7-day automated backups (window 22:00–04:00 AEST); maintenance Sun 02:00–06:00 AEST.</w:t>
+        <w:t>Multi-AZ DISABLED for the baseline — no standby is created (it is enabled in the HA design).</w:t>
+      </w:r>
+    </w:p>
+    <w:p>
+      <w:pPr>
+        <w:pStyle w:val="ListBullet"/>
+      </w:pPr>
+      <w:r>
+        <w:t>Placed via the yat-lms-db-subnet-group, which spans private-data-a and private-data-b; not publicly accessible; 7-day automated backups.</w:t>
       </w:r>
     </w:p>
     <w:p>
@@ -4612,9 +4948,31 @@
     </w:p>
     <w:p>
       <w:pPr>
+        <w:spacing w:before="40" w:after="160"/>
+        <w:ind w:left="227"/>
+      </w:pPr>
+      <w:r>
+        <w:rPr>
+          <w:b/>
+          <w:color w:val="C5613B"/>
+          <w:sz w:val="19"/>
+        </w:rPr>
+        <w:t>Building this in a lab </w:t>
+      </w:r>
+      <w:r>
+        <w:rPr>
+          <w:i/>
+          <w:color w:val="C5613B"/>
+          <w:sz w:val="19"/>
+        </w:rPr>
+        <w:t>the same applies here as to the application tier: the ~178 GB footprint and the read-heavy LMS workload would in reality call for a database class and a storage allocation well beyond either option above. An AWS Academy Learner Lab caps both, so the class and the 20 GB are sized to what will actually deploy there.</w:t>
+      </w:r>
+    </w:p>
+    <w:p>
+      <w:pPr>
         <w:pStyle w:val="Heading3"/>
       </w:pPr>
-      <w:bookmarkStart w:id="17" w:name="_Toc235021348"/>
+      <w:bookmarkStart w:id="17" w:name="_Toc238815543"/>
       <w:r>
         <w:t>4.8 Storage</w:t>
       </w:r>
@@ -4741,7 +5099,7 @@
               <w:rPr>
                 <w:sz w:val="18"/>
               </w:rPr>
-              <w:t>EBS gp3 100 GB</w:t>
+              <w:t>EBS gp3 30 GB</w:t>
             </w:r>
           </w:p>
         </w:tc>
@@ -4804,7 +5162,7 @@
               <w:rPr>
                 <w:sz w:val="18"/>
               </w:rPr>
-              <w:t>EBS gp3 (sized by implementer)</w:t>
+              <w:t>EBS gp3 8 GB (xvdb)</w:t>
             </w:r>
           </w:p>
         </w:tc>
@@ -4823,7 +5181,7 @@
               <w:rPr>
                 <w:sz w:val="18"/>
               </w:rPr>
-              <w:t>LMS application data, attachments staging</w:t>
+              <w:t>LMS application data</w:t>
             </w:r>
           </w:p>
         </w:tc>
@@ -4848,7 +5206,7 @@
                 <w:b/>
                 <w:sz w:val="18"/>
               </w:rPr>
-              <w:t>Attachments bucket</w:t>
+              <w:t>Database storage</w:t>
             </w:r>
           </w:p>
         </w:tc>
@@ -4867,7 +5225,7 @@
               <w:rPr>
                 <w:sz w:val="18"/>
               </w:rPr>
-              <w:t>S3</w:t>
+              <w:t>RDS gp3 20 GB, encrypted</w:t>
             </w:r>
           </w:p>
         </w:tc>
@@ -4886,70 +5244,7 @@
               <w:rPr>
                 <w:sz w:val="18"/>
               </w:rPr>
-              <w:t>Course attachments + submissions; lifecycle to Glacier Deep Archive after 24 months</w:t>
-            </w:r>
-          </w:p>
-        </w:tc>
-      </w:tr>
-      <w:tr>
-        <w:trPr>
-          <w:jc w:val="center"/>
-        </w:trPr>
-        <w:tc>
-          <w:tcPr>
-            <w:tcW w:w="2268" w:type="dxa"/>
-            <w:tcBorders>
-              <w:top w:val="single" w:sz="4" w:space="0" w:color="E4DED3"/>
-              <w:left w:val="single" w:sz="4" w:space="0" w:color="E4DED3"/>
-              <w:bottom w:val="single" w:sz="4" w:space="0" w:color="E4DED3"/>
-              <w:right w:val="single" w:sz="4" w:space="0" w:color="E4DED3"/>
-            </w:tcBorders>
-          </w:tcPr>
-          <w:p>
-            <w:r>
-              <w:rPr>
-                <w:b/>
-                <w:sz w:val="18"/>
-              </w:rPr>
-              <w:t>Backups bucket</w:t>
-            </w:r>
-          </w:p>
-        </w:tc>
-        <w:tc>
-          <w:tcPr>
-            <w:tcW w:w="2551" w:type="dxa"/>
-            <w:tcBorders>
-              <w:top w:val="single" w:sz="4" w:space="0" w:color="E4DED3"/>
-              <w:left w:val="single" w:sz="4" w:space="0" w:color="E4DED3"/>
-              <w:bottom w:val="single" w:sz="4" w:space="0" w:color="E4DED3"/>
-              <w:right w:val="single" w:sz="4" w:space="0" w:color="E4DED3"/>
-            </w:tcBorders>
-          </w:tcPr>
-          <w:p>
-            <w:r>
-              <w:rPr>
-                <w:sz w:val="18"/>
-              </w:rPr>
-              <w:t>S3</w:t>
-            </w:r>
-          </w:p>
-        </w:tc>
-        <w:tc>
-          <w:tcPr>
-            <w:tcW w:w="4252" w:type="dxa"/>
-            <w:tcBorders>
-              <w:top w:val="single" w:sz="4" w:space="0" w:color="E4DED3"/>
-              <w:left w:val="single" w:sz="4" w:space="0" w:color="E4DED3"/>
-              <w:bottom w:val="single" w:sz="4" w:space="0" w:color="E4DED3"/>
-              <w:right w:val="single" w:sz="4" w:space="0" w:color="E4DED3"/>
-            </w:tcBorders>
-          </w:tcPr>
-          <w:p>
-            <w:r>
-              <w:rPr>
-                <w:sz w:val="18"/>
-              </w:rPr>
-              <w:t>Off-instance mysqldump exports, file snapshots</w:t>
+              <w:t>The MySQL data files</w:t>
             </w:r>
           </w:p>
         </w:tc>
@@ -4958,17 +5253,9 @@
     <w:p/>
     <w:p>
       <w:pPr>
-        <w:pStyle w:val="ListBullet"/>
-      </w:pPr>
-      <w:r>
-        <w:t>Both buckets: block all public access; SSE-S3 encryption; versioning enabled; access logging to a log bucket.</w:t>
-      </w:r>
-    </w:p>
-    <w:p>
-      <w:pPr>
         <w:pStyle w:val="Heading3"/>
       </w:pPr>
-      <w:bookmarkStart w:id="18" w:name="_Toc235021349"/>
+      <w:bookmarkStart w:id="18" w:name="_Toc238815544"/>
       <w:r>
         <w:t>4.9 Security</w:t>
       </w:r>
@@ -4981,9 +5268,9 @@
         <w:tblLook w:val="04A0" w:firstRow="1" w:lastRow="0" w:firstColumn="1" w:lastColumn="0" w:noHBand="0" w:noVBand="1"/>
       </w:tblPr>
       <w:tblGrid>
-        <w:gridCol w:w="1701"/>
-        <w:gridCol w:w="4252"/>
-        <w:gridCol w:w="3118"/>
+        <w:gridCol w:w="2041"/>
+        <w:gridCol w:w="4195"/>
+        <w:gridCol w:w="2835"/>
       </w:tblGrid>
       <w:tr>
         <w:trPr>
@@ -4991,7 +5278,7 @@
         </w:trPr>
         <w:tc>
           <w:tcPr>
-            <w:tcW w:w="1701" w:type="dxa"/>
+            <w:tcW w:w="2041" w:type="dxa"/>
             <w:tcBorders>
               <w:top w:val="single" w:sz="4" w:space="0" w:color="E4DED3"/>
               <w:left w:val="single" w:sz="4" w:space="0" w:color="E4DED3"/>
@@ -5013,7 +5300,7 @@
         </w:tc>
         <w:tc>
           <w:tcPr>
-            <w:tcW w:w="4252" w:type="dxa"/>
+            <w:tcW w:w="4195" w:type="dxa"/>
             <w:tcBorders>
               <w:top w:val="single" w:sz="4" w:space="0" w:color="E4DED3"/>
               <w:left w:val="single" w:sz="4" w:space="0" w:color="E4DED3"/>
@@ -5035,7 +5322,7 @@
         </w:tc>
         <w:tc>
           <w:tcPr>
-            <w:tcW w:w="3118" w:type="dxa"/>
+            <w:tcW w:w="2835" w:type="dxa"/>
             <w:tcBorders>
               <w:top w:val="single" w:sz="4" w:space="0" w:color="E4DED3"/>
               <w:left w:val="single" w:sz="4" w:space="0" w:color="E4DED3"/>
@@ -5062,7 +5349,7 @@
         </w:trPr>
         <w:tc>
           <w:tcPr>
-            <w:tcW w:w="1701" w:type="dxa"/>
+            <w:tcW w:w="2041" w:type="dxa"/>
             <w:tcBorders>
               <w:top w:val="single" w:sz="4" w:space="0" w:color="E4DED3"/>
               <w:left w:val="single" w:sz="4" w:space="0" w:color="E4DED3"/>
@@ -5076,13 +5363,13 @@
                 <w:b/>
                 <w:sz w:val="18"/>
               </w:rPr>
-              <w:t>sg-alb</w:t>
+              <w:t>yat-lms-alb-sg</w:t>
             </w:r>
           </w:p>
         </w:tc>
         <w:tc>
           <w:tcPr>
-            <w:tcW w:w="4252" w:type="dxa"/>
+            <w:tcW w:w="4195" w:type="dxa"/>
             <w:tcBorders>
               <w:top w:val="single" w:sz="4" w:space="0" w:color="E4DED3"/>
               <w:left w:val="single" w:sz="4" w:space="0" w:color="E4DED3"/>
@@ -5095,13 +5382,13 @@
               <w:rPr>
                 <w:sz w:val="18"/>
               </w:rPr>
-              <w:t>HTTPS:443 from 0.0.0.0/0</w:t>
+              <w:t>HTTP:80 from 0.0.0.0/0</w:t>
             </w:r>
           </w:p>
         </w:tc>
         <w:tc>
           <w:tcPr>
-            <w:tcW w:w="3118" w:type="dxa"/>
+            <w:tcW w:w="2835" w:type="dxa"/>
             <w:tcBorders>
               <w:top w:val="single" w:sz="4" w:space="0" w:color="E4DED3"/>
               <w:left w:val="single" w:sz="4" w:space="0" w:color="E4DED3"/>
@@ -5114,7 +5401,7 @@
               <w:rPr>
                 <w:sz w:val="18"/>
               </w:rPr>
-              <w:t>HTTP/HTTPS to sg-app</w:t>
+              <w:t>default allow-all</w:t>
             </w:r>
           </w:p>
         </w:tc>
@@ -5125,7 +5412,7 @@
         </w:trPr>
         <w:tc>
           <w:tcPr>
-            <w:tcW w:w="1701" w:type="dxa"/>
+            <w:tcW w:w="2041" w:type="dxa"/>
             <w:tcBorders>
               <w:top w:val="single" w:sz="4" w:space="0" w:color="E4DED3"/>
               <w:left w:val="single" w:sz="4" w:space="0" w:color="E4DED3"/>
@@ -5139,13 +5426,13 @@
                 <w:b/>
                 <w:sz w:val="18"/>
               </w:rPr>
-              <w:t>sg-app</w:t>
+              <w:t>yat-lms-app-sg</w:t>
             </w:r>
           </w:p>
         </w:tc>
         <w:tc>
           <w:tcPr>
-            <w:tcW w:w="4252" w:type="dxa"/>
+            <w:tcW w:w="4195" w:type="dxa"/>
             <w:tcBorders>
               <w:top w:val="single" w:sz="4" w:space="0" w:color="E4DED3"/>
               <w:left w:val="single" w:sz="4" w:space="0" w:color="E4DED3"/>
@@ -5158,13 +5445,13 @@
               <w:rPr>
                 <w:sz w:val="18"/>
               </w:rPr>
-              <w:t>from sg-alb; RDP:3389 from MTS bastion (design left to implementer)</w:t>
+              <w:t>HTTP:80 from yat-lms-alb-sg</w:t>
             </w:r>
           </w:p>
         </w:tc>
         <w:tc>
           <w:tcPr>
-            <w:tcW w:w="3118" w:type="dxa"/>
+            <w:tcW w:w="2835" w:type="dxa"/>
             <w:tcBorders>
               <w:top w:val="single" w:sz="4" w:space="0" w:color="E4DED3"/>
               <w:left w:val="single" w:sz="4" w:space="0" w:color="E4DED3"/>
@@ -5177,7 +5464,7 @@
               <w:rPr>
                 <w:sz w:val="18"/>
               </w:rPr>
-              <w:t>MySQL:3306 to sg-db; HTTPS via NAT; LDAP/LDAPS to campus AD</w:t>
+              <w:t>default allow-all</w:t>
             </w:r>
           </w:p>
         </w:tc>
@@ -5188,7 +5475,7 @@
         </w:trPr>
         <w:tc>
           <w:tcPr>
-            <w:tcW w:w="1701" w:type="dxa"/>
+            <w:tcW w:w="2041" w:type="dxa"/>
             <w:tcBorders>
               <w:top w:val="single" w:sz="4" w:space="0" w:color="E4DED3"/>
               <w:left w:val="single" w:sz="4" w:space="0" w:color="E4DED3"/>
@@ -5202,13 +5489,14 @@
                 <w:b/>
                 <w:sz w:val="18"/>
               </w:rPr>
-              <w:t>sg-db</w:t>
+              <w:lastRenderedPageBreak/>
+              <w:t>yat-lms-db-sg</w:t>
             </w:r>
           </w:p>
         </w:tc>
         <w:tc>
           <w:tcPr>
-            <w:tcW w:w="4252" w:type="dxa"/>
+            <w:tcW w:w="4195" w:type="dxa"/>
             <w:tcBorders>
               <w:top w:val="single" w:sz="4" w:space="0" w:color="E4DED3"/>
               <w:left w:val="single" w:sz="4" w:space="0" w:color="E4DED3"/>
@@ -5221,13 +5509,13 @@
               <w:rPr>
                 <w:sz w:val="18"/>
               </w:rPr>
-              <w:t>MySQL:3306 from sg-app only</w:t>
+              <w:t>MySQL:3306 from yat-lms-app-sg only</w:t>
             </w:r>
           </w:p>
         </w:tc>
         <w:tc>
           <w:tcPr>
-            <w:tcW w:w="3118" w:type="dxa"/>
+            <w:tcW w:w="2835" w:type="dxa"/>
             <w:tcBorders>
               <w:top w:val="single" w:sz="4" w:space="0" w:color="E4DED3"/>
               <w:left w:val="single" w:sz="4" w:space="0" w:color="E4DED3"/>
@@ -5240,7 +5528,7 @@
               <w:rPr>
                 <w:sz w:val="18"/>
               </w:rPr>
-              <w:t>none</w:t>
+              <w:t>default allow-all</w:t>
             </w:r>
           </w:p>
         </w:tc>
@@ -5252,7 +5540,7 @@
         <w:pStyle w:val="ListBullet"/>
       </w:pPr>
       <w:r>
-        <w:t>Encryption in transit: HTTPS ALB→EC2; TLS EC2→RDS; AWS calls over TLS via VPC endpoints where available.</w:t>
+        <w:t>Each rule names a security group as its source rather than an address range, so the rule follows the instances however many the Auto Scaling group launches and whatever addresses they get.</w:t>
       </w:r>
     </w:p>
     <w:p>
@@ -5260,7 +5548,15 @@
         <w:pStyle w:val="ListBullet"/>
       </w:pPr>
       <w:r>
-        <w:t>Encryption at rest: EBS, RDS, and S3 (SSE-S3) all enabled.</w:t>
+        <w:t>Administrative access to instances is by Session Manager: no key pair, no open management port, no public IP address and no bastion host.</w:t>
+      </w:r>
+    </w:p>
+    <w:p>
+      <w:pPr>
+        <w:pStyle w:val="ListBullet"/>
+      </w:pPr>
+      <w:r>
+        <w:t>Encryption at rest: EBS and RDS both enabled.</w:t>
       </w:r>
     </w:p>
     <w:p>
@@ -5275,7 +5571,7 @@
       <w:pPr>
         <w:pStyle w:val="Heading3"/>
       </w:pPr>
-      <w:bookmarkStart w:id="19" w:name="_Toc235021350"/>
+      <w:bookmarkStart w:id="19" w:name="_Toc238815545"/>
       <w:r>
         <w:t>4.10 Monitoring (baseline)</w:t>
       </w:r>
@@ -5283,7 +5579,7 @@
     </w:p>
     <w:p>
       <w:r>
-        <w:t>Standard CloudWatch metrics for EC2, RDS, ALB and Auto Scaling. Baseline alarms (HA-tuned alarms come in the follow-on HA design):</w:t>
+        <w:t>Standard CloudWatch metrics for EC2, RDS, ALB and Auto Scaling. Two baseline alarms — one for the application tier, one for the database tier — establish availability monitoring for the platform. The Auto Scaling policy tracks CPU and creates its own alarms, so no separate CPU alarm is required. HA-tuned alarms come in the follow-on HA design:</w:t>
       </w:r>
     </w:p>
     <w:tbl>
@@ -5293,8 +5589,9 @@
         <w:tblLook w:val="04A0" w:firstRow="1" w:lastRow="0" w:firstColumn="1" w:lastColumn="0" w:noHBand="0" w:noVBand="1"/>
       </w:tblPr>
       <w:tblGrid>
-        <w:gridCol w:w="4535"/>
-        <w:gridCol w:w="4535"/>
+        <w:gridCol w:w="2608"/>
+        <w:gridCol w:w="3061"/>
+        <w:gridCol w:w="3402"/>
       </w:tblGrid>
       <w:tr>
         <w:trPr>
@@ -5302,7 +5599,7 @@
         </w:trPr>
         <w:tc>
           <w:tcPr>
-            <w:tcW w:w="4535" w:type="dxa"/>
+            <w:tcW w:w="2608" w:type="dxa"/>
             <w:tcBorders>
               <w:top w:val="single" w:sz="4" w:space="0" w:color="E4DED3"/>
               <w:left w:val="single" w:sz="4" w:space="0" w:color="E4DED3"/>
@@ -5318,14 +5615,35 @@
                 <w:color w:val="FFFFFF"/>
                 <w:sz w:val="18"/>
               </w:rPr>
-              <w:lastRenderedPageBreak/>
               <w:t>Alarm</w:t>
             </w:r>
           </w:p>
         </w:tc>
         <w:tc>
           <w:tcPr>
-            <w:tcW w:w="4535" w:type="dxa"/>
+            <w:tcW w:w="3061" w:type="dxa"/>
+            <w:tcBorders>
+              <w:top w:val="single" w:sz="4" w:space="0" w:color="E4DED3"/>
+              <w:left w:val="single" w:sz="4" w:space="0" w:color="E4DED3"/>
+              <w:bottom w:val="single" w:sz="4" w:space="0" w:color="E4DED3"/>
+              <w:right w:val="single" w:sz="4" w:space="0" w:color="E4DED3"/>
+            </w:tcBorders>
+            <w:shd w:val="clear" w:color="auto" w:fill="1F5A5C"/>
+          </w:tcPr>
+          <w:p>
+            <w:r>
+              <w:rPr>
+                <w:b/>
+                <w:color w:val="FFFFFF"/>
+                <w:sz w:val="18"/>
+              </w:rPr>
+              <w:t>Metric</w:t>
+            </w:r>
+          </w:p>
+        </w:tc>
+        <w:tc>
+          <w:tcPr>
+            <w:tcW w:w="3402" w:type="dxa"/>
             <w:tcBorders>
               <w:top w:val="single" w:sz="4" w:space="0" w:color="E4DED3"/>
               <w:left w:val="single" w:sz="4" w:space="0" w:color="E4DED3"/>
@@ -5352,7 +5670,7 @@
         </w:trPr>
         <w:tc>
           <w:tcPr>
-            <w:tcW w:w="4535" w:type="dxa"/>
+            <w:tcW w:w="2608" w:type="dxa"/>
             <w:tcBorders>
               <w:top w:val="single" w:sz="4" w:space="0" w:color="E4DED3"/>
               <w:left w:val="single" w:sz="4" w:space="0" w:color="E4DED3"/>
@@ -5366,13 +5684,13 @@
                 <w:b/>
                 <w:sz w:val="18"/>
               </w:rPr>
-              <w:t>EC2 CPU high</w:t>
+              <w:t>yat-lms-unhealthy-hosts</w:t>
             </w:r>
           </w:p>
         </w:tc>
         <w:tc>
           <w:tcPr>
-            <w:tcW w:w="4535" w:type="dxa"/>
+            <w:tcW w:w="3061" w:type="dxa"/>
             <w:tcBorders>
               <w:top w:val="single" w:sz="4" w:space="0" w:color="E4DED3"/>
               <w:left w:val="single" w:sz="4" w:space="0" w:color="E4DED3"/>
@@ -5385,7 +5703,26 @@
               <w:rPr>
                 <w:sz w:val="18"/>
               </w:rPr>
-              <w:t>≥ 80% over 10 min</w:t>
+              <w:t>UnHealthyHostCount, per load balancer per target group</w:t>
+            </w:r>
+          </w:p>
+        </w:tc>
+        <w:tc>
+          <w:tcPr>
+            <w:tcW w:w="3402" w:type="dxa"/>
+            <w:tcBorders>
+              <w:top w:val="single" w:sz="4" w:space="0" w:color="E4DED3"/>
+              <w:left w:val="single" w:sz="4" w:space="0" w:color="E4DED3"/>
+              <w:bottom w:val="single" w:sz="4" w:space="0" w:color="E4DED3"/>
+              <w:right w:val="single" w:sz="4" w:space="0" w:color="E4DED3"/>
+            </w:tcBorders>
+          </w:tcPr>
+          <w:p>
+            <w:r>
+              <w:rPr>
+                <w:sz w:val="18"/>
+              </w:rPr>
+              <w:t>Maximum ≥ 1 over 1 minute — any target has failed its health check</w:t>
             </w:r>
           </w:p>
         </w:tc>
@@ -5396,7 +5733,7 @@
         </w:trPr>
         <w:tc>
           <w:tcPr>
-            <w:tcW w:w="4535" w:type="dxa"/>
+            <w:tcW w:w="2608" w:type="dxa"/>
             <w:tcBorders>
               <w:top w:val="single" w:sz="4" w:space="0" w:color="E4DED3"/>
               <w:left w:val="single" w:sz="4" w:space="0" w:color="E4DED3"/>
@@ -5410,13 +5747,13 @@
                 <w:b/>
                 <w:sz w:val="18"/>
               </w:rPr>
-              <w:t>RDS CPU high</w:t>
+              <w:t>yat-lms-db-storage-low</w:t>
             </w:r>
           </w:p>
         </w:tc>
         <w:tc>
           <w:tcPr>
-            <w:tcW w:w="4535" w:type="dxa"/>
+            <w:tcW w:w="3061" w:type="dxa"/>
             <w:tcBorders>
               <w:top w:val="single" w:sz="4" w:space="0" w:color="E4DED3"/>
               <w:left w:val="single" w:sz="4" w:space="0" w:color="E4DED3"/>
@@ -5429,85 +5766,13 @@
               <w:rPr>
                 <w:sz w:val="18"/>
               </w:rPr>
-              <w:t>≥ 80% over 10 min</w:t>
-            </w:r>
-          </w:p>
-        </w:tc>
-      </w:tr>
-      <w:tr>
-        <w:trPr>
-          <w:jc w:val="center"/>
-        </w:trPr>
-        <w:tc>
-          <w:tcPr>
-            <w:tcW w:w="4535" w:type="dxa"/>
-            <w:tcBorders>
-              <w:top w:val="single" w:sz="4" w:space="0" w:color="E4DED3"/>
-              <w:left w:val="single" w:sz="4" w:space="0" w:color="E4DED3"/>
-              <w:bottom w:val="single" w:sz="4" w:space="0" w:color="E4DED3"/>
-              <w:right w:val="single" w:sz="4" w:space="0" w:color="E4DED3"/>
-            </w:tcBorders>
-          </w:tcPr>
-          <w:p>
-            <w:r>
-              <w:rPr>
-                <w:b/>
-                <w:sz w:val="18"/>
-              </w:rPr>
-              <w:t>RDS free storage low</w:t>
+              <w:t>FreeStorageSpace on the database instance</w:t>
             </w:r>
           </w:p>
         </w:tc>
         <w:tc>
           <w:tcPr>
-            <w:tcW w:w="4535" w:type="dxa"/>
-            <w:tcBorders>
-              <w:top w:val="single" w:sz="4" w:space="0" w:color="E4DED3"/>
-              <w:left w:val="single" w:sz="4" w:space="0" w:color="E4DED3"/>
-              <w:bottom w:val="single" w:sz="4" w:space="0" w:color="E4DED3"/>
-              <w:right w:val="single" w:sz="4" w:space="0" w:color="E4DED3"/>
-            </w:tcBorders>
-          </w:tcPr>
-          <w:p>
-            <w:pPr>
-              <w:jc w:val="right"/>
-            </w:pPr>
-            <w:r>
-              <w:rPr>
-                <w:sz w:val="18"/>
-              </w:rPr>
-              <w:t>&lt; 15%</w:t>
-            </w:r>
-          </w:p>
-        </w:tc>
-      </w:tr>
-      <w:tr>
-        <w:trPr>
-          <w:jc w:val="center"/>
-        </w:trPr>
-        <w:tc>
-          <w:tcPr>
-            <w:tcW w:w="4535" w:type="dxa"/>
-            <w:tcBorders>
-              <w:top w:val="single" w:sz="4" w:space="0" w:color="E4DED3"/>
-              <w:left w:val="single" w:sz="4" w:space="0" w:color="E4DED3"/>
-              <w:bottom w:val="single" w:sz="4" w:space="0" w:color="E4DED3"/>
-              <w:right w:val="single" w:sz="4" w:space="0" w:color="E4DED3"/>
-            </w:tcBorders>
-          </w:tcPr>
-          <w:p>
-            <w:r>
-              <w:rPr>
-                <w:b/>
-                <w:sz w:val="18"/>
-              </w:rPr>
-              <w:t>ALB 5XX</w:t>
-            </w:r>
-          </w:p>
-        </w:tc>
-        <w:tc>
-          <w:tcPr>
-            <w:tcW w:w="4535" w:type="dxa"/>
+            <w:tcW w:w="3402" w:type="dxa"/>
             <w:tcBorders>
               <w:top w:val="single" w:sz="4" w:space="0" w:color="E4DED3"/>
               <w:left w:val="single" w:sz="4" w:space="0" w:color="E4DED3"/>
@@ -5520,51 +5785,7 @@
               <w:rPr>
                 <w:sz w:val="18"/>
               </w:rPr>
-              <w:t>&gt; 10 / min</w:t>
-            </w:r>
-          </w:p>
-        </w:tc>
-      </w:tr>
-      <w:tr>
-        <w:trPr>
-          <w:jc w:val="center"/>
-        </w:trPr>
-        <w:tc>
-          <w:tcPr>
-            <w:tcW w:w="4535" w:type="dxa"/>
-            <w:tcBorders>
-              <w:top w:val="single" w:sz="4" w:space="0" w:color="E4DED3"/>
-              <w:left w:val="single" w:sz="4" w:space="0" w:color="E4DED3"/>
-              <w:bottom w:val="single" w:sz="4" w:space="0" w:color="E4DED3"/>
-              <w:right w:val="single" w:sz="4" w:space="0" w:color="E4DED3"/>
-            </w:tcBorders>
-          </w:tcPr>
-          <w:p>
-            <w:r>
-              <w:rPr>
-                <w:b/>
-                <w:sz w:val="18"/>
-              </w:rPr>
-              <w:t>RDS connections high</w:t>
-            </w:r>
-          </w:p>
-        </w:tc>
-        <w:tc>
-          <w:tcPr>
-            <w:tcW w:w="4535" w:type="dxa"/>
-            <w:tcBorders>
-              <w:top w:val="single" w:sz="4" w:space="0" w:color="E4DED3"/>
-              <w:left w:val="single" w:sz="4" w:space="0" w:color="E4DED3"/>
-              <w:bottom w:val="single" w:sz="4" w:space="0" w:color="E4DED3"/>
-              <w:right w:val="single" w:sz="4" w:space="0" w:color="E4DED3"/>
-            </w:tcBorders>
-          </w:tcPr>
-          <w:p>
-            <w:r>
-              <w:rPr>
-                <w:sz w:val="18"/>
-              </w:rPr>
-              <w:t>&gt; 80% of max_connections</w:t>
+              <w:t>Minimum below 15% of allocated storage, over two 5-minute periods</w:t>
             </w:r>
           </w:p>
         </w:tc>
@@ -5576,14 +5797,22 @@
         <w:pStyle w:val="ListBullet"/>
       </w:pPr>
       <w:r>
-        <w:t>Logging: VPC flow logs and RDS logs → CloudWatch Logs (90-day retention); ALB access logs → S3; EC2 OS logs via the CloudWatch Agent.</w:t>
+        <w:t>Both alarms notify an SNS topic, yat-lms-alerts.</w:t>
       </w:r>
     </w:p>
     <w:p>
       <w:pPr>
+        <w:pStyle w:val="ListBullet"/>
+      </w:pPr>
+      <w:r>
+        <w:t>The storage alarm's threshold is entered in bytes and is a percentage of the storage allocated at build time; its description records the allocated size, because the number alone does not tell anyone whether it is still correct after the storage is resized.</w:t>
+      </w:r>
+    </w:p>
+    <w:p>
+      <w:pPr>
         <w:pStyle w:val="Heading3"/>
       </w:pPr>
-      <w:bookmarkStart w:id="20" w:name="_Toc235021351"/>
+      <w:bookmarkStart w:id="20" w:name="_Toc238815546"/>
       <w:r>
         <w:t>4.11 Naming and tagging conventions</w:t>
       </w:r>
@@ -5591,7 +5820,7 @@
     </w:p>
     <w:p>
       <w:r>
-        <w:t>Naming pattern yat-lms-&lt;resource-type&gt;-&lt;env&gt;-&lt;az-or-purpose&gt; (e.g. yat-lms-alb-prod). Mandatory tags:</w:t>
+        <w:t>Naming pattern yat-lms-&lt;resource-type&gt; — yat-lms-vpc, yat-lms-alb, yat-lms-tg, yat-lms-lt, yat-lms-db. Subnets are named for their tier and zone: public-web-a, public-web-b, private-app-a, private-data-a, private-data-b. Mandatory tags:</w:t>
       </w:r>
     </w:p>
     <w:tbl>
@@ -5923,7 +6152,7 @@
       <w:pPr>
         <w:pStyle w:val="Heading3"/>
       </w:pPr>
-      <w:bookmarkStart w:id="21" w:name="_Toc235021352"/>
+      <w:bookmarkStart w:id="21" w:name="_Toc238815547"/>
       <w:r>
         <w:t>4.12 Backup</w:t>
       </w:r>
@@ -6113,7 +6342,14 @@
               <w:rPr>
                 <w:sz w:val="18"/>
               </w:rPr>
-              <w:t>Daily AMI snapshot (Data Lifecycle Manager)</w:t>
+              <w:t xml:space="preserve">None — the servers hold no state worth recovering. They are rebuilt from the launch template, not </w:t>
+            </w:r>
+            <w:r>
+              <w:rPr>
+                <w:sz w:val="18"/>
+              </w:rPr>
+              <w:lastRenderedPageBreak/>
+              <w:t>restored</w:t>
             </w:r>
           </w:p>
         </w:tc>
@@ -6132,70 +6368,8 @@
               <w:rPr>
                 <w:sz w:val="18"/>
               </w:rPr>
-              <w:t>14 days</w:t>
-            </w:r>
-          </w:p>
-        </w:tc>
-      </w:tr>
-      <w:tr>
-        <w:trPr>
-          <w:jc w:val="center"/>
-        </w:trPr>
-        <w:tc>
-          <w:tcPr>
-            <w:tcW w:w="2551" w:type="dxa"/>
-            <w:tcBorders>
-              <w:top w:val="single" w:sz="4" w:space="0" w:color="E4DED3"/>
-              <w:left w:val="single" w:sz="4" w:space="0" w:color="E4DED3"/>
-              <w:bottom w:val="single" w:sz="4" w:space="0" w:color="E4DED3"/>
-              <w:right w:val="single" w:sz="4" w:space="0" w:color="E4DED3"/>
-            </w:tcBorders>
-          </w:tcPr>
-          <w:p>
-            <w:r>
-              <w:rPr>
-                <w:b/>
-                <w:sz w:val="18"/>
-              </w:rPr>
-              <w:t>LMS attachments (S3)</w:t>
-            </w:r>
-          </w:p>
-        </w:tc>
-        <w:tc>
-          <w:tcPr>
-            <w:tcW w:w="4252" w:type="dxa"/>
-            <w:tcBorders>
-              <w:top w:val="single" w:sz="4" w:space="0" w:color="E4DED3"/>
-              <w:left w:val="single" w:sz="4" w:space="0" w:color="E4DED3"/>
-              <w:bottom w:val="single" w:sz="4" w:space="0" w:color="E4DED3"/>
-              <w:right w:val="single" w:sz="4" w:space="0" w:color="E4DED3"/>
-            </w:tcBorders>
-          </w:tcPr>
-          <w:p>
-            <w:r>
-              <w:rPr>
-                <w:sz w:val="18"/>
-              </w:rPr>
-              <w:t>Versioning + lifecycle to Glacier Deep Archive</w:t>
-            </w:r>
-          </w:p>
-        </w:tc>
-        <w:tc>
-          <w:tcPr>
-            <w:tcW w:w="2268" w:type="dxa"/>
-            <w:tcBorders>
-              <w:top w:val="single" w:sz="4" w:space="0" w:color="E4DED3"/>
-              <w:left w:val="single" w:sz="4" w:space="0" w:color="E4DED3"/>
-              <w:bottom w:val="single" w:sz="4" w:space="0" w:color="E4DED3"/>
-              <w:right w:val="single" w:sz="4" w:space="0" w:color="E4DED3"/>
-            </w:tcBorders>
-          </w:tcPr>
-          <w:p>
-            <w:r>
-              <w:rPr>
-                <w:sz w:val="18"/>
-              </w:rPr>
-              <w:t>Versioned; archive after 24 months</w:t>
+              <w:lastRenderedPageBreak/>
+              <w:t>n/a</w:t>
             </w:r>
           </w:p>
         </w:tc>
@@ -6214,7 +6388,7 @@
       <w:pPr>
         <w:pStyle w:val="Heading3"/>
       </w:pPr>
-      <w:bookmarkStart w:id="22" w:name="_Toc235021353"/>
+      <w:bookmarkStart w:id="22" w:name="_Toc238815548"/>
       <w:r>
         <w:t>4.13 Recovery objectives — baseline state</w:t>
       </w:r>
@@ -6222,14 +6396,14 @@
     </w:p>
     <w:p>
       <w:r>
-        <w:t>The baseline's recovery posture is backup-based: RPO is up to the last automated backup (daily) and RTO is restore-based (single-AZ restore). The HA targets (99.9% availability, RPO ≤ 1 h, RTO ≤ 4 h) are deliberately not met by this baseline and are the objective of the follow-on HA design.</w:t>
+        <w:t>The baseline's recovery posture is backup-based: RPO is up to the last automated backup (daily, within a 7-day retention window) and RTO is restore-based, on a single instance with no standby. The HA targets (99.9% availability, RPO ≤ 1 h, RTO ≤ 4 h) are deliberately not met by this baseline and are the objective of the follow-on HA design.</w:t>
       </w:r>
     </w:p>
     <w:p>
       <w:pPr>
         <w:pStyle w:val="Heading3"/>
       </w:pPr>
-      <w:bookmarkStart w:id="23" w:name="_Toc235021354"/>
+      <w:bookmarkStart w:id="23" w:name="_Toc238815549"/>
       <w:r>
         <w:t>4.14 Components requiring vertical scaling</w:t>
       </w:r>
@@ -6244,7 +6418,7 @@
       <w:pPr>
         <w:pStyle w:val="Heading3"/>
       </w:pPr>
-      <w:bookmarkStart w:id="24" w:name="_Toc235021355"/>
+      <w:bookmarkStart w:id="24" w:name="_Toc238815550"/>
       <w:r>
         <w:t>4.15 Single points of failure removed</w:t>
       </w:r>
@@ -6263,16 +6437,15 @@
       <w:pPr>
         <w:pStyle w:val="Heading3"/>
       </w:pPr>
-      <w:bookmarkStart w:id="25" w:name="_Toc235021356"/>
+      <w:bookmarkStart w:id="25" w:name="_Toc238815551"/>
       <w:r>
-        <w:lastRenderedPageBreak/>
         <w:t>4.16 Configuration decisions left to the implementer</w:t>
       </w:r>
       <w:bookmarkEnd w:id="25"/>
     </w:p>
     <w:p>
       <w:r>
-        <w:t>The design is opinionated where it matters and silent where the implementer must show judgement. Each decision below is to be made and evidenced in the Deployment Report.</w:t>
+        <w:t>The design is opinionated where it matters and silent where the implementer must show judgement. Two sizing decisions are left open. For each, consider at least two candidates, choose one, and record the choice and the reason in the build run sheet.</w:t>
       </w:r>
     </w:p>
     <w:tbl>
@@ -6396,7 +6569,7 @@
               <w:rPr>
                 <w:sz w:val="18"/>
               </w:rPr>
-              <w:t>EC2 instance type (general-purpose family)</w:t>
+              <w:t>Application-tier instance type (general-purpose family)</w:t>
             </w:r>
           </w:p>
         </w:tc>
@@ -6415,7 +6588,7 @@
               <w:rPr>
                 <w:sz w:val="18"/>
               </w:rPr>
-              <w:t>Size against the LMS workload</w:t>
+              <w:t>Size against the LMS concurrent-user load</w:t>
             </w:r>
           </w:p>
         </w:tc>
@@ -6459,7 +6632,7 @@
               <w:rPr>
                 <w:sz w:val="18"/>
               </w:rPr>
-              <w:t>RDS instance class (general-purpose family)</w:t>
+              <w:t>Database instance class and storage size (general-purpose family)</w:t>
             </w:r>
           </w:p>
         </w:tc>
@@ -6478,385 +6651,7 @@
               <w:rPr>
                 <w:sz w:val="18"/>
               </w:rPr>
-              <w:t>Size against the workload</w:t>
-            </w:r>
-          </w:p>
-        </w:tc>
-      </w:tr>
-      <w:tr>
-        <w:trPr>
-          <w:jc w:val="center"/>
-        </w:trPr>
-        <w:tc>
-          <w:tcPr>
-            <w:tcW w:w="567" w:type="dxa"/>
-            <w:tcBorders>
-              <w:top w:val="single" w:sz="4" w:space="0" w:color="E4DED3"/>
-              <w:left w:val="single" w:sz="4" w:space="0" w:color="E4DED3"/>
-              <w:bottom w:val="single" w:sz="4" w:space="0" w:color="E4DED3"/>
-              <w:right w:val="single" w:sz="4" w:space="0" w:color="E4DED3"/>
-            </w:tcBorders>
-          </w:tcPr>
-          <w:p>
-            <w:r>
-              <w:rPr>
-                <w:b/>
-                <w:sz w:val="18"/>
-              </w:rPr>
-              <w:t>C3</w:t>
-            </w:r>
-          </w:p>
-        </w:tc>
-        <w:tc>
-          <w:tcPr>
-            <w:tcW w:w="3969" w:type="dxa"/>
-            <w:tcBorders>
-              <w:top w:val="single" w:sz="4" w:space="0" w:color="E4DED3"/>
-              <w:left w:val="single" w:sz="4" w:space="0" w:color="E4DED3"/>
-              <w:bottom w:val="single" w:sz="4" w:space="0" w:color="E4DED3"/>
-              <w:right w:val="single" w:sz="4" w:space="0" w:color="E4DED3"/>
-            </w:tcBorders>
-          </w:tcPr>
-          <w:p>
-            <w:r>
-              <w:rPr>
-                <w:sz w:val="18"/>
-              </w:rPr>
-              <w:t>EBS data volume + RDS storage size</w:t>
-            </w:r>
-          </w:p>
-        </w:tc>
-        <w:tc>
-          <w:tcPr>
-            <w:tcW w:w="4535" w:type="dxa"/>
-            <w:tcBorders>
-              <w:top w:val="single" w:sz="4" w:space="0" w:color="E4DED3"/>
-              <w:left w:val="single" w:sz="4" w:space="0" w:color="E4DED3"/>
-              <w:bottom w:val="single" w:sz="4" w:space="0" w:color="E4DED3"/>
-              <w:right w:val="single" w:sz="4" w:space="0" w:color="E4DED3"/>
-            </w:tcBorders>
-          </w:tcPr>
-          <w:p>
-            <w:r>
-              <w:rPr>
-                <w:sz w:val="18"/>
-              </w:rPr>
-              <w:t>Compute from data footprint + growth</w:t>
-            </w:r>
-          </w:p>
-        </w:tc>
-      </w:tr>
-      <w:tr>
-        <w:trPr>
-          <w:jc w:val="center"/>
-        </w:trPr>
-        <w:tc>
-          <w:tcPr>
-            <w:tcW w:w="567" w:type="dxa"/>
-            <w:tcBorders>
-              <w:top w:val="single" w:sz="4" w:space="0" w:color="E4DED3"/>
-              <w:left w:val="single" w:sz="4" w:space="0" w:color="E4DED3"/>
-              <w:bottom w:val="single" w:sz="4" w:space="0" w:color="E4DED3"/>
-              <w:right w:val="single" w:sz="4" w:space="0" w:color="E4DED3"/>
-            </w:tcBorders>
-          </w:tcPr>
-          <w:p>
-            <w:r>
-              <w:rPr>
-                <w:b/>
-                <w:sz w:val="18"/>
-              </w:rPr>
-              <w:t>C4</w:t>
-            </w:r>
-          </w:p>
-        </w:tc>
-        <w:tc>
-          <w:tcPr>
-            <w:tcW w:w="3969" w:type="dxa"/>
-            <w:tcBorders>
-              <w:top w:val="single" w:sz="4" w:space="0" w:color="E4DED3"/>
-              <w:left w:val="single" w:sz="4" w:space="0" w:color="E4DED3"/>
-              <w:bottom w:val="single" w:sz="4" w:space="0" w:color="E4DED3"/>
-              <w:right w:val="single" w:sz="4" w:space="0" w:color="E4DED3"/>
-            </w:tcBorders>
-          </w:tcPr>
-          <w:p>
-            <w:r>
-              <w:rPr>
-                <w:sz w:val="18"/>
-              </w:rPr>
-              <w:t>ASG scaling threshold</w:t>
-            </w:r>
-          </w:p>
-        </w:tc>
-        <w:tc>
-          <w:tcPr>
-            <w:tcW w:w="4535" w:type="dxa"/>
-            <w:tcBorders>
-              <w:top w:val="single" w:sz="4" w:space="0" w:color="E4DED3"/>
-              <w:left w:val="single" w:sz="4" w:space="0" w:color="E4DED3"/>
-              <w:bottom w:val="single" w:sz="4" w:space="0" w:color="E4DED3"/>
-              <w:right w:val="single" w:sz="4" w:space="0" w:color="E4DED3"/>
-            </w:tcBorders>
-          </w:tcPr>
-          <w:p>
-            <w:r>
-              <w:rPr>
-                <w:sz w:val="18"/>
-              </w:rPr>
-              <w:t>Rationalise against the expected CPU profile</w:t>
-            </w:r>
-          </w:p>
-        </w:tc>
-      </w:tr>
-      <w:tr>
-        <w:trPr>
-          <w:jc w:val="center"/>
-        </w:trPr>
-        <w:tc>
-          <w:tcPr>
-            <w:tcW w:w="567" w:type="dxa"/>
-            <w:tcBorders>
-              <w:top w:val="single" w:sz="4" w:space="0" w:color="E4DED3"/>
-              <w:left w:val="single" w:sz="4" w:space="0" w:color="E4DED3"/>
-              <w:bottom w:val="single" w:sz="4" w:space="0" w:color="E4DED3"/>
-              <w:right w:val="single" w:sz="4" w:space="0" w:color="E4DED3"/>
-            </w:tcBorders>
-          </w:tcPr>
-          <w:p>
-            <w:r>
-              <w:rPr>
-                <w:b/>
-                <w:sz w:val="18"/>
-              </w:rPr>
-              <w:t>C5</w:t>
-            </w:r>
-          </w:p>
-        </w:tc>
-        <w:tc>
-          <w:tcPr>
-            <w:tcW w:w="3969" w:type="dxa"/>
-            <w:tcBorders>
-              <w:top w:val="single" w:sz="4" w:space="0" w:color="E4DED3"/>
-              <w:left w:val="single" w:sz="4" w:space="0" w:color="E4DED3"/>
-              <w:bottom w:val="single" w:sz="4" w:space="0" w:color="E4DED3"/>
-              <w:right w:val="single" w:sz="4" w:space="0" w:color="E4DED3"/>
-            </w:tcBorders>
-          </w:tcPr>
-          <w:p>
-            <w:r>
-              <w:rPr>
-                <w:sz w:val="18"/>
-              </w:rPr>
-              <w:t>MTS-Consultants permission boundary</w:t>
-            </w:r>
-          </w:p>
-        </w:tc>
-        <w:tc>
-          <w:tcPr>
-            <w:tcW w:w="4535" w:type="dxa"/>
-            <w:tcBorders>
-              <w:top w:val="single" w:sz="4" w:space="0" w:color="E4DED3"/>
-              <w:left w:val="single" w:sz="4" w:space="0" w:color="E4DED3"/>
-              <w:bottom w:val="single" w:sz="4" w:space="0" w:color="E4DED3"/>
-              <w:right w:val="single" w:sz="4" w:space="0" w:color="E4DED3"/>
-            </w:tcBorders>
-          </w:tcPr>
-          <w:p>
-            <w:r>
-              <w:rPr>
-                <w:sz w:val="18"/>
-              </w:rPr>
-              <w:t>Adapt to the lab access scope</w:t>
-            </w:r>
-          </w:p>
-        </w:tc>
-      </w:tr>
-      <w:tr>
-        <w:trPr>
-          <w:jc w:val="center"/>
-        </w:trPr>
-        <w:tc>
-          <w:tcPr>
-            <w:tcW w:w="567" w:type="dxa"/>
-            <w:tcBorders>
-              <w:top w:val="single" w:sz="4" w:space="0" w:color="E4DED3"/>
-              <w:left w:val="single" w:sz="4" w:space="0" w:color="E4DED3"/>
-              <w:bottom w:val="single" w:sz="4" w:space="0" w:color="E4DED3"/>
-              <w:right w:val="single" w:sz="4" w:space="0" w:color="E4DED3"/>
-            </w:tcBorders>
-          </w:tcPr>
-          <w:p>
-            <w:r>
-              <w:rPr>
-                <w:b/>
-                <w:sz w:val="18"/>
-              </w:rPr>
-              <w:t>C6</w:t>
-            </w:r>
-          </w:p>
-        </w:tc>
-        <w:tc>
-          <w:tcPr>
-            <w:tcW w:w="3969" w:type="dxa"/>
-            <w:tcBorders>
-              <w:top w:val="single" w:sz="4" w:space="0" w:color="E4DED3"/>
-              <w:left w:val="single" w:sz="4" w:space="0" w:color="E4DED3"/>
-              <w:bottom w:val="single" w:sz="4" w:space="0" w:color="E4DED3"/>
-              <w:right w:val="single" w:sz="4" w:space="0" w:color="E4DED3"/>
-            </w:tcBorders>
-          </w:tcPr>
-          <w:p>
-            <w:r>
-              <w:rPr>
-                <w:sz w:val="18"/>
-              </w:rPr>
-              <w:t>Bastion / jump-host design for RDP</w:t>
-            </w:r>
-          </w:p>
-        </w:tc>
-        <w:tc>
-          <w:tcPr>
-            <w:tcW w:w="4535" w:type="dxa"/>
-            <w:tcBorders>
-              <w:top w:val="single" w:sz="4" w:space="0" w:color="E4DED3"/>
-              <w:left w:val="single" w:sz="4" w:space="0" w:color="E4DED3"/>
-              <w:bottom w:val="single" w:sz="4" w:space="0" w:color="E4DED3"/>
-              <w:right w:val="single" w:sz="4" w:space="0" w:color="E4DED3"/>
-            </w:tcBorders>
-          </w:tcPr>
-          <w:p>
-            <w:r>
-              <w:rPr>
-                <w:sz w:val="18"/>
-              </w:rPr>
-              <w:t>Left to the implementer</w:t>
-            </w:r>
-          </w:p>
-        </w:tc>
-      </w:tr>
-      <w:tr>
-        <w:trPr>
-          <w:jc w:val="center"/>
-        </w:trPr>
-        <w:tc>
-          <w:tcPr>
-            <w:tcW w:w="567" w:type="dxa"/>
-            <w:tcBorders>
-              <w:top w:val="single" w:sz="4" w:space="0" w:color="E4DED3"/>
-              <w:left w:val="single" w:sz="4" w:space="0" w:color="E4DED3"/>
-              <w:bottom w:val="single" w:sz="4" w:space="0" w:color="E4DED3"/>
-              <w:right w:val="single" w:sz="4" w:space="0" w:color="E4DED3"/>
-            </w:tcBorders>
-          </w:tcPr>
-          <w:p>
-            <w:r>
-              <w:rPr>
-                <w:b/>
-                <w:sz w:val="18"/>
-              </w:rPr>
-              <w:t>C7</w:t>
-            </w:r>
-          </w:p>
-        </w:tc>
-        <w:tc>
-          <w:tcPr>
-            <w:tcW w:w="3969" w:type="dxa"/>
-            <w:tcBorders>
-              <w:top w:val="single" w:sz="4" w:space="0" w:color="E4DED3"/>
-              <w:left w:val="single" w:sz="4" w:space="0" w:color="E4DED3"/>
-              <w:bottom w:val="single" w:sz="4" w:space="0" w:color="E4DED3"/>
-              <w:right w:val="single" w:sz="4" w:space="0" w:color="E4DED3"/>
-            </w:tcBorders>
-          </w:tcPr>
-          <w:p>
-            <w:r>
-              <w:rPr>
-                <w:sz w:val="18"/>
-              </w:rPr>
-              <w:t>MySQL engine version</w:t>
-            </w:r>
-          </w:p>
-        </w:tc>
-        <w:tc>
-          <w:tcPr>
-            <w:tcW w:w="4535" w:type="dxa"/>
-            <w:tcBorders>
-              <w:top w:val="single" w:sz="4" w:space="0" w:color="E4DED3"/>
-              <w:left w:val="single" w:sz="4" w:space="0" w:color="E4DED3"/>
-              <w:bottom w:val="single" w:sz="4" w:space="0" w:color="E4DED3"/>
-              <w:right w:val="single" w:sz="4" w:space="0" w:color="E4DED3"/>
-            </w:tcBorders>
-          </w:tcPr>
-          <w:p>
-            <w:r>
-              <w:rPr>
-                <w:sz w:val="18"/>
-              </w:rPr>
-              <w:t>Confirm against the DOODLE compatibility matrix</w:t>
-            </w:r>
-          </w:p>
-        </w:tc>
-      </w:tr>
-      <w:tr>
-        <w:trPr>
-          <w:jc w:val="center"/>
-        </w:trPr>
-        <w:tc>
-          <w:tcPr>
-            <w:tcW w:w="567" w:type="dxa"/>
-            <w:tcBorders>
-              <w:top w:val="single" w:sz="4" w:space="0" w:color="E4DED3"/>
-              <w:left w:val="single" w:sz="4" w:space="0" w:color="E4DED3"/>
-              <w:bottom w:val="single" w:sz="4" w:space="0" w:color="E4DED3"/>
-              <w:right w:val="single" w:sz="4" w:space="0" w:color="E4DED3"/>
-            </w:tcBorders>
-          </w:tcPr>
-          <w:p>
-            <w:r>
-              <w:rPr>
-                <w:b/>
-                <w:sz w:val="18"/>
-              </w:rPr>
-              <w:t>C8</w:t>
-            </w:r>
-          </w:p>
-        </w:tc>
-        <w:tc>
-          <w:tcPr>
-            <w:tcW w:w="3969" w:type="dxa"/>
-            <w:tcBorders>
-              <w:top w:val="single" w:sz="4" w:space="0" w:color="E4DED3"/>
-              <w:left w:val="single" w:sz="4" w:space="0" w:color="E4DED3"/>
-              <w:bottom w:val="single" w:sz="4" w:space="0" w:color="E4DED3"/>
-              <w:right w:val="single" w:sz="4" w:space="0" w:color="E4DED3"/>
-            </w:tcBorders>
-          </w:tcPr>
-          <w:p>
-            <w:r>
-              <w:rPr>
-                <w:sz w:val="18"/>
-              </w:rPr>
-              <w:t>DNS strategy + ACM certificate domain</w:t>
-            </w:r>
-          </w:p>
-        </w:tc>
-        <w:tc>
-          <w:tcPr>
-            <w:tcW w:w="4535" w:type="dxa"/>
-            <w:tcBorders>
-              <w:top w:val="single" w:sz="4" w:space="0" w:color="E4DED3"/>
-              <w:left w:val="single" w:sz="4" w:space="0" w:color="E4DED3"/>
-              <w:bottom w:val="single" w:sz="4" w:space="0" w:color="E4DED3"/>
-              <w:right w:val="single" w:sz="4" w:space="0" w:color="E4DED3"/>
-            </w:tcBorders>
-          </w:tcPr>
-          <w:p>
-            <w:r>
-              <w:rPr>
-                <w:sz w:val="18"/>
-              </w:rPr>
-              <w:t>Confirm the LMS hostname with YAT ICT</w:t>
+              <w:t>Size against the database workload and its data footprint</w:t>
             </w:r>
           </w:p>
         </w:tc>
@@ -6864,10 +6659,15 @@
     </w:tbl>
     <w:p/>
     <w:p>
+      <w:r>
+        <w:t>Everything else is specified by this design: the Auto Scaling policy tracks CPU with a 70% scale-out target; the MTS-Consultants permission boundary is limited to the engagement's tagged resources; administrative access to instances is by Session Manager, with no bastion host; the database engine is MySQL; and the LMS hostname and its certificate are issued by YAT ICT at cutover.</w:t>
+      </w:r>
+    </w:p>
+    <w:p>
       <w:pPr>
         <w:pStyle w:val="Heading1"/>
       </w:pPr>
-      <w:bookmarkStart w:id="26" w:name="_Toc235021357"/>
+      <w:bookmarkStart w:id="26" w:name="_Toc238815552"/>
       <w:r>
         <w:t>5. Implementation Sequencing</w:t>
       </w:r>
@@ -6886,7 +6686,7 @@
       <w:pPr>
         <w:pStyle w:val="Heading1"/>
       </w:pPr>
-      <w:bookmarkStart w:id="27" w:name="_Toc235021358"/>
+      <w:bookmarkStart w:id="27" w:name="_Toc238815553"/>
       <w:r>
         <w:t>6. Simulation and Verification Plan</w:t>
       </w:r>
@@ -6898,15 +6698,16 @@
           <w:b/>
           <w:color w:val="C5613B"/>
         </w:rPr>
-        <w:t>Not applicable — failure/resize simulation and availability verification are the subject of the follow-on HA design and its deployment report; the baseline build is verified functionally per the Deployment Report's testing section.</w:t>
+        <w:t>Not applicable — failure/resize simulation and availability verification are the subject of the follow-on HA design; the baseline build is verified functionally by the tests in the build run sheet — reaching the server, reaching the internet through it, reaching the database from it, reaching the application through the load balancer, and watching the group scale.</w:t>
       </w:r>
     </w:p>
     <w:p>
       <w:pPr>
         <w:pStyle w:val="Heading1"/>
       </w:pPr>
-      <w:bookmarkStart w:id="28" w:name="_Toc235021359"/>
+      <w:bookmarkStart w:id="28" w:name="_Toc238815554"/>
       <w:r>
+        <w:lastRenderedPageBreak/>
         <w:t>7. Out of Scope</w:t>
       </w:r>
       <w:bookmarkEnd w:id="28"/>
@@ -6921,7 +6722,7 @@
         <w:pStyle w:val="ListBullet"/>
       </w:pPr>
       <w:r>
-        <w:t>Multi-AZ database; cross-AZ subnets (private-app-b, private-data-b); ASG capacity ≥ 2 across AZs.</w:t>
+        <w:t>Multi-AZ database; the private-app-b subnet; ASG capacity ≥ 2 across AZs.</w:t>
       </w:r>
     </w:p>
     <w:p>
@@ -6945,14 +6746,22 @@
         <w:pStyle w:val="ListBullet"/>
       </w:pPr>
       <w:r>
-        <w:t>And, out of MTS scope entirely: LMS application install, data migration, cutover, and change management (YAT ICT).</w:t>
+        <w:t>Object storage for course attachments and submissions, and the archiving policy over it.</w:t>
       </w:r>
     </w:p>
     <w:p>
       <w:pPr>
+        <w:pStyle w:val="ListBullet"/>
+      </w:pPr>
+      <w:r>
+        <w:t>And, out of MTS scope entirely: LMS application install, data migration, cutover (including the LMS hostname and its TLS certificate), and change management (YAT ICT).</w:t>
+      </w:r>
+    </w:p>
+    <w:p>
+      <w:pPr>
         <w:pStyle w:val="Heading1"/>
       </w:pPr>
-      <w:bookmarkStart w:id="29" w:name="_Toc235021360"/>
+      <w:bookmarkStart w:id="29" w:name="_Toc238815555"/>
       <w:r>
         <w:t>8. References</w:t>
       </w:r>
@@ -6986,9 +6795,8 @@
       <w:pPr>
         <w:pStyle w:val="Heading1"/>
       </w:pPr>
-      <w:bookmarkStart w:id="30" w:name="_Toc235021361"/>
+      <w:bookmarkStart w:id="30" w:name="_Toc238815556"/>
       <w:r>
-        <w:lastRenderedPageBreak/>
         <w:t>Document control</w:t>
       </w:r>
       <w:bookmarkEnd w:id="30"/>
@@ -7223,7 +7031,7 @@
               <w:rPr>
                 <w:sz w:val="18"/>
               </w:rPr>
-              <w:t>the AT2 Deployment Report (foundation build)</w:t>
+              <w:t>the AT2 build run sheet (foundation build)</w:t>
             </w:r>
           </w:p>
         </w:tc>
@@ -7275,8 +7083,8 @@
     </w:tbl>
     <w:p/>
     <w:sectPr>
-      <w:headerReference w:type="default" r:id="rId14"/>
-      <w:footerReference w:type="default" r:id="rId15"/>
+      <w:headerReference w:type="default" r:id="rId13"/>
+      <w:footerReference w:type="default" r:id="rId14"/>
       <w:pgSz w:w="11906" w:h="16838"/>
       <w:pgMar w:top="1474" w:right="1247" w:bottom="1247" w:left="1247" w:header="567" w:footer="567" w:gutter="0"/>
       <w:cols w:space="720"/>
@@ -7287,7 +7095,7 @@
 </file>
 
 <file path=word/endnotes.xml><?xml version="1.0" encoding="utf-8"?>
-<w:endnotes xmlns:wpc="http://schemas.microsoft.com/office/word/2010/wordprocessingCanvas" xmlns:cx="http://schemas.microsoft.com/office/drawing/2014/chartex" xmlns:cx1="http://schemas.microsoft.com/office/drawing/2015/9/8/chartex" xmlns:cx2="http://schemas.microsoft.com/office/drawing/2015/10/21/chartex" xmlns:cx3="http://schemas.microsoft.com/office/drawing/2016/5/9/chartex" xmlns:cx4="http://schemas.microsoft.com/office/drawing/2016/5/10/chartex" xmlns:cx5="http://schemas.microsoft.com/office/drawing/2016/5/11/chartex" xmlns:cx6="http://schemas.microsoft.com/office/drawing/2016/5/12/chartex" xmlns:cx7="http://schemas.microsoft.com/office/drawing/2016/5/13/chartex" xmlns:cx8="http://schemas.microsoft.com/office/drawing/2016/5/14/chartex" xmlns:mc="http://schemas.openxmlformats.org/markup-compatibility/2006" xmlns:m="http://schemas.openxmlformats.org/officeDocument/2006/math" xmlns:aink="http://schemas.microsoft.com/office/drawing/2016/ink" xmlns:am3d="http://schemas.microsoft.com/office/drawing/2017/model3d" xmlns:oel="http://schemas.microsoft.com/office/2019/extlst" xmlns:r="http://schemas.openxmlformats.org/officeDocument/2006/relationships" xmlns:wp14="http://schemas.microsoft.com/office/word/2010/wordprocessingDrawing" xmlns:wp="http://schemas.openxmlformats.org/drawingml/2006/wordprocessingDrawing" xmlns:wpg="http://schemas.microsoft.com/office/word/2010/wordprocessingGroup" xmlns:wpi="http://schemas.microsoft.com/office/word/2010/wordprocessingInk" xmlns:wps="http://schemas.microsoft.com/office/word/2010/wordprocessingShape" xmlns:o="urn:schemas-microsoft-com:office:office" xmlns:v="urn:schemas-microsoft-com:vml" xmlns:w10="urn:schemas-microsoft-com:office:word" xmlns:w="http://schemas.openxmlformats.org/wordprocessingml/2006/main" xmlns:w14="http://schemas.microsoft.com/office/word/2010/wordml" xmlns:w15="http://schemas.microsoft.com/office/word/2012/wordml" xmlns:w16cei="http://schemas.microsoft.com/office/word/2026/wordml/cei" xmlns:w16cex="http://schemas.microsoft.com/office/word/2018/wordml/cex" xmlns:w16cid="http://schemas.microsoft.com/office/word/2016/wordml/cid" xmlns:w16="http://schemas.microsoft.com/office/word/2018/wordml" xmlns:w16sdtdh="http://schemas.microsoft.com/office/word/2020/wordml/sdtdatahash" xmlns:w16sdtfl="http://schemas.microsoft.com/office/word/2024/wordml/sdtformatlock" xmlns:w16se="http://schemas.microsoft.com/office/word/2015/wordml/symex" xmlns:w16du="http://schemas.microsoft.com/office/word/2023/wordml/word16du" xmlns:wne="http://schemas.microsoft.com/office/word/2006/wordml" mc:Ignorable="w14 w15 w16se w16cid w16 w16cex w16sdtdh w16sdtfl w16du wp14">
+<w:endnotes xmlns:wpc="http://schemas.microsoft.com/office/word/2010/wordprocessingCanvas" xmlns:cx="http://schemas.microsoft.com/office/drawing/2014/chartex" xmlns:cx1="http://schemas.microsoft.com/office/drawing/2015/9/8/chartex" xmlns:cx2="http://schemas.microsoft.com/office/drawing/2015/10/21/chartex" xmlns:cx3="http://schemas.microsoft.com/office/drawing/2016/5/9/chartex" xmlns:cx4="http://schemas.microsoft.com/office/drawing/2016/5/10/chartex" xmlns:cx5="http://schemas.microsoft.com/office/drawing/2016/5/11/chartex" xmlns:cx6="http://schemas.microsoft.com/office/drawing/2016/5/12/chartex" xmlns:cx7="http://schemas.microsoft.com/office/drawing/2016/5/13/chartex" xmlns:cx8="http://schemas.microsoft.com/office/drawing/2016/5/14/chartex" xmlns:mc="http://schemas.openxmlformats.org/markup-compatibility/2006" xmlns:m="http://schemas.openxmlformats.org/officeDocument/2006/math" xmlns:aink="http://schemas.microsoft.com/office/drawing/2016/ink" xmlns:am3d="http://schemas.microsoft.com/office/drawing/2017/model3d" xmlns:oel="http://schemas.microsoft.com/office/2019/extlst" xmlns:r="http://schemas.openxmlformats.org/officeDocument/2006/relationships" xmlns:wp14="http://schemas.microsoft.com/office/word/2010/wordprocessingDrawing" xmlns:wp="http://schemas.openxmlformats.org/drawingml/2006/wordprocessingDrawing" xmlns:wpg="http://schemas.microsoft.com/office/word/2010/wordprocessingGroup" xmlns:wpi="http://schemas.microsoft.com/office/word/2010/wordprocessingInk" xmlns:wps="http://schemas.microsoft.com/office/word/2010/wordprocessingShape" xmlns:o="urn:schemas-microsoft-com:office:office" xmlns:v="urn:schemas-microsoft-com:vml" xmlns:w10="urn:schemas-microsoft-com:office:word" xmlns:w="http://schemas.openxmlformats.org/wordprocessingml/2006/main" xmlns:w14="http://schemas.microsoft.com/office/word/2010/wordml" xmlns:w15="http://schemas.microsoft.com/office/word/2012/wordml" xmlns:w16cex="http://schemas.microsoft.com/office/word/2018/wordml/cex" xmlns:w16cid="http://schemas.microsoft.com/office/word/2016/wordml/cid" xmlns:w16="http://schemas.microsoft.com/office/word/2018/wordml" xmlns:w16sdtdh="http://schemas.microsoft.com/office/word/2020/wordml/sdtdatahash" xmlns:w16sdtfl="http://schemas.microsoft.com/office/word/2024/wordml/sdtformatlock" xmlns:w16se="http://schemas.microsoft.com/office/word/2015/wordml/symex" xmlns:w16du="http://schemas.microsoft.com/office/word/2023/wordml/word16du" xmlns:wne="http://schemas.microsoft.com/office/word/2006/wordml" mc:Ignorable="w14 w15 w16se w16cid w16 w16cex w16sdtdh w16sdtfl w16du wp14">
   <w:endnote w:type="separator" w:id="-1">
     <w:p>
       <w:pPr>
@@ -7312,7 +7120,7 @@
 </file>
 
 <file path=word/footer1.xml><?xml version="1.0" encoding="utf-8"?>
-<w:ftr xmlns:wpc="http://schemas.microsoft.com/office/word/2010/wordprocessingCanvas" xmlns:cx="http://schemas.microsoft.com/office/drawing/2014/chartex" xmlns:cx1="http://schemas.microsoft.com/office/drawing/2015/9/8/chartex" xmlns:cx2="http://schemas.microsoft.com/office/drawing/2015/10/21/chartex" xmlns:cx3="http://schemas.microsoft.com/office/drawing/2016/5/9/chartex" xmlns:cx4="http://schemas.microsoft.com/office/drawing/2016/5/10/chartex" xmlns:cx5="http://schemas.microsoft.com/office/drawing/2016/5/11/chartex" xmlns:cx6="http://schemas.microsoft.com/office/drawing/2016/5/12/chartex" xmlns:cx7="http://schemas.microsoft.com/office/drawing/2016/5/13/chartex" xmlns:cx8="http://schemas.microsoft.com/office/drawing/2016/5/14/chartex" xmlns:mc="http://schemas.openxmlformats.org/markup-compatibility/2006" xmlns:m="http://schemas.openxmlformats.org/officeDocument/2006/math" xmlns:aink="http://schemas.microsoft.com/office/drawing/2016/ink" xmlns:am3d="http://schemas.microsoft.com/office/drawing/2017/model3d" xmlns:oel="http://schemas.microsoft.com/office/2019/extlst" xmlns:r="http://schemas.openxmlformats.org/officeDocument/2006/relationships" xmlns:wp14="http://schemas.microsoft.com/office/word/2010/wordprocessingDrawing" xmlns:wp="http://schemas.openxmlformats.org/drawingml/2006/wordprocessingDrawing" xmlns:wpg="http://schemas.microsoft.com/office/word/2010/wordprocessingGroup" xmlns:wpi="http://schemas.microsoft.com/office/word/2010/wordprocessingInk" xmlns:wps="http://schemas.microsoft.com/office/word/2010/wordprocessingShape" xmlns:o="urn:schemas-microsoft-com:office:office" xmlns:v="urn:schemas-microsoft-com:vml" xmlns:w10="urn:schemas-microsoft-com:office:word" xmlns:w="http://schemas.openxmlformats.org/wordprocessingml/2006/main" xmlns:w14="http://schemas.microsoft.com/office/word/2010/wordml" xmlns:w15="http://schemas.microsoft.com/office/word/2012/wordml" xmlns:w16cei="http://schemas.microsoft.com/office/word/2026/wordml/cei" xmlns:w16cex="http://schemas.microsoft.com/office/word/2018/wordml/cex" xmlns:w16cid="http://schemas.microsoft.com/office/word/2016/wordml/cid" xmlns:w16="http://schemas.microsoft.com/office/word/2018/wordml" xmlns:w16sdtdh="http://schemas.microsoft.com/office/word/2020/wordml/sdtdatahash" xmlns:w16sdtfl="http://schemas.microsoft.com/office/word/2024/wordml/sdtformatlock" xmlns:w16se="http://schemas.microsoft.com/office/word/2015/wordml/symex" xmlns:w16du="http://schemas.microsoft.com/office/word/2023/wordml/word16du" xmlns:wne="http://schemas.microsoft.com/office/word/2006/wordml" mc:Ignorable="w14 w15 w16se w16cid w16 w16cex w16sdtdh w16sdtfl w16du wp14">
+<w:ftr xmlns:wpc="http://schemas.microsoft.com/office/word/2010/wordprocessingCanvas" xmlns:cx="http://schemas.microsoft.com/office/drawing/2014/chartex" xmlns:cx1="http://schemas.microsoft.com/office/drawing/2015/9/8/chartex" xmlns:cx2="http://schemas.microsoft.com/office/drawing/2015/10/21/chartex" xmlns:cx3="http://schemas.microsoft.com/office/drawing/2016/5/9/chartex" xmlns:cx4="http://schemas.microsoft.com/office/drawing/2016/5/10/chartex" xmlns:cx5="http://schemas.microsoft.com/office/drawing/2016/5/11/chartex" xmlns:cx6="http://schemas.microsoft.com/office/drawing/2016/5/12/chartex" xmlns:cx7="http://schemas.microsoft.com/office/drawing/2016/5/13/chartex" xmlns:cx8="http://schemas.microsoft.com/office/drawing/2016/5/14/chartex" xmlns:mc="http://schemas.openxmlformats.org/markup-compatibility/2006" xmlns:m="http://schemas.openxmlformats.org/officeDocument/2006/math" xmlns:aink="http://schemas.microsoft.com/office/drawing/2016/ink" xmlns:am3d="http://schemas.microsoft.com/office/drawing/2017/model3d" xmlns:oel="http://schemas.microsoft.com/office/2019/extlst" xmlns:r="http://schemas.openxmlformats.org/officeDocument/2006/relationships" xmlns:wp14="http://schemas.microsoft.com/office/word/2010/wordprocessingDrawing" xmlns:wp="http://schemas.openxmlformats.org/drawingml/2006/wordprocessingDrawing" xmlns:wpg="http://schemas.microsoft.com/office/word/2010/wordprocessingGroup" xmlns:wpi="http://schemas.microsoft.com/office/word/2010/wordprocessingInk" xmlns:wps="http://schemas.microsoft.com/office/word/2010/wordprocessingShape" xmlns:o="urn:schemas-microsoft-com:office:office" xmlns:v="urn:schemas-microsoft-com:vml" xmlns:w10="urn:schemas-microsoft-com:office:word" xmlns:w="http://schemas.openxmlformats.org/wordprocessingml/2006/main" xmlns:w14="http://schemas.microsoft.com/office/word/2010/wordml" xmlns:w15="http://schemas.microsoft.com/office/word/2012/wordml" xmlns:w16cex="http://schemas.microsoft.com/office/word/2018/wordml/cex" xmlns:w16cid="http://schemas.microsoft.com/office/word/2016/wordml/cid" xmlns:w16="http://schemas.microsoft.com/office/word/2018/wordml" xmlns:w16sdtdh="http://schemas.microsoft.com/office/word/2020/wordml/sdtdatahash" xmlns:w16sdtfl="http://schemas.microsoft.com/office/word/2024/wordml/sdtformatlock" xmlns:w16se="http://schemas.microsoft.com/office/word/2015/wordml/symex" xmlns:w16du="http://schemas.microsoft.com/office/word/2023/wordml/word16du" xmlns:wne="http://schemas.microsoft.com/office/word/2006/wordml" mc:Ignorable="w14 w15 w16se w16cid w16 w16cex w16sdtdh w16sdtfl w16du wp14">
   <w:p>
     <w:pPr>
       <w:pStyle w:val="Footer"/>
@@ -7390,7 +7198,7 @@
 </file>
 
 <file path=word/footer2.xml><?xml version="1.0" encoding="utf-8"?>
-<w:ftr xmlns:wpc="http://schemas.microsoft.com/office/word/2010/wordprocessingCanvas" xmlns:cx="http://schemas.microsoft.com/office/drawing/2014/chartex" xmlns:cx1="http://schemas.microsoft.com/office/drawing/2015/9/8/chartex" xmlns:cx2="http://schemas.microsoft.com/office/drawing/2015/10/21/chartex" xmlns:cx3="http://schemas.microsoft.com/office/drawing/2016/5/9/chartex" xmlns:cx4="http://schemas.microsoft.com/office/drawing/2016/5/10/chartex" xmlns:cx5="http://schemas.microsoft.com/office/drawing/2016/5/11/chartex" xmlns:cx6="http://schemas.microsoft.com/office/drawing/2016/5/12/chartex" xmlns:cx7="http://schemas.microsoft.com/office/drawing/2016/5/13/chartex" xmlns:cx8="http://schemas.microsoft.com/office/drawing/2016/5/14/chartex" xmlns:mc="http://schemas.openxmlformats.org/markup-compatibility/2006" xmlns:m="http://schemas.openxmlformats.org/officeDocument/2006/math" xmlns:aink="http://schemas.microsoft.com/office/drawing/2016/ink" xmlns:am3d="http://schemas.microsoft.com/office/drawing/2017/model3d" xmlns:oel="http://schemas.microsoft.com/office/2019/extlst" xmlns:r="http://schemas.openxmlformats.org/officeDocument/2006/relationships" xmlns:wp14="http://schemas.microsoft.com/office/word/2010/wordprocessingDrawing" xmlns:wp="http://schemas.openxmlformats.org/drawingml/2006/wordprocessingDrawing" xmlns:wpg="http://schemas.microsoft.com/office/word/2010/wordprocessingGroup" xmlns:wpi="http://schemas.microsoft.com/office/word/2010/wordprocessingInk" xmlns:wps="http://schemas.microsoft.com/office/word/2010/wordprocessingShape" xmlns:o="urn:schemas-microsoft-com:office:office" xmlns:v="urn:schemas-microsoft-com:vml" xmlns:w10="urn:schemas-microsoft-com:office:word" xmlns:w="http://schemas.openxmlformats.org/wordprocessingml/2006/main" xmlns:w14="http://schemas.microsoft.com/office/word/2010/wordml" xmlns:w15="http://schemas.microsoft.com/office/word/2012/wordml" xmlns:w16cei="http://schemas.microsoft.com/office/word/2026/wordml/cei" xmlns:w16cex="http://schemas.microsoft.com/office/word/2018/wordml/cex" xmlns:w16cid="http://schemas.microsoft.com/office/word/2016/wordml/cid" xmlns:w16="http://schemas.microsoft.com/office/word/2018/wordml" xmlns:w16sdtdh="http://schemas.microsoft.com/office/word/2020/wordml/sdtdatahash" xmlns:w16sdtfl="http://schemas.microsoft.com/office/word/2024/wordml/sdtformatlock" xmlns:w16se="http://schemas.microsoft.com/office/word/2015/wordml/symex" xmlns:w16du="http://schemas.microsoft.com/office/word/2023/wordml/word16du" xmlns:wne="http://schemas.microsoft.com/office/word/2006/wordml" mc:Ignorable="w14 w15 w16se w16cid w16 w16cex w16sdtdh w16sdtfl w16du wp14">
+<w:ftr xmlns:wpc="http://schemas.microsoft.com/office/word/2010/wordprocessingCanvas" xmlns:cx="http://schemas.microsoft.com/office/drawing/2014/chartex" xmlns:cx1="http://schemas.microsoft.com/office/drawing/2015/9/8/chartex" xmlns:cx2="http://schemas.microsoft.com/office/drawing/2015/10/21/chartex" xmlns:cx3="http://schemas.microsoft.com/office/drawing/2016/5/9/chartex" xmlns:cx4="http://schemas.microsoft.com/office/drawing/2016/5/10/chartex" xmlns:cx5="http://schemas.microsoft.com/office/drawing/2016/5/11/chartex" xmlns:cx6="http://schemas.microsoft.com/office/drawing/2016/5/12/chartex" xmlns:cx7="http://schemas.microsoft.com/office/drawing/2016/5/13/chartex" xmlns:cx8="http://schemas.microsoft.com/office/drawing/2016/5/14/chartex" xmlns:mc="http://schemas.openxmlformats.org/markup-compatibility/2006" xmlns:m="http://schemas.openxmlformats.org/officeDocument/2006/math" xmlns:aink="http://schemas.microsoft.com/office/drawing/2016/ink" xmlns:am3d="http://schemas.microsoft.com/office/drawing/2017/model3d" xmlns:oel="http://schemas.microsoft.com/office/2019/extlst" xmlns:r="http://schemas.openxmlformats.org/officeDocument/2006/relationships" xmlns:wp14="http://schemas.microsoft.com/office/word/2010/wordprocessingDrawing" xmlns:wp="http://schemas.openxmlformats.org/drawingml/2006/wordprocessingDrawing" xmlns:wpg="http://schemas.microsoft.com/office/word/2010/wordprocessingGroup" xmlns:wpi="http://schemas.microsoft.com/office/word/2010/wordprocessingInk" xmlns:wps="http://schemas.microsoft.com/office/word/2010/wordprocessingShape" xmlns:o="urn:schemas-microsoft-com:office:office" xmlns:v="urn:schemas-microsoft-com:vml" xmlns:w10="urn:schemas-microsoft-com:office:word" xmlns:w="http://schemas.openxmlformats.org/wordprocessingml/2006/main" xmlns:w14="http://schemas.microsoft.com/office/word/2010/wordml" xmlns:w15="http://schemas.microsoft.com/office/word/2012/wordml" xmlns:w16cex="http://schemas.microsoft.com/office/word/2018/wordml/cex" xmlns:w16cid="http://schemas.microsoft.com/office/word/2016/wordml/cid" xmlns:w16="http://schemas.microsoft.com/office/word/2018/wordml" xmlns:w16sdtdh="http://schemas.microsoft.com/office/word/2020/wordml/sdtdatahash" xmlns:w16sdtfl="http://schemas.microsoft.com/office/word/2024/wordml/sdtformatlock" xmlns:w16se="http://schemas.microsoft.com/office/word/2015/wordml/symex" xmlns:w16du="http://schemas.microsoft.com/office/word/2023/wordml/word16du" xmlns:wne="http://schemas.microsoft.com/office/word/2006/wordml" mc:Ignorable="w14 w15 w16se w16cid w16 w16cex w16sdtdh w16sdtfl w16du wp14">
   <w:p>
     <w:pPr>
       <w:pStyle w:val="Footer"/>
@@ -7468,7 +7276,7 @@
 </file>
 
 <file path=word/footer3.xml><?xml version="1.0" encoding="utf-8"?>
-<w:ftr xmlns:wpc="http://schemas.microsoft.com/office/word/2010/wordprocessingCanvas" xmlns:cx="http://schemas.microsoft.com/office/drawing/2014/chartex" xmlns:cx1="http://schemas.microsoft.com/office/drawing/2015/9/8/chartex" xmlns:cx2="http://schemas.microsoft.com/office/drawing/2015/10/21/chartex" xmlns:cx3="http://schemas.microsoft.com/office/drawing/2016/5/9/chartex" xmlns:cx4="http://schemas.microsoft.com/office/drawing/2016/5/10/chartex" xmlns:cx5="http://schemas.microsoft.com/office/drawing/2016/5/11/chartex" xmlns:cx6="http://schemas.microsoft.com/office/drawing/2016/5/12/chartex" xmlns:cx7="http://schemas.microsoft.com/office/drawing/2016/5/13/chartex" xmlns:cx8="http://schemas.microsoft.com/office/drawing/2016/5/14/chartex" xmlns:mc="http://schemas.openxmlformats.org/markup-compatibility/2006" xmlns:m="http://schemas.openxmlformats.org/officeDocument/2006/math" xmlns:aink="http://schemas.microsoft.com/office/drawing/2016/ink" xmlns:am3d="http://schemas.microsoft.com/office/drawing/2017/model3d" xmlns:oel="http://schemas.microsoft.com/office/2019/extlst" xmlns:r="http://schemas.openxmlformats.org/officeDocument/2006/relationships" xmlns:wp14="http://schemas.microsoft.com/office/word/2010/wordprocessingDrawing" xmlns:wp="http://schemas.openxmlformats.org/drawingml/2006/wordprocessingDrawing" xmlns:wpg="http://schemas.microsoft.com/office/word/2010/wordprocessingGroup" xmlns:wpi="http://schemas.microsoft.com/office/word/2010/wordprocessingInk" xmlns:wps="http://schemas.microsoft.com/office/word/2010/wordprocessingShape" xmlns:o="urn:schemas-microsoft-com:office:office" xmlns:v="urn:schemas-microsoft-com:vml" xmlns:w10="urn:schemas-microsoft-com:office:word" xmlns:w="http://schemas.openxmlformats.org/wordprocessingml/2006/main" xmlns:w14="http://schemas.microsoft.com/office/word/2010/wordml" xmlns:w15="http://schemas.microsoft.com/office/word/2012/wordml" xmlns:w16cei="http://schemas.microsoft.com/office/word/2026/wordml/cei" xmlns:w16cex="http://schemas.microsoft.com/office/word/2018/wordml/cex" xmlns:w16cid="http://schemas.microsoft.com/office/word/2016/wordml/cid" xmlns:w16="http://schemas.microsoft.com/office/word/2018/wordml" xmlns:w16sdtdh="http://schemas.microsoft.com/office/word/2020/wordml/sdtdatahash" xmlns:w16sdtfl="http://schemas.microsoft.com/office/word/2024/wordml/sdtformatlock" xmlns:w16se="http://schemas.microsoft.com/office/word/2015/wordml/symex" xmlns:w16du="http://schemas.microsoft.com/office/word/2023/wordml/word16du" xmlns:wne="http://schemas.microsoft.com/office/word/2006/wordml" mc:Ignorable="w14 w15 w16se w16cid w16 w16cex w16sdtdh w16sdtfl w16du wp14">
+<w:ftr xmlns:wpc="http://schemas.microsoft.com/office/word/2010/wordprocessingCanvas" xmlns:cx="http://schemas.microsoft.com/office/drawing/2014/chartex" xmlns:cx1="http://schemas.microsoft.com/office/drawing/2015/9/8/chartex" xmlns:cx2="http://schemas.microsoft.com/office/drawing/2015/10/21/chartex" xmlns:cx3="http://schemas.microsoft.com/office/drawing/2016/5/9/chartex" xmlns:cx4="http://schemas.microsoft.com/office/drawing/2016/5/10/chartex" xmlns:cx5="http://schemas.microsoft.com/office/drawing/2016/5/11/chartex" xmlns:cx6="http://schemas.microsoft.com/office/drawing/2016/5/12/chartex" xmlns:cx7="http://schemas.microsoft.com/office/drawing/2016/5/13/chartex" xmlns:cx8="http://schemas.microsoft.com/office/drawing/2016/5/14/chartex" xmlns:mc="http://schemas.openxmlformats.org/markup-compatibility/2006" xmlns:m="http://schemas.openxmlformats.org/officeDocument/2006/math" xmlns:aink="http://schemas.microsoft.com/office/drawing/2016/ink" xmlns:am3d="http://schemas.microsoft.com/office/drawing/2017/model3d" xmlns:oel="http://schemas.microsoft.com/office/2019/extlst" xmlns:r="http://schemas.openxmlformats.org/officeDocument/2006/relationships" xmlns:wp14="http://schemas.microsoft.com/office/word/2010/wordprocessingDrawing" xmlns:wp="http://schemas.openxmlformats.org/drawingml/2006/wordprocessingDrawing" xmlns:wpg="http://schemas.microsoft.com/office/word/2010/wordprocessingGroup" xmlns:wpi="http://schemas.microsoft.com/office/word/2010/wordprocessingInk" xmlns:wps="http://schemas.microsoft.com/office/word/2010/wordprocessingShape" xmlns:o="urn:schemas-microsoft-com:office:office" xmlns:v="urn:schemas-microsoft-com:vml" xmlns:w10="urn:schemas-microsoft-com:office:word" xmlns:w="http://schemas.openxmlformats.org/wordprocessingml/2006/main" xmlns:w14="http://schemas.microsoft.com/office/word/2010/wordml" xmlns:w15="http://schemas.microsoft.com/office/word/2012/wordml" xmlns:w16cex="http://schemas.microsoft.com/office/word/2018/wordml/cex" xmlns:w16cid="http://schemas.microsoft.com/office/word/2016/wordml/cid" xmlns:w16="http://schemas.microsoft.com/office/word/2018/wordml" xmlns:w16sdtdh="http://schemas.microsoft.com/office/word/2020/wordml/sdtdatahash" xmlns:w16sdtfl="http://schemas.microsoft.com/office/word/2024/wordml/sdtformatlock" xmlns:w16se="http://schemas.microsoft.com/office/word/2015/wordml/symex" xmlns:w16du="http://schemas.microsoft.com/office/word/2023/wordml/word16du" xmlns:wne="http://schemas.microsoft.com/office/word/2006/wordml" mc:Ignorable="w14 w15 w16se w16cid w16 w16cex w16sdtdh w16sdtfl w16du wp14">
   <w:p>
     <w:pPr>
       <w:pStyle w:val="Footer"/>
@@ -7546,7 +7354,7 @@
 </file>
 
 <file path=word/footnotes.xml><?xml version="1.0" encoding="utf-8"?>
-<w:footnotes xmlns:wpc="http://schemas.microsoft.com/office/word/2010/wordprocessingCanvas" xmlns:cx="http://schemas.microsoft.com/office/drawing/2014/chartex" xmlns:cx1="http://schemas.microsoft.com/office/drawing/2015/9/8/chartex" xmlns:cx2="http://schemas.microsoft.com/office/drawing/2015/10/21/chartex" xmlns:cx3="http://schemas.microsoft.com/office/drawing/2016/5/9/chartex" xmlns:cx4="http://schemas.microsoft.com/office/drawing/2016/5/10/chartex" xmlns:cx5="http://schemas.microsoft.com/office/drawing/2016/5/11/chartex" xmlns:cx6="http://schemas.microsoft.com/office/drawing/2016/5/12/chartex" xmlns:cx7="http://schemas.microsoft.com/office/drawing/2016/5/13/chartex" xmlns:cx8="http://schemas.microsoft.com/office/drawing/2016/5/14/chartex" xmlns:mc="http://schemas.openxmlformats.org/markup-compatibility/2006" xmlns:m="http://schemas.openxmlformats.org/officeDocument/2006/math" xmlns:aink="http://schemas.microsoft.com/office/drawing/2016/ink" xmlns:am3d="http://schemas.microsoft.com/office/drawing/2017/model3d" xmlns:oel="http://schemas.microsoft.com/office/2019/extlst" xmlns:r="http://schemas.openxmlformats.org/officeDocument/2006/relationships" xmlns:wp14="http://schemas.microsoft.com/office/word/2010/wordprocessingDrawing" xmlns:wp="http://schemas.openxmlformats.org/drawingml/2006/wordprocessingDrawing" xmlns:wpg="http://schemas.microsoft.com/office/word/2010/wordprocessingGroup" xmlns:wpi="http://schemas.microsoft.com/office/word/2010/wordprocessingInk" xmlns:wps="http://schemas.microsoft.com/office/word/2010/wordprocessingShape" xmlns:o="urn:schemas-microsoft-com:office:office" xmlns:v="urn:schemas-microsoft-com:vml" xmlns:w10="urn:schemas-microsoft-com:office:word" xmlns:w="http://schemas.openxmlformats.org/wordprocessingml/2006/main" xmlns:w14="http://schemas.microsoft.com/office/word/2010/wordml" xmlns:w15="http://schemas.microsoft.com/office/word/2012/wordml" xmlns:w16cei="http://schemas.microsoft.com/office/word/2026/wordml/cei" xmlns:w16cex="http://schemas.microsoft.com/office/word/2018/wordml/cex" xmlns:w16cid="http://schemas.microsoft.com/office/word/2016/wordml/cid" xmlns:w16="http://schemas.microsoft.com/office/word/2018/wordml" xmlns:w16sdtdh="http://schemas.microsoft.com/office/word/2020/wordml/sdtdatahash" xmlns:w16sdtfl="http://schemas.microsoft.com/office/word/2024/wordml/sdtformatlock" xmlns:w16se="http://schemas.microsoft.com/office/word/2015/wordml/symex" xmlns:w16du="http://schemas.microsoft.com/office/word/2023/wordml/word16du" xmlns:wne="http://schemas.microsoft.com/office/word/2006/wordml" mc:Ignorable="w14 w15 w16se w16cid w16 w16cex w16sdtdh w16sdtfl w16du wp14">
+<w:footnotes xmlns:wpc="http://schemas.microsoft.com/office/word/2010/wordprocessingCanvas" xmlns:cx="http://schemas.microsoft.com/office/drawing/2014/chartex" xmlns:cx1="http://schemas.microsoft.com/office/drawing/2015/9/8/chartex" xmlns:cx2="http://schemas.microsoft.com/office/drawing/2015/10/21/chartex" xmlns:cx3="http://schemas.microsoft.com/office/drawing/2016/5/9/chartex" xmlns:cx4="http://schemas.microsoft.com/office/drawing/2016/5/10/chartex" xmlns:cx5="http://schemas.microsoft.com/office/drawing/2016/5/11/chartex" xmlns:cx6="http://schemas.microsoft.com/office/drawing/2016/5/12/chartex" xmlns:cx7="http://schemas.microsoft.com/office/drawing/2016/5/13/chartex" xmlns:cx8="http://schemas.microsoft.com/office/drawing/2016/5/14/chartex" xmlns:mc="http://schemas.openxmlformats.org/markup-compatibility/2006" xmlns:m="http://schemas.openxmlformats.org/officeDocument/2006/math" xmlns:aink="http://schemas.microsoft.com/office/drawing/2016/ink" xmlns:am3d="http://schemas.microsoft.com/office/drawing/2017/model3d" xmlns:oel="http://schemas.microsoft.com/office/2019/extlst" xmlns:r="http://schemas.openxmlformats.org/officeDocument/2006/relationships" xmlns:wp14="http://schemas.microsoft.com/office/word/2010/wordprocessingDrawing" xmlns:wp="http://schemas.openxmlformats.org/drawingml/2006/wordprocessingDrawing" xmlns:wpg="http://schemas.microsoft.com/office/word/2010/wordprocessingGroup" xmlns:wpi="http://schemas.microsoft.com/office/word/2010/wordprocessingInk" xmlns:wps="http://schemas.microsoft.com/office/word/2010/wordprocessingShape" xmlns:o="urn:schemas-microsoft-com:office:office" xmlns:v="urn:schemas-microsoft-com:vml" xmlns:w10="urn:schemas-microsoft-com:office:word" xmlns:w="http://schemas.openxmlformats.org/wordprocessingml/2006/main" xmlns:w14="http://schemas.microsoft.com/office/word/2010/wordml" xmlns:w15="http://schemas.microsoft.com/office/word/2012/wordml" xmlns:w16cex="http://schemas.microsoft.com/office/word/2018/wordml/cex" xmlns:w16cid="http://schemas.microsoft.com/office/word/2016/wordml/cid" xmlns:w16="http://schemas.microsoft.com/office/word/2018/wordml" xmlns:w16sdtdh="http://schemas.microsoft.com/office/word/2020/wordml/sdtdatahash" xmlns:w16sdtfl="http://schemas.microsoft.com/office/word/2024/wordml/sdtformatlock" xmlns:w16se="http://schemas.microsoft.com/office/word/2015/wordml/symex" xmlns:w16du="http://schemas.microsoft.com/office/word/2023/wordml/word16du" xmlns:wne="http://schemas.microsoft.com/office/word/2006/wordml" mc:Ignorable="w14 w15 w16se w16cid w16 w16cex w16sdtdh w16sdtfl w16du wp14">
   <w:footnote w:type="separator" w:id="-1">
     <w:p>
       <w:pPr>
@@ -7571,7 +7379,7 @@
 </file>
 
 <file path=word/header1.xml><?xml version="1.0" encoding="utf-8"?>
-<w:hdr xmlns:wpc="http://schemas.microsoft.com/office/word/2010/wordprocessingCanvas" xmlns:cx="http://schemas.microsoft.com/office/drawing/2014/chartex" xmlns:cx1="http://schemas.microsoft.com/office/drawing/2015/9/8/chartex" xmlns:cx2="http://schemas.microsoft.com/office/drawing/2015/10/21/chartex" xmlns:cx3="http://schemas.microsoft.com/office/drawing/2016/5/9/chartex" xmlns:cx4="http://schemas.microsoft.com/office/drawing/2016/5/10/chartex" xmlns:cx5="http://schemas.microsoft.com/office/drawing/2016/5/11/chartex" xmlns:cx6="http://schemas.microsoft.com/office/drawing/2016/5/12/chartex" xmlns:cx7="http://schemas.microsoft.com/office/drawing/2016/5/13/chartex" xmlns:cx8="http://schemas.microsoft.com/office/drawing/2016/5/14/chartex" xmlns:mc="http://schemas.openxmlformats.org/markup-compatibility/2006" xmlns:m="http://schemas.openxmlformats.org/officeDocument/2006/math" xmlns:aink="http://schemas.microsoft.com/office/drawing/2016/ink" xmlns:am3d="http://schemas.microsoft.com/office/drawing/2017/model3d" xmlns:oel="http://schemas.microsoft.com/office/2019/extlst" xmlns:r="http://schemas.openxmlformats.org/officeDocument/2006/relationships" xmlns:wp14="http://schemas.microsoft.com/office/word/2010/wordprocessingDrawing" xmlns:wp="http://schemas.openxmlformats.org/drawingml/2006/wordprocessingDrawing" xmlns:wpg="http://schemas.microsoft.com/office/word/2010/wordprocessingGroup" xmlns:wpi="http://schemas.microsoft.com/office/word/2010/wordprocessingInk" xmlns:wps="http://schemas.microsoft.com/office/word/2010/wordprocessingShape" xmlns:o="urn:schemas-microsoft-com:office:office" xmlns:v="urn:schemas-microsoft-com:vml" xmlns:w10="urn:schemas-microsoft-com:office:word" xmlns:w="http://schemas.openxmlformats.org/wordprocessingml/2006/main" xmlns:w14="http://schemas.microsoft.com/office/word/2010/wordml" xmlns:w15="http://schemas.microsoft.com/office/word/2012/wordml" xmlns:w16cei="http://schemas.microsoft.com/office/word/2026/wordml/cei" xmlns:w16cex="http://schemas.microsoft.com/office/word/2018/wordml/cex" xmlns:w16cid="http://schemas.microsoft.com/office/word/2016/wordml/cid" xmlns:w16="http://schemas.microsoft.com/office/word/2018/wordml" xmlns:w16sdtdh="http://schemas.microsoft.com/office/word/2020/wordml/sdtdatahash" xmlns:w16sdtfl="http://schemas.microsoft.com/office/word/2024/wordml/sdtformatlock" xmlns:w16se="http://schemas.microsoft.com/office/word/2015/wordml/symex" xmlns:w16du="http://schemas.microsoft.com/office/word/2023/wordml/word16du" xmlns:wne="http://schemas.microsoft.com/office/word/2006/wordml" mc:Ignorable="w14 w15 w16se w16cid w16 w16cex w16sdtdh w16sdtfl w16du wp14">
+<w:hdr xmlns:wpc="http://schemas.microsoft.com/office/word/2010/wordprocessingCanvas" xmlns:cx="http://schemas.microsoft.com/office/drawing/2014/chartex" xmlns:cx1="http://schemas.microsoft.com/office/drawing/2015/9/8/chartex" xmlns:cx2="http://schemas.microsoft.com/office/drawing/2015/10/21/chartex" xmlns:cx3="http://schemas.microsoft.com/office/drawing/2016/5/9/chartex" xmlns:cx4="http://schemas.microsoft.com/office/drawing/2016/5/10/chartex" xmlns:cx5="http://schemas.microsoft.com/office/drawing/2016/5/11/chartex" xmlns:cx6="http://schemas.microsoft.com/office/drawing/2016/5/12/chartex" xmlns:cx7="http://schemas.microsoft.com/office/drawing/2016/5/13/chartex" xmlns:cx8="http://schemas.microsoft.com/office/drawing/2016/5/14/chartex" xmlns:mc="http://schemas.openxmlformats.org/markup-compatibility/2006" xmlns:m="http://schemas.openxmlformats.org/officeDocument/2006/math" xmlns:aink="http://schemas.microsoft.com/office/drawing/2016/ink" xmlns:am3d="http://schemas.microsoft.com/office/drawing/2017/model3d" xmlns:oel="http://schemas.microsoft.com/office/2019/extlst" xmlns:r="http://schemas.openxmlformats.org/officeDocument/2006/relationships" xmlns:wp14="http://schemas.microsoft.com/office/word/2010/wordprocessingDrawing" xmlns:wp="http://schemas.openxmlformats.org/drawingml/2006/wordprocessingDrawing" xmlns:wpg="http://schemas.microsoft.com/office/word/2010/wordprocessingGroup" xmlns:wpi="http://schemas.microsoft.com/office/word/2010/wordprocessingInk" xmlns:wps="http://schemas.microsoft.com/office/word/2010/wordprocessingShape" xmlns:o="urn:schemas-microsoft-com:office:office" xmlns:v="urn:schemas-microsoft-com:vml" xmlns:w10="urn:schemas-microsoft-com:office:word" xmlns:w="http://schemas.openxmlformats.org/wordprocessingml/2006/main" xmlns:w14="http://schemas.microsoft.com/office/word/2010/wordml" xmlns:w15="http://schemas.microsoft.com/office/word/2012/wordml" xmlns:w16cex="http://schemas.microsoft.com/office/word/2018/wordml/cex" xmlns:w16cid="http://schemas.microsoft.com/office/word/2016/wordml/cid" xmlns:w16="http://schemas.microsoft.com/office/word/2018/wordml" xmlns:w16sdtdh="http://schemas.microsoft.com/office/word/2020/wordml/sdtdatahash" xmlns:w16sdtfl="http://schemas.microsoft.com/office/word/2024/wordml/sdtformatlock" xmlns:w16se="http://schemas.microsoft.com/office/word/2015/wordml/symex" xmlns:w16du="http://schemas.microsoft.com/office/word/2023/wordml/word16du" xmlns:wne="http://schemas.microsoft.com/office/word/2006/wordml" mc:Ignorable="w14 w15 w16se w16cid w16 w16cex w16sdtdh w16sdtfl w16du wp14">
   <w:p>
     <w:pPr>
       <w:pStyle w:val="Header"/>
@@ -7606,7 +7414,7 @@
 </file>
 
 <file path=word/header2.xml><?xml version="1.0" encoding="utf-8"?>
-<w:hdr xmlns:wpc="http://schemas.microsoft.com/office/word/2010/wordprocessingCanvas" xmlns:cx="http://schemas.microsoft.com/office/drawing/2014/chartex" xmlns:cx1="http://schemas.microsoft.com/office/drawing/2015/9/8/chartex" xmlns:cx2="http://schemas.microsoft.com/office/drawing/2015/10/21/chartex" xmlns:cx3="http://schemas.microsoft.com/office/drawing/2016/5/9/chartex" xmlns:cx4="http://schemas.microsoft.com/office/drawing/2016/5/10/chartex" xmlns:cx5="http://schemas.microsoft.com/office/drawing/2016/5/11/chartex" xmlns:cx6="http://schemas.microsoft.com/office/drawing/2016/5/12/chartex" xmlns:cx7="http://schemas.microsoft.com/office/drawing/2016/5/13/chartex" xmlns:cx8="http://schemas.microsoft.com/office/drawing/2016/5/14/chartex" xmlns:mc="http://schemas.openxmlformats.org/markup-compatibility/2006" xmlns:m="http://schemas.openxmlformats.org/officeDocument/2006/math" xmlns:aink="http://schemas.microsoft.com/office/drawing/2016/ink" xmlns:am3d="http://schemas.microsoft.com/office/drawing/2017/model3d" xmlns:oel="http://schemas.microsoft.com/office/2019/extlst" xmlns:r="http://schemas.openxmlformats.org/officeDocument/2006/relationships" xmlns:wp14="http://schemas.microsoft.com/office/word/2010/wordprocessingDrawing" xmlns:wp="http://schemas.openxmlformats.org/drawingml/2006/wordprocessingDrawing" xmlns:wpg="http://schemas.microsoft.com/office/word/2010/wordprocessingGroup" xmlns:wpi="http://schemas.microsoft.com/office/word/2010/wordprocessingInk" xmlns:wps="http://schemas.microsoft.com/office/word/2010/wordprocessingShape" xmlns:o="urn:schemas-microsoft-com:office:office" xmlns:v="urn:schemas-microsoft-com:vml" xmlns:w10="urn:schemas-microsoft-com:office:word" xmlns:w="http://schemas.openxmlformats.org/wordprocessingml/2006/main" xmlns:w14="http://schemas.microsoft.com/office/word/2010/wordml" xmlns:w15="http://schemas.microsoft.com/office/word/2012/wordml" xmlns:w16cei="http://schemas.microsoft.com/office/word/2026/wordml/cei" xmlns:w16cex="http://schemas.microsoft.com/office/word/2018/wordml/cex" xmlns:w16cid="http://schemas.microsoft.com/office/word/2016/wordml/cid" xmlns:w16="http://schemas.microsoft.com/office/word/2018/wordml" xmlns:w16sdtdh="http://schemas.microsoft.com/office/word/2020/wordml/sdtdatahash" xmlns:w16sdtfl="http://schemas.microsoft.com/office/word/2024/wordml/sdtformatlock" xmlns:w16se="http://schemas.microsoft.com/office/word/2015/wordml/symex" xmlns:w16du="http://schemas.microsoft.com/office/word/2023/wordml/word16du" xmlns:wne="http://schemas.microsoft.com/office/word/2006/wordml" mc:Ignorable="w14 w15 w16se w16cid w16 w16cex w16sdtdh w16sdtfl w16du wp14">
+<w:hdr xmlns:wpc="http://schemas.microsoft.com/office/word/2010/wordprocessingCanvas" xmlns:cx="http://schemas.microsoft.com/office/drawing/2014/chartex" xmlns:cx1="http://schemas.microsoft.com/office/drawing/2015/9/8/chartex" xmlns:cx2="http://schemas.microsoft.com/office/drawing/2015/10/21/chartex" xmlns:cx3="http://schemas.microsoft.com/office/drawing/2016/5/9/chartex" xmlns:cx4="http://schemas.microsoft.com/office/drawing/2016/5/10/chartex" xmlns:cx5="http://schemas.microsoft.com/office/drawing/2016/5/11/chartex" xmlns:cx6="http://schemas.microsoft.com/office/drawing/2016/5/12/chartex" xmlns:cx7="http://schemas.microsoft.com/office/drawing/2016/5/13/chartex" xmlns:cx8="http://schemas.microsoft.com/office/drawing/2016/5/14/chartex" xmlns:mc="http://schemas.openxmlformats.org/markup-compatibility/2006" xmlns:m="http://schemas.openxmlformats.org/officeDocument/2006/math" xmlns:aink="http://schemas.microsoft.com/office/drawing/2016/ink" xmlns:am3d="http://schemas.microsoft.com/office/drawing/2017/model3d" xmlns:oel="http://schemas.microsoft.com/office/2019/extlst" xmlns:r="http://schemas.openxmlformats.org/officeDocument/2006/relationships" xmlns:wp14="http://schemas.microsoft.com/office/word/2010/wordprocessingDrawing" xmlns:wp="http://schemas.openxmlformats.org/drawingml/2006/wordprocessingDrawing" xmlns:wpg="http://schemas.microsoft.com/office/word/2010/wordprocessingGroup" xmlns:wpi="http://schemas.microsoft.com/office/word/2010/wordprocessingInk" xmlns:wps="http://schemas.microsoft.com/office/word/2010/wordprocessingShape" xmlns:o="urn:schemas-microsoft-com:office:office" xmlns:v="urn:schemas-microsoft-com:vml" xmlns:w10="urn:schemas-microsoft-com:office:word" xmlns:w="http://schemas.openxmlformats.org/wordprocessingml/2006/main" xmlns:w14="http://schemas.microsoft.com/office/word/2010/wordml" xmlns:w15="http://schemas.microsoft.com/office/word/2012/wordml" xmlns:w16cex="http://schemas.microsoft.com/office/word/2018/wordml/cex" xmlns:w16cid="http://schemas.microsoft.com/office/word/2016/wordml/cid" xmlns:w16="http://schemas.microsoft.com/office/word/2018/wordml" xmlns:w16sdtdh="http://schemas.microsoft.com/office/word/2020/wordml/sdtdatahash" xmlns:w16sdtfl="http://schemas.microsoft.com/office/word/2024/wordml/sdtformatlock" xmlns:w16se="http://schemas.microsoft.com/office/word/2015/wordml/symex" xmlns:w16du="http://schemas.microsoft.com/office/word/2023/wordml/word16du" xmlns:wne="http://schemas.microsoft.com/office/word/2006/wordml" mc:Ignorable="w14 w15 w16se w16cid w16 w16cex w16sdtdh w16sdtfl w16du wp14">
   <w:p>
     <w:pPr>
       <w:pStyle w:val="Header"/>
@@ -7641,7 +7449,7 @@
 </file>
 
 <file path=word/header3.xml><?xml version="1.0" encoding="utf-8"?>
-<w:hdr xmlns:wpc="http://schemas.microsoft.com/office/word/2010/wordprocessingCanvas" xmlns:cx="http://schemas.microsoft.com/office/drawing/2014/chartex" xmlns:cx1="http://schemas.microsoft.com/office/drawing/2015/9/8/chartex" xmlns:cx2="http://schemas.microsoft.com/office/drawing/2015/10/21/chartex" xmlns:cx3="http://schemas.microsoft.com/office/drawing/2016/5/9/chartex" xmlns:cx4="http://schemas.microsoft.com/office/drawing/2016/5/10/chartex" xmlns:cx5="http://schemas.microsoft.com/office/drawing/2016/5/11/chartex" xmlns:cx6="http://schemas.microsoft.com/office/drawing/2016/5/12/chartex" xmlns:cx7="http://schemas.microsoft.com/office/drawing/2016/5/13/chartex" xmlns:cx8="http://schemas.microsoft.com/office/drawing/2016/5/14/chartex" xmlns:mc="http://schemas.openxmlformats.org/markup-compatibility/2006" xmlns:m="http://schemas.openxmlformats.org/officeDocument/2006/math" xmlns:aink="http://schemas.microsoft.com/office/drawing/2016/ink" xmlns:am3d="http://schemas.microsoft.com/office/drawing/2017/model3d" xmlns:oel="http://schemas.microsoft.com/office/2019/extlst" xmlns:r="http://schemas.openxmlformats.org/officeDocument/2006/relationships" xmlns:wp14="http://schemas.microsoft.com/office/word/2010/wordprocessingDrawing" xmlns:wp="http://schemas.openxmlformats.org/drawingml/2006/wordprocessingDrawing" xmlns:wpg="http://schemas.microsoft.com/office/word/2010/wordprocessingGroup" xmlns:wpi="http://schemas.microsoft.com/office/word/2010/wordprocessingInk" xmlns:wps="http://schemas.microsoft.com/office/word/2010/wordprocessingShape" xmlns:o="urn:schemas-microsoft-com:office:office" xmlns:v="urn:schemas-microsoft-com:vml" xmlns:w10="urn:schemas-microsoft-com:office:word" xmlns:w="http://schemas.openxmlformats.org/wordprocessingml/2006/main" xmlns:w14="http://schemas.microsoft.com/office/word/2010/wordml" xmlns:w15="http://schemas.microsoft.com/office/word/2012/wordml" xmlns:w16cei="http://schemas.microsoft.com/office/word/2026/wordml/cei" xmlns:w16cex="http://schemas.microsoft.com/office/word/2018/wordml/cex" xmlns:w16cid="http://schemas.microsoft.com/office/word/2016/wordml/cid" xmlns:w16="http://schemas.microsoft.com/office/word/2018/wordml" xmlns:w16sdtdh="http://schemas.microsoft.com/office/word/2020/wordml/sdtdatahash" xmlns:w16sdtfl="http://schemas.microsoft.com/office/word/2024/wordml/sdtformatlock" xmlns:w16se="http://schemas.microsoft.com/office/word/2015/wordml/symex" xmlns:w16du="http://schemas.microsoft.com/office/word/2023/wordml/word16du" xmlns:wne="http://schemas.microsoft.com/office/word/2006/wordml" mc:Ignorable="w14 w15 w16se w16cid w16 w16cex w16sdtdh w16sdtfl w16du wp14">
+<w:hdr xmlns:wpc="http://schemas.microsoft.com/office/word/2010/wordprocessingCanvas" xmlns:cx="http://schemas.microsoft.com/office/drawing/2014/chartex" xmlns:cx1="http://schemas.microsoft.com/office/drawing/2015/9/8/chartex" xmlns:cx2="http://schemas.microsoft.com/office/drawing/2015/10/21/chartex" xmlns:cx3="http://schemas.microsoft.com/office/drawing/2016/5/9/chartex" xmlns:cx4="http://schemas.microsoft.com/office/drawing/2016/5/10/chartex" xmlns:cx5="http://schemas.microsoft.com/office/drawing/2016/5/11/chartex" xmlns:cx6="http://schemas.microsoft.com/office/drawing/2016/5/12/chartex" xmlns:cx7="http://schemas.microsoft.com/office/drawing/2016/5/13/chartex" xmlns:cx8="http://schemas.microsoft.com/office/drawing/2016/5/14/chartex" xmlns:mc="http://schemas.openxmlformats.org/markup-compatibility/2006" xmlns:m="http://schemas.openxmlformats.org/officeDocument/2006/math" xmlns:aink="http://schemas.microsoft.com/office/drawing/2016/ink" xmlns:am3d="http://schemas.microsoft.com/office/drawing/2017/model3d" xmlns:oel="http://schemas.microsoft.com/office/2019/extlst" xmlns:r="http://schemas.openxmlformats.org/officeDocument/2006/relationships" xmlns:wp14="http://schemas.microsoft.com/office/word/2010/wordprocessingDrawing" xmlns:wp="http://schemas.openxmlformats.org/drawingml/2006/wordprocessingDrawing" xmlns:wpg="http://schemas.microsoft.com/office/word/2010/wordprocessingGroup" xmlns:wpi="http://schemas.microsoft.com/office/word/2010/wordprocessingInk" xmlns:wps="http://schemas.microsoft.com/office/word/2010/wordprocessingShape" xmlns:o="urn:schemas-microsoft-com:office:office" xmlns:v="urn:schemas-microsoft-com:vml" xmlns:w10="urn:schemas-microsoft-com:office:word" xmlns:w="http://schemas.openxmlformats.org/wordprocessingml/2006/main" xmlns:w14="http://schemas.microsoft.com/office/word/2010/wordml" xmlns:w15="http://schemas.microsoft.com/office/word/2012/wordml" xmlns:w16cex="http://schemas.microsoft.com/office/word/2018/wordml/cex" xmlns:w16cid="http://schemas.microsoft.com/office/word/2016/wordml/cid" xmlns:w16="http://schemas.microsoft.com/office/word/2018/wordml" xmlns:w16sdtdh="http://schemas.microsoft.com/office/word/2020/wordml/sdtdatahash" xmlns:w16sdtfl="http://schemas.microsoft.com/office/word/2024/wordml/sdtformatlock" xmlns:w16se="http://schemas.microsoft.com/office/word/2015/wordml/symex" xmlns:w16du="http://schemas.microsoft.com/office/word/2023/wordml/word16du" xmlns:wne="http://schemas.microsoft.com/office/word/2006/wordml" mc:Ignorable="w14 w15 w16se w16cid w16 w16cex w16sdtdh w16sdtfl w16du wp14">
   <w:p>
     <w:pPr>
       <w:pStyle w:val="Header"/>
@@ -7676,7 +7484,7 @@
 </file>
 
 <file path=word/numbering.xml><?xml version="1.0" encoding="utf-8"?>
-<w:numbering xmlns:wpc="http://schemas.microsoft.com/office/word/2010/wordprocessingCanvas" xmlns:cx="http://schemas.microsoft.com/office/drawing/2014/chartex" xmlns:cx1="http://schemas.microsoft.com/office/drawing/2015/9/8/chartex" xmlns:cx2="http://schemas.microsoft.com/office/drawing/2015/10/21/chartex" xmlns:cx3="http://schemas.microsoft.com/office/drawing/2016/5/9/chartex" xmlns:cx4="http://schemas.microsoft.com/office/drawing/2016/5/10/chartex" xmlns:cx5="http://schemas.microsoft.com/office/drawing/2016/5/11/chartex" xmlns:cx6="http://schemas.microsoft.com/office/drawing/2016/5/12/chartex" xmlns:cx7="http://schemas.microsoft.com/office/drawing/2016/5/13/chartex" xmlns:cx8="http://schemas.microsoft.com/office/drawing/2016/5/14/chartex" xmlns:mc="http://schemas.openxmlformats.org/markup-compatibility/2006" xmlns:m="http://schemas.openxmlformats.org/officeDocument/2006/math" xmlns:aink="http://schemas.microsoft.com/office/drawing/2016/ink" xmlns:am3d="http://schemas.microsoft.com/office/drawing/2017/model3d" xmlns:oel="http://schemas.microsoft.com/office/2019/extlst" xmlns:r="http://schemas.openxmlformats.org/officeDocument/2006/relationships" xmlns:wp14="http://schemas.microsoft.com/office/word/2010/wordprocessingDrawing" xmlns:wp="http://schemas.openxmlformats.org/drawingml/2006/wordprocessingDrawing" xmlns:wpg="http://schemas.microsoft.com/office/word/2010/wordprocessingGroup" xmlns:wpi="http://schemas.microsoft.com/office/word/2010/wordprocessingInk" xmlns:wps="http://schemas.microsoft.com/office/word/2010/wordprocessingShape" xmlns:o="urn:schemas-microsoft-com:office:office" xmlns:v="urn:schemas-microsoft-com:vml" xmlns:w10="urn:schemas-microsoft-com:office:word" xmlns:w="http://schemas.openxmlformats.org/wordprocessingml/2006/main" xmlns:w14="http://schemas.microsoft.com/office/word/2010/wordml" xmlns:w15="http://schemas.microsoft.com/office/word/2012/wordml" xmlns:w16cei="http://schemas.microsoft.com/office/word/2026/wordml/cei" xmlns:w16cex="http://schemas.microsoft.com/office/word/2018/wordml/cex" xmlns:w16cid="http://schemas.microsoft.com/office/word/2016/wordml/cid" xmlns:w16="http://schemas.microsoft.com/office/word/2018/wordml" xmlns:w16sdtdh="http://schemas.microsoft.com/office/word/2020/wordml/sdtdatahash" xmlns:w16sdtfl="http://schemas.microsoft.com/office/word/2024/wordml/sdtformatlock" xmlns:w16se="http://schemas.microsoft.com/office/word/2015/wordml/symex" xmlns:w16du="http://schemas.microsoft.com/office/word/2023/wordml/word16du" xmlns:wne="http://schemas.microsoft.com/office/word/2006/wordml" mc:Ignorable="w14 w15 w16se w16cid w16 w16cex w16sdtdh w16sdtfl w16du wp14">
+<w:numbering xmlns:wpc="http://schemas.microsoft.com/office/word/2010/wordprocessingCanvas" xmlns:cx="http://schemas.microsoft.com/office/drawing/2014/chartex" xmlns:cx1="http://schemas.microsoft.com/office/drawing/2015/9/8/chartex" xmlns:cx2="http://schemas.microsoft.com/office/drawing/2015/10/21/chartex" xmlns:cx3="http://schemas.microsoft.com/office/drawing/2016/5/9/chartex" xmlns:cx4="http://schemas.microsoft.com/office/drawing/2016/5/10/chartex" xmlns:cx5="http://schemas.microsoft.com/office/drawing/2016/5/11/chartex" xmlns:cx6="http://schemas.microsoft.com/office/drawing/2016/5/12/chartex" xmlns:cx7="http://schemas.microsoft.com/office/drawing/2016/5/13/chartex" xmlns:cx8="http://schemas.microsoft.com/office/drawing/2016/5/14/chartex" xmlns:mc="http://schemas.openxmlformats.org/markup-compatibility/2006" xmlns:m="http://schemas.openxmlformats.org/officeDocument/2006/math" xmlns:aink="http://schemas.microsoft.com/office/drawing/2016/ink" xmlns:am3d="http://schemas.microsoft.com/office/drawing/2017/model3d" xmlns:oel="http://schemas.microsoft.com/office/2019/extlst" xmlns:r="http://schemas.openxmlformats.org/officeDocument/2006/relationships" xmlns:wp14="http://schemas.microsoft.com/office/word/2010/wordprocessingDrawing" xmlns:wp="http://schemas.openxmlformats.org/drawingml/2006/wordprocessingDrawing" xmlns:wpg="http://schemas.microsoft.com/office/word/2010/wordprocessingGroup" xmlns:wpi="http://schemas.microsoft.com/office/word/2010/wordprocessingInk" xmlns:wps="http://schemas.microsoft.com/office/word/2010/wordprocessingShape" xmlns:o="urn:schemas-microsoft-com:office:office" xmlns:v="urn:schemas-microsoft-com:vml" xmlns:w10="urn:schemas-microsoft-com:office:word" xmlns:w="http://schemas.openxmlformats.org/wordprocessingml/2006/main" xmlns:w14="http://schemas.microsoft.com/office/word/2010/wordml" xmlns:w15="http://schemas.microsoft.com/office/word/2012/wordml" xmlns:w16cex="http://schemas.microsoft.com/office/word/2018/wordml/cex" xmlns:w16cid="http://schemas.microsoft.com/office/word/2016/wordml/cid" xmlns:w16="http://schemas.microsoft.com/office/word/2018/wordml" xmlns:w16sdtdh="http://schemas.microsoft.com/office/word/2020/wordml/sdtdatahash" xmlns:w16sdtfl="http://schemas.microsoft.com/office/word/2024/wordml/sdtformatlock" xmlns:w16se="http://schemas.microsoft.com/office/word/2015/wordml/symex" xmlns:w16du="http://schemas.microsoft.com/office/word/2023/wordml/word16du" xmlns:wne="http://schemas.microsoft.com/office/word/2006/wordml" mc:Ignorable="w14 w15 w16se w16cid w16 w16cex w16sdtdh w16sdtfl w16du wp14">
   <w:abstractNum w:abstractNumId="0" w15:restartNumberingAfterBreak="0">
     <w:nsid w:val="FFFFFF7C"/>
     <w:multiLevelType w:val="singleLevel"/>
@@ -7848,31 +7656,31 @@
       </w:rPr>
     </w:lvl>
   </w:abstractNum>
-  <w:num w:numId="1" w16cid:durableId="290356942">
+  <w:num w:numId="1" w16cid:durableId="926881966">
     <w:abstractNumId w:val="8"/>
   </w:num>
-  <w:num w:numId="2" w16cid:durableId="451703859">
+  <w:num w:numId="2" w16cid:durableId="1895119694">
     <w:abstractNumId w:val="6"/>
   </w:num>
-  <w:num w:numId="3" w16cid:durableId="1250966727">
+  <w:num w:numId="3" w16cid:durableId="845289803">
     <w:abstractNumId w:val="5"/>
   </w:num>
-  <w:num w:numId="4" w16cid:durableId="109783099">
+  <w:num w:numId="4" w16cid:durableId="1815634660">
     <w:abstractNumId w:val="4"/>
   </w:num>
-  <w:num w:numId="5" w16cid:durableId="708644579">
+  <w:num w:numId="5" w16cid:durableId="775825877">
     <w:abstractNumId w:val="7"/>
   </w:num>
-  <w:num w:numId="6" w16cid:durableId="834687882">
+  <w:num w:numId="6" w16cid:durableId="1100954230">
     <w:abstractNumId w:val="3"/>
   </w:num>
-  <w:num w:numId="7" w16cid:durableId="1412507473">
+  <w:num w:numId="7" w16cid:durableId="229926027">
     <w:abstractNumId w:val="2"/>
   </w:num>
-  <w:num w:numId="8" w16cid:durableId="22636617">
+  <w:num w:numId="8" w16cid:durableId="1353452255">
     <w:abstractNumId w:val="1"/>
   </w:num>
-  <w:num w:numId="9" w16cid:durableId="584461005">
+  <w:num w:numId="9" w16cid:durableId="828133102">
     <w:abstractNumId w:val="0"/>
   </w:num>
 </w:numbering>
@@ -19265,7 +19073,7 @@
     <w:autoRedefine/>
     <w:uiPriority w:val="39"/>
     <w:unhideWhenUsed/>
-    <w:rsid w:val="00FC04C3"/>
+    <w:rsid w:val="0035071E"/>
     <w:pPr>
       <w:spacing w:after="100"/>
     </w:pPr>
@@ -19277,7 +19085,7 @@
     <w:autoRedefine/>
     <w:uiPriority w:val="39"/>
     <w:unhideWhenUsed/>
-    <w:rsid w:val="00FC04C3"/>
+    <w:rsid w:val="0035071E"/>
     <w:pPr>
       <w:spacing w:after="100"/>
       <w:ind w:left="420"/>
@@ -19288,7 +19096,7 @@
     <w:basedOn w:val="DefaultParagraphFont"/>
     <w:uiPriority w:val="99"/>
     <w:unhideWhenUsed/>
-    <w:rsid w:val="00FC04C3"/>
+    <w:rsid w:val="0035071E"/>
     <w:rPr>
       <w:color w:val="0000FF" w:themeColor="hyperlink"/>
       <w:u w:val="single"/>

</xml_diff>